<commit_message>
Sequenz: Ich-kann-Ziele je ein Gedanke pro Satz, Tabellen mit Linien
Co-Authored-By: Claude Sonnet 5.5 <noreply@anthropic.com>
Claude-Session: https://claude.ai/code/session_01GXwmzpsaCraifErTDddPwN
</commit_message>
<xml_diff>
--- a/Geschichte_8D/Sequenz_Franzoesische_Revolution_8D.docx
+++ b/Geschichte_8D/Sequenz_Franzoesische_Revolution_8D.docx
@@ -272,10 +272,10 @@
           <w:tcPr>
             <w:tcW w:type="dxa" w:w="1286"/>
             <w:tcBorders>
-              <w:top w:val="single" w:color="1E2761" w:sz="28"/>
-              <w:left w:val="single" w:color="FFFFFF" w:sz="12"/>
-              <w:bottom w:val="single" w:color="FFFFFF" w:sz="12"/>
-              <w:right w:val="single" w:color="FFFFFF" w:sz="12"/>
+              <w:top w:val="single" w:color="1E2761" w:sz="36"/>
+              <w:left w:val="single" w:color="5B6B8C" w:sz="8"/>
+              <w:bottom w:val="single" w:color="5B6B8C" w:sz="8"/>
+              <w:right w:val="single" w:color="5B6B8C" w:sz="8"/>
             </w:tcBorders>
             <w:shd w:fill="EAF0FA" w:color="auto" w:val="clear"/>
             <w:tcMar>
@@ -383,10 +383,10 @@
           <w:tcPr>
             <w:tcW w:type="dxa" w:w="1286"/>
             <w:tcBorders>
-              <w:top w:val="single" w:color="E8A33D" w:sz="28"/>
-              <w:left w:val="single" w:color="FFFFFF" w:sz="12"/>
-              <w:bottom w:val="single" w:color="FFFFFF" w:sz="12"/>
-              <w:right w:val="single" w:color="FFFFFF" w:sz="12"/>
+              <w:top w:val="single" w:color="E8A33D" w:sz="36"/>
+              <w:left w:val="single" w:color="5B6B8C" w:sz="8"/>
+              <w:bottom w:val="single" w:color="5B6B8C" w:sz="8"/>
+              <w:right w:val="single" w:color="5B6B8C" w:sz="8"/>
             </w:tcBorders>
             <w:shd w:fill="FDF1D8" w:color="auto" w:val="clear"/>
             <w:tcMar>
@@ -494,10 +494,10 @@
           <w:tcPr>
             <w:tcW w:type="dxa" w:w="1286"/>
             <w:tcBorders>
-              <w:top w:val="single" w:color="1E2761" w:sz="28"/>
-              <w:left w:val="single" w:color="FFFFFF" w:sz="12"/>
-              <w:bottom w:val="single" w:color="FFFFFF" w:sz="12"/>
-              <w:right w:val="single" w:color="FFFFFF" w:sz="12"/>
+              <w:top w:val="single" w:color="1E2761" w:sz="36"/>
+              <w:left w:val="single" w:color="5B6B8C" w:sz="8"/>
+              <w:bottom w:val="single" w:color="5B6B8C" w:sz="8"/>
+              <w:right w:val="single" w:color="5B6B8C" w:sz="8"/>
             </w:tcBorders>
             <w:shd w:fill="EAF0FA" w:color="auto" w:val="clear"/>
             <w:tcMar>
@@ -605,10 +605,10 @@
           <w:tcPr>
             <w:tcW w:type="dxa" w:w="1286"/>
             <w:tcBorders>
-              <w:top w:val="single" w:color="E8A33D" w:sz="28"/>
-              <w:left w:val="single" w:color="FFFFFF" w:sz="12"/>
-              <w:bottom w:val="single" w:color="FFFFFF" w:sz="12"/>
-              <w:right w:val="single" w:color="FFFFFF" w:sz="12"/>
+              <w:top w:val="single" w:color="E8A33D" w:sz="36"/>
+              <w:left w:val="single" w:color="5B6B8C" w:sz="8"/>
+              <w:bottom w:val="single" w:color="5B6B8C" w:sz="8"/>
+              <w:right w:val="single" w:color="5B6B8C" w:sz="8"/>
             </w:tcBorders>
             <w:shd w:fill="FDF1D8" w:color="auto" w:val="clear"/>
             <w:tcMar>
@@ -716,10 +716,10 @@
           <w:tcPr>
             <w:tcW w:type="dxa" w:w="1286"/>
             <w:tcBorders>
-              <w:top w:val="single" w:color="D9534F" w:sz="28"/>
-              <w:left w:val="single" w:color="FFFFFF" w:sz="12"/>
-              <w:bottom w:val="single" w:color="FFFFFF" w:sz="12"/>
-              <w:right w:val="single" w:color="FFFFFF" w:sz="12"/>
+              <w:top w:val="single" w:color="D9534F" w:sz="36"/>
+              <w:left w:val="single" w:color="5B6B8C" w:sz="8"/>
+              <w:bottom w:val="single" w:color="5B6B8C" w:sz="8"/>
+              <w:right w:val="single" w:color="5B6B8C" w:sz="8"/>
             </w:tcBorders>
             <w:shd w:fill="F8D9D7" w:color="auto" w:val="clear"/>
             <w:tcMar>
@@ -827,10 +827,10 @@
           <w:tcPr>
             <w:tcW w:type="dxa" w:w="1286"/>
             <w:tcBorders>
-              <w:top w:val="single" w:color="1E2761" w:sz="28"/>
-              <w:left w:val="single" w:color="FFFFFF" w:sz="12"/>
-              <w:bottom w:val="single" w:color="FFFFFF" w:sz="12"/>
-              <w:right w:val="single" w:color="FFFFFF" w:sz="12"/>
+              <w:top w:val="single" w:color="1E2761" w:sz="36"/>
+              <w:left w:val="single" w:color="5B6B8C" w:sz="8"/>
+              <w:bottom w:val="single" w:color="5B6B8C" w:sz="8"/>
+              <w:right w:val="single" w:color="5B6B8C" w:sz="8"/>
             </w:tcBorders>
             <w:shd w:fill="EAF0FA" w:color="auto" w:val="clear"/>
             <w:tcMar>
@@ -938,10 +938,10 @@
           <w:tcPr>
             <w:tcW w:type="dxa" w:w="1286"/>
             <w:tcBorders>
-              <w:top w:val="single" w:color="2E9E6B" w:sz="28"/>
-              <w:left w:val="single" w:color="FFFFFF" w:sz="12"/>
-              <w:bottom w:val="single" w:color="FFFFFF" w:sz="12"/>
-              <w:right w:val="single" w:color="FFFFFF" w:sz="12"/>
+              <w:top w:val="single" w:color="2E9E6B" w:sz="36"/>
+              <w:left w:val="single" w:color="5B6B8C" w:sz="8"/>
+              <w:bottom w:val="single" w:color="5B6B8C" w:sz="8"/>
+              <w:right w:val="single" w:color="5B6B8C" w:sz="8"/>
             </w:tcBorders>
             <w:shd w:fill="E3F3EC" w:color="auto" w:val="clear"/>
             <w:tcMar>
@@ -1049,10 +1049,10 @@
           <w:tcPr>
             <w:tcW w:type="dxa" w:w="1292"/>
             <w:tcBorders>
-              <w:top w:val="single" w:color="FFFFFF" w:sz="12"/>
-              <w:left w:val="single" w:color="FFFFFF" w:sz="12"/>
-              <w:bottom w:val="single" w:color="FFFFFF" w:sz="12"/>
-              <w:right w:val="single" w:color="FFFFFF" w:sz="12"/>
+              <w:top w:val="single" w:color="5B6B8C" w:sz="8"/>
+              <w:left w:val="single" w:color="5B6B8C" w:sz="8"/>
+              <w:bottom w:val="single" w:color="5B6B8C" w:sz="8"/>
+              <w:right w:val="single" w:color="5B6B8C" w:sz="8"/>
             </w:tcBorders>
             <w:shd w:fill="E4E7EE" w:color="auto" w:val="clear"/>
             <w:tcMar>
@@ -1100,10 +1100,10 @@
           <w:tcPr>
             <w:tcW w:type="dxa" w:w="1286"/>
             <w:tcBorders>
-              <w:top w:val="single" w:color="1E2761" w:sz="28"/>
-              <w:left w:val="single" w:color="FFFFFF" w:sz="12"/>
-              <w:bottom w:val="single" w:color="FFFFFF" w:sz="12"/>
-              <w:right w:val="single" w:color="FFFFFF" w:sz="12"/>
+              <w:top w:val="single" w:color="1E2761" w:sz="36"/>
+              <w:left w:val="single" w:color="5B6B8C" w:sz="8"/>
+              <w:bottom w:val="single" w:color="5B6B8C" w:sz="8"/>
+              <w:right w:val="single" w:color="5B6B8C" w:sz="8"/>
             </w:tcBorders>
             <w:shd w:fill="EAF0FA" w:color="auto" w:val="clear"/>
             <w:tcMar>
@@ -1211,10 +1211,10 @@
           <w:tcPr>
             <w:tcW w:type="dxa" w:w="1286"/>
             <w:tcBorders>
-              <w:top w:val="single" w:color="2E9E6B" w:sz="28"/>
-              <w:left w:val="single" w:color="FFFFFF" w:sz="12"/>
-              <w:bottom w:val="single" w:color="FFFFFF" w:sz="12"/>
-              <w:right w:val="single" w:color="FFFFFF" w:sz="12"/>
+              <w:top w:val="single" w:color="2E9E6B" w:sz="36"/>
+              <w:left w:val="single" w:color="5B6B8C" w:sz="8"/>
+              <w:bottom w:val="single" w:color="5B6B8C" w:sz="8"/>
+              <w:right w:val="single" w:color="5B6B8C" w:sz="8"/>
             </w:tcBorders>
             <w:shd w:fill="E3F3EC" w:color="auto" w:val="clear"/>
             <w:tcMar>
@@ -1322,10 +1322,10 @@
           <w:tcPr>
             <w:tcW w:type="dxa" w:w="1286"/>
             <w:tcBorders>
-              <w:top w:val="single" w:color="D9534F" w:sz="28"/>
-              <w:left w:val="single" w:color="FFFFFF" w:sz="12"/>
-              <w:bottom w:val="single" w:color="FFFFFF" w:sz="12"/>
-              <w:right w:val="single" w:color="FFFFFF" w:sz="12"/>
+              <w:top w:val="single" w:color="D9534F" w:sz="36"/>
+              <w:left w:val="single" w:color="5B6B8C" w:sz="8"/>
+              <w:bottom w:val="single" w:color="5B6B8C" w:sz="8"/>
+              <w:right w:val="single" w:color="5B6B8C" w:sz="8"/>
             </w:tcBorders>
             <w:shd w:fill="F8D9D7" w:color="auto" w:val="clear"/>
             <w:tcMar>
@@ -1433,10 +1433,10 @@
           <w:tcPr>
             <w:tcW w:type="dxa" w:w="1286"/>
             <w:tcBorders>
-              <w:top w:val="single" w:color="2E9E6B" w:sz="28"/>
-              <w:left w:val="single" w:color="FFFFFF" w:sz="12"/>
-              <w:bottom w:val="single" w:color="FFFFFF" w:sz="12"/>
-              <w:right w:val="single" w:color="FFFFFF" w:sz="12"/>
+              <w:top w:val="single" w:color="2E9E6B" w:sz="36"/>
+              <w:left w:val="single" w:color="5B6B8C" w:sz="8"/>
+              <w:bottom w:val="single" w:color="5B6B8C" w:sz="8"/>
+              <w:right w:val="single" w:color="5B6B8C" w:sz="8"/>
             </w:tcBorders>
             <w:shd w:fill="E3F3EC" w:color="auto" w:val="clear"/>
             <w:tcMar>
@@ -1953,12 +1953,12 @@
         </w:tblBorders>
       </w:tblPr>
       <w:tblGrid>
-        <w:gridCol w:w="800"/>
-        <w:gridCol w:w="1650"/>
-        <w:gridCol w:w="4400"/>
-        <w:gridCol w:w="2850"/>
-        <w:gridCol w:w="3100"/>
-        <w:gridCol w:w="2638"/>
+        <w:gridCol w:w="700"/>
+        <w:gridCol w:w="1400"/>
+        <w:gridCol w:w="5900"/>
+        <w:gridCol w:w="2400"/>
+        <w:gridCol w:w="2800"/>
+        <w:gridCol w:w="2238"/>
       </w:tblGrid>
       <w:tr>
         <w:trPr>
@@ -1967,12 +1967,12 @@
         </w:trPr>
         <w:tc>
           <w:tcPr>
-            <w:tcW w:type="dxa" w:w="800"/>
-            <w:tcBorders>
-              <w:top w:val="single" w:color="FFFFFF" w:sz="12"/>
-              <w:left w:val="single" w:color="FFFFFF" w:sz="12"/>
-              <w:bottom w:val="single" w:color="FFFFFF" w:sz="12"/>
-              <w:right w:val="single" w:color="FFFFFF" w:sz="12"/>
+            <w:tcW w:type="dxa" w:w="700"/>
+            <w:tcBorders>
+              <w:top w:val="single" w:color="1E2761" w:sz="8"/>
+              <w:left w:val="single" w:color="1E2761" w:sz="8"/>
+              <w:bottom w:val="single" w:color="1E2761" w:sz="8"/>
+              <w:right w:val="single" w:color="1E2761" w:sz="8"/>
             </w:tcBorders>
             <w:shd w:fill="1E2761" w:color="auto" w:val="clear"/>
             <w:tcMar>
@@ -2002,12 +2002,12 @@
         </w:tc>
         <w:tc>
           <w:tcPr>
-            <w:tcW w:type="dxa" w:w="1650"/>
-            <w:tcBorders>
-              <w:top w:val="single" w:color="FFFFFF" w:sz="12"/>
-              <w:left w:val="single" w:color="FFFFFF" w:sz="12"/>
-              <w:bottom w:val="single" w:color="FFFFFF" w:sz="12"/>
-              <w:right w:val="single" w:color="FFFFFF" w:sz="12"/>
+            <w:tcW w:type="dxa" w:w="1400"/>
+            <w:tcBorders>
+              <w:top w:val="single" w:color="1E2761" w:sz="8"/>
+              <w:left w:val="single" w:color="1E2761" w:sz="8"/>
+              <w:bottom w:val="single" w:color="1E2761" w:sz="8"/>
+              <w:right w:val="single" w:color="1E2761" w:sz="8"/>
             </w:tcBorders>
             <w:shd w:fill="1E2761" w:color="auto" w:val="clear"/>
             <w:tcMar>
@@ -2037,12 +2037,12 @@
         </w:tc>
         <w:tc>
           <w:tcPr>
-            <w:tcW w:type="dxa" w:w="4400"/>
-            <w:tcBorders>
-              <w:top w:val="single" w:color="FFFFFF" w:sz="12"/>
-              <w:left w:val="single" w:color="FFFFFF" w:sz="12"/>
-              <w:bottom w:val="single" w:color="FFFFFF" w:sz="12"/>
-              <w:right w:val="single" w:color="FFFFFF" w:sz="12"/>
+            <w:tcW w:type="dxa" w:w="5900"/>
+            <w:tcBorders>
+              <w:top w:val="single" w:color="1E2761" w:sz="8"/>
+              <w:left w:val="single" w:color="1E2761" w:sz="8"/>
+              <w:bottom w:val="single" w:color="1E2761" w:sz="8"/>
+              <w:right w:val="single" w:color="1E2761" w:sz="8"/>
             </w:tcBorders>
             <w:shd w:fill="1E2761" w:color="auto" w:val="clear"/>
             <w:tcMar>
@@ -2072,12 +2072,12 @@
         </w:tc>
         <w:tc>
           <w:tcPr>
-            <w:tcW w:type="dxa" w:w="2850"/>
-            <w:tcBorders>
-              <w:top w:val="single" w:color="FFFFFF" w:sz="12"/>
-              <w:left w:val="single" w:color="FFFFFF" w:sz="12"/>
-              <w:bottom w:val="single" w:color="FFFFFF" w:sz="12"/>
-              <w:right w:val="single" w:color="FFFFFF" w:sz="12"/>
+            <w:tcW w:type="dxa" w:w="2400"/>
+            <w:tcBorders>
+              <w:top w:val="single" w:color="1E2761" w:sz="8"/>
+              <w:left w:val="single" w:color="1E2761" w:sz="8"/>
+              <w:bottom w:val="single" w:color="1E2761" w:sz="8"/>
+              <w:right w:val="single" w:color="1E2761" w:sz="8"/>
             </w:tcBorders>
             <w:shd w:fill="1E2761" w:color="auto" w:val="clear"/>
             <w:tcMar>
@@ -2107,12 +2107,12 @@
         </w:tc>
         <w:tc>
           <w:tcPr>
-            <w:tcW w:type="dxa" w:w="3100"/>
-            <w:tcBorders>
-              <w:top w:val="single" w:color="FFFFFF" w:sz="12"/>
-              <w:left w:val="single" w:color="FFFFFF" w:sz="12"/>
-              <w:bottom w:val="single" w:color="FFFFFF" w:sz="12"/>
-              <w:right w:val="single" w:color="FFFFFF" w:sz="12"/>
+            <w:tcW w:type="dxa" w:w="2800"/>
+            <w:tcBorders>
+              <w:top w:val="single" w:color="1E2761" w:sz="8"/>
+              <w:left w:val="single" w:color="1E2761" w:sz="8"/>
+              <w:bottom w:val="single" w:color="1E2761" w:sz="8"/>
+              <w:right w:val="single" w:color="1E2761" w:sz="8"/>
             </w:tcBorders>
             <w:shd w:fill="1E2761" w:color="auto" w:val="clear"/>
             <w:tcMar>
@@ -2142,12 +2142,12 @@
         </w:tc>
         <w:tc>
           <w:tcPr>
-            <w:tcW w:type="dxa" w:w="2638"/>
-            <w:tcBorders>
-              <w:top w:val="single" w:color="FFFFFF" w:sz="12"/>
-              <w:left w:val="single" w:color="FFFFFF" w:sz="12"/>
-              <w:bottom w:val="single" w:color="FFFFFF" w:sz="12"/>
-              <w:right w:val="single" w:color="FFFFFF" w:sz="12"/>
+            <w:tcW w:type="dxa" w:w="2238"/>
+            <w:tcBorders>
+              <w:top w:val="single" w:color="1E2761" w:sz="8"/>
+              <w:left w:val="single" w:color="1E2761" w:sz="8"/>
+              <w:bottom w:val="single" w:color="1E2761" w:sz="8"/>
+              <w:right w:val="single" w:color="1E2761" w:sz="8"/>
             </w:tcBorders>
             <w:shd w:fill="1E2761" w:color="auto" w:val="clear"/>
             <w:tcMar>
@@ -2182,12 +2182,12 @@
         </w:trPr>
         <w:tc>
           <w:tcPr>
-            <w:tcW w:type="dxa" w:w="800"/>
-            <w:tcBorders>
-              <w:top w:val="single" w:color="B9C6E8" w:sz="4"/>
-              <w:left w:val="single" w:color="1E2761" w:sz="24"/>
-              <w:bottom w:val="single" w:color="B9C6E8" w:sz="4"/>
-              <w:right w:val="single" w:color="B9C6E8" w:sz="4"/>
+            <w:tcW w:type="dxa" w:w="700"/>
+            <w:tcBorders>
+              <w:top w:val="single" w:color="5B6B8C" w:sz="8"/>
+              <w:left w:val="single" w:color="1E2761" w:sz="36"/>
+              <w:bottom w:val="single" w:color="5B6B8C" w:sz="8"/>
+              <w:right w:val="single" w:color="5B6B8C" w:sz="8"/>
             </w:tcBorders>
             <w:shd w:fill="FFFFFF" w:color="auto" w:val="clear"/>
             <w:tcMar>
@@ -2217,12 +2217,12 @@
         </w:tc>
         <w:tc>
           <w:tcPr>
-            <w:tcW w:type="dxa" w:w="1650"/>
-            <w:tcBorders>
-              <w:top w:val="single" w:color="FFFFFF" w:sz="12"/>
-              <w:left w:val="single" w:color="FFFFFF" w:sz="12"/>
-              <w:bottom w:val="single" w:color="FFFFFF" w:sz="12"/>
-              <w:right w:val="single" w:color="FFFFFF" w:sz="12"/>
+            <w:tcW w:type="dxa" w:w="1400"/>
+            <w:tcBorders>
+              <w:top w:val="single" w:color="5B6B8C" w:sz="8"/>
+              <w:left w:val="single" w:color="5B6B8C" w:sz="8"/>
+              <w:bottom w:val="single" w:color="5B6B8C" w:sz="8"/>
+              <w:right w:val="single" w:color="5B6B8C" w:sz="8"/>
             </w:tcBorders>
             <w:shd w:fill="FFFFFF" w:color="auto" w:val="clear"/>
             <w:tcMar>
@@ -2266,12 +2266,12 @@
         </w:tc>
         <w:tc>
           <w:tcPr>
-            <w:tcW w:type="dxa" w:w="4400"/>
-            <w:tcBorders>
-              <w:top w:val="single" w:color="FFFFFF" w:sz="12"/>
-              <w:left w:val="single" w:color="FFFFFF" w:sz="12"/>
-              <w:bottom w:val="single" w:color="FFFFFF" w:sz="12"/>
-              <w:right w:val="single" w:color="FFFFFF" w:sz="12"/>
+            <w:tcW w:type="dxa" w:w="5900"/>
+            <w:tcBorders>
+              <w:top w:val="single" w:color="5B6B8C" w:sz="8"/>
+              <w:left w:val="single" w:color="5B6B8C" w:sz="8"/>
+              <w:bottom w:val="single" w:color="5B6B8C" w:sz="8"/>
+              <w:right w:val="single" w:color="5B6B8C" w:sz="8"/>
             </w:tcBorders>
             <w:shd w:fill="FFFFFF" w:color="auto" w:val="clear"/>
             <w:tcMar>
@@ -2309,18 +2309,18 @@
                 <w:sz w:val="16"/>
                 <w:szCs w:val="16"/>
               </w:rPr>
-              <w:t xml:space="preserve">Ich kann den Weg bis zu den Generalständen am Zeitstrahl erklären und die Abstimmung nach Ständen begründet beurteilen.</w:t>
-            </w:r>
-          </w:p>
-        </w:tc>
-        <w:tc>
-          <w:tcPr>
-            <w:tcW w:type="dxa" w:w="2850"/>
-            <w:tcBorders>
-              <w:top w:val="single" w:color="FFFFFF" w:sz="12"/>
-              <w:left w:val="single" w:color="FFFFFF" w:sz="12"/>
-              <w:bottom w:val="single" w:color="FFFFFF" w:sz="12"/>
-              <w:right w:val="single" w:color="FFFFFF" w:sz="12"/>
+              <w:t xml:space="preserve">Ich kann den Weg bis zu den Generalständen am Zeitstrahl erklären. Ich kann erklären, wie die Stände den Dritten Stand überstimmen konnten. Ich kann begründen, warum die Abstimmung nach Ständen unfair war.</w:t>
+            </w:r>
+          </w:p>
+        </w:tc>
+        <w:tc>
+          <w:tcPr>
+            <w:tcW w:type="dxa" w:w="2400"/>
+            <w:tcBorders>
+              <w:top w:val="single" w:color="5B6B8C" w:sz="8"/>
+              <w:left w:val="single" w:color="5B6B8C" w:sz="8"/>
+              <w:bottom w:val="single" w:color="5B6B8C" w:sz="8"/>
+              <w:right w:val="single" w:color="5B6B8C" w:sz="8"/>
             </w:tcBorders>
             <w:shd w:fill="FFFFFF" w:color="auto" w:val="clear"/>
             <w:tcMar>
@@ -2348,12 +2348,12 @@
         </w:tc>
         <w:tc>
           <w:tcPr>
-            <w:tcW w:type="dxa" w:w="3100"/>
-            <w:tcBorders>
-              <w:top w:val="single" w:color="FFFFFF" w:sz="12"/>
-              <w:left w:val="single" w:color="FFFFFF" w:sz="12"/>
-              <w:bottom w:val="single" w:color="FFFFFF" w:sz="12"/>
-              <w:right w:val="single" w:color="FFFFFF" w:sz="12"/>
+            <w:tcW w:type="dxa" w:w="2800"/>
+            <w:tcBorders>
+              <w:top w:val="single" w:color="5B6B8C" w:sz="8"/>
+              <w:left w:val="single" w:color="5B6B8C" w:sz="8"/>
+              <w:bottom w:val="single" w:color="5B6B8C" w:sz="8"/>
+              <w:right w:val="single" w:color="5B6B8C" w:sz="8"/>
             </w:tcBorders>
             <w:shd w:fill="FFFFFF" w:color="auto" w:val="clear"/>
             <w:tcMar>
@@ -2381,12 +2381,12 @@
         </w:tc>
         <w:tc>
           <w:tcPr>
-            <w:tcW w:type="dxa" w:w="2638"/>
-            <w:tcBorders>
-              <w:top w:val="single" w:color="FFFFFF" w:sz="12"/>
-              <w:left w:val="single" w:color="FFFFFF" w:sz="12"/>
-              <w:bottom w:val="single" w:color="FFFFFF" w:sz="12"/>
-              <w:right w:val="single" w:color="FFFFFF" w:sz="12"/>
+            <w:tcW w:type="dxa" w:w="2238"/>
+            <w:tcBorders>
+              <w:top w:val="single" w:color="5B6B8C" w:sz="8"/>
+              <w:left w:val="single" w:color="5B6B8C" w:sz="8"/>
+              <w:bottom w:val="single" w:color="5B6B8C" w:sz="8"/>
+              <w:right w:val="single" w:color="5B6B8C" w:sz="8"/>
             </w:tcBorders>
             <w:shd w:fill="FFFFFF" w:color="auto" w:val="clear"/>
             <w:tcMar>
@@ -2419,12 +2419,12 @@
         </w:trPr>
         <w:tc>
           <w:tcPr>
-            <w:tcW w:type="dxa" w:w="800"/>
-            <w:tcBorders>
-              <w:top w:val="single" w:color="B9C6E8" w:sz="4"/>
-              <w:left w:val="single" w:color="E8A33D" w:sz="24"/>
-              <w:bottom w:val="single" w:color="B9C6E8" w:sz="4"/>
-              <w:right w:val="single" w:color="B9C6E8" w:sz="4"/>
+            <w:tcW w:type="dxa" w:w="700"/>
+            <w:tcBorders>
+              <w:top w:val="single" w:color="5B6B8C" w:sz="8"/>
+              <w:left w:val="single" w:color="E8A33D" w:sz="36"/>
+              <w:bottom w:val="single" w:color="5B6B8C" w:sz="8"/>
+              <w:right w:val="single" w:color="5B6B8C" w:sz="8"/>
             </w:tcBorders>
             <w:shd w:fill="F4F7FD" w:color="auto" w:val="clear"/>
             <w:tcMar>
@@ -2454,12 +2454,12 @@
         </w:tc>
         <w:tc>
           <w:tcPr>
-            <w:tcW w:type="dxa" w:w="1650"/>
-            <w:tcBorders>
-              <w:top w:val="single" w:color="FFFFFF" w:sz="12"/>
-              <w:left w:val="single" w:color="FFFFFF" w:sz="12"/>
-              <w:bottom w:val="single" w:color="FFFFFF" w:sz="12"/>
-              <w:right w:val="single" w:color="FFFFFF" w:sz="12"/>
+            <w:tcW w:type="dxa" w:w="1400"/>
+            <w:tcBorders>
+              <w:top w:val="single" w:color="5B6B8C" w:sz="8"/>
+              <w:left w:val="single" w:color="5B6B8C" w:sz="8"/>
+              <w:bottom w:val="single" w:color="5B6B8C" w:sz="8"/>
+              <w:right w:val="single" w:color="5B6B8C" w:sz="8"/>
             </w:tcBorders>
             <w:shd w:fill="F4F7FD" w:color="auto" w:val="clear"/>
             <w:tcMar>
@@ -2503,12 +2503,12 @@
         </w:tc>
         <w:tc>
           <w:tcPr>
-            <w:tcW w:type="dxa" w:w="4400"/>
-            <w:tcBorders>
-              <w:top w:val="single" w:color="FFFFFF" w:sz="12"/>
-              <w:left w:val="single" w:color="FFFFFF" w:sz="12"/>
-              <w:bottom w:val="single" w:color="FFFFFF" w:sz="12"/>
-              <w:right w:val="single" w:color="FFFFFF" w:sz="12"/>
+            <w:tcW w:type="dxa" w:w="5900"/>
+            <w:tcBorders>
+              <w:top w:val="single" w:color="5B6B8C" w:sz="8"/>
+              <w:left w:val="single" w:color="5B6B8C" w:sz="8"/>
+              <w:bottom w:val="single" w:color="5B6B8C" w:sz="8"/>
+              <w:right w:val="single" w:color="5B6B8C" w:sz="8"/>
             </w:tcBorders>
             <w:shd w:fill="F4F7FD" w:color="auto" w:val="clear"/>
             <w:tcMar>
@@ -2552,12 +2552,12 @@
         </w:tc>
         <w:tc>
           <w:tcPr>
-            <w:tcW w:type="dxa" w:w="2850"/>
-            <w:tcBorders>
-              <w:top w:val="single" w:color="FFFFFF" w:sz="12"/>
-              <w:left w:val="single" w:color="FFFFFF" w:sz="12"/>
-              <w:bottom w:val="single" w:color="FFFFFF" w:sz="12"/>
-              <w:right w:val="single" w:color="FFFFFF" w:sz="12"/>
+            <w:tcW w:type="dxa" w:w="2400"/>
+            <w:tcBorders>
+              <w:top w:val="single" w:color="5B6B8C" w:sz="8"/>
+              <w:left w:val="single" w:color="5B6B8C" w:sz="8"/>
+              <w:bottom w:val="single" w:color="5B6B8C" w:sz="8"/>
+              <w:right w:val="single" w:color="5B6B8C" w:sz="8"/>
             </w:tcBorders>
             <w:shd w:fill="F4F7FD" w:color="auto" w:val="clear"/>
             <w:tcMar>
@@ -2585,12 +2585,12 @@
         </w:tc>
         <w:tc>
           <w:tcPr>
-            <w:tcW w:type="dxa" w:w="3100"/>
-            <w:tcBorders>
-              <w:top w:val="single" w:color="FFFFFF" w:sz="12"/>
-              <w:left w:val="single" w:color="FFFFFF" w:sz="12"/>
-              <w:bottom w:val="single" w:color="FFFFFF" w:sz="12"/>
-              <w:right w:val="single" w:color="FFFFFF" w:sz="12"/>
+            <w:tcW w:type="dxa" w:w="2800"/>
+            <w:tcBorders>
+              <w:top w:val="single" w:color="5B6B8C" w:sz="8"/>
+              <w:left w:val="single" w:color="5B6B8C" w:sz="8"/>
+              <w:bottom w:val="single" w:color="5B6B8C" w:sz="8"/>
+              <w:right w:val="single" w:color="5B6B8C" w:sz="8"/>
             </w:tcBorders>
             <w:shd w:fill="F4F7FD" w:color="auto" w:val="clear"/>
             <w:tcMar>
@@ -2618,12 +2618,12 @@
         </w:tc>
         <w:tc>
           <w:tcPr>
-            <w:tcW w:type="dxa" w:w="2638"/>
-            <w:tcBorders>
-              <w:top w:val="single" w:color="FFFFFF" w:sz="12"/>
-              <w:left w:val="single" w:color="FFFFFF" w:sz="12"/>
-              <w:bottom w:val="single" w:color="FFFFFF" w:sz="12"/>
-              <w:right w:val="single" w:color="FFFFFF" w:sz="12"/>
+            <w:tcW w:type="dxa" w:w="2238"/>
+            <w:tcBorders>
+              <w:top w:val="single" w:color="5B6B8C" w:sz="8"/>
+              <w:left w:val="single" w:color="5B6B8C" w:sz="8"/>
+              <w:bottom w:val="single" w:color="5B6B8C" w:sz="8"/>
+              <w:right w:val="single" w:color="5B6B8C" w:sz="8"/>
             </w:tcBorders>
             <w:shd w:fill="F4F7FD" w:color="auto" w:val="clear"/>
             <w:tcMar>
@@ -2656,12 +2656,12 @@
         </w:trPr>
         <w:tc>
           <w:tcPr>
-            <w:tcW w:type="dxa" w:w="800"/>
-            <w:tcBorders>
-              <w:top w:val="single" w:color="B9C6E8" w:sz="4"/>
-              <w:left w:val="single" w:color="1E2761" w:sz="24"/>
-              <w:bottom w:val="single" w:color="B9C6E8" w:sz="4"/>
-              <w:right w:val="single" w:color="B9C6E8" w:sz="4"/>
+            <w:tcW w:type="dxa" w:w="700"/>
+            <w:tcBorders>
+              <w:top w:val="single" w:color="5B6B8C" w:sz="8"/>
+              <w:left w:val="single" w:color="1E2761" w:sz="36"/>
+              <w:bottom w:val="single" w:color="5B6B8C" w:sz="8"/>
+              <w:right w:val="single" w:color="5B6B8C" w:sz="8"/>
             </w:tcBorders>
             <w:shd w:fill="FFFFFF" w:color="auto" w:val="clear"/>
             <w:tcMar>
@@ -2691,12 +2691,12 @@
         </w:tc>
         <w:tc>
           <w:tcPr>
-            <w:tcW w:type="dxa" w:w="1650"/>
-            <w:tcBorders>
-              <w:top w:val="single" w:color="FFFFFF" w:sz="12"/>
-              <w:left w:val="single" w:color="FFFFFF" w:sz="12"/>
-              <w:bottom w:val="single" w:color="FFFFFF" w:sz="12"/>
-              <w:right w:val="single" w:color="FFFFFF" w:sz="12"/>
+            <w:tcW w:type="dxa" w:w="1400"/>
+            <w:tcBorders>
+              <w:top w:val="single" w:color="5B6B8C" w:sz="8"/>
+              <w:left w:val="single" w:color="5B6B8C" w:sz="8"/>
+              <w:bottom w:val="single" w:color="5B6B8C" w:sz="8"/>
+              <w:right w:val="single" w:color="5B6B8C" w:sz="8"/>
             </w:tcBorders>
             <w:shd w:fill="FFFFFF" w:color="auto" w:val="clear"/>
             <w:tcMar>
@@ -2740,12 +2740,12 @@
         </w:tc>
         <w:tc>
           <w:tcPr>
-            <w:tcW w:type="dxa" w:w="4400"/>
-            <w:tcBorders>
-              <w:top w:val="single" w:color="FFFFFF" w:sz="12"/>
-              <w:left w:val="single" w:color="FFFFFF" w:sz="12"/>
-              <w:bottom w:val="single" w:color="FFFFFF" w:sz="12"/>
-              <w:right w:val="single" w:color="FFFFFF" w:sz="12"/>
+            <w:tcW w:type="dxa" w:w="5900"/>
+            <w:tcBorders>
+              <w:top w:val="single" w:color="5B6B8C" w:sz="8"/>
+              <w:left w:val="single" w:color="5B6B8C" w:sz="8"/>
+              <w:bottom w:val="single" w:color="5B6B8C" w:sz="8"/>
+              <w:right w:val="single" w:color="5B6B8C" w:sz="8"/>
             </w:tcBorders>
             <w:shd w:fill="FFFFFF" w:color="auto" w:val="clear"/>
             <w:tcMar>
@@ -2783,18 +2783,18 @@
                 <w:sz w:val="16"/>
                 <w:szCs w:val="16"/>
               </w:rPr>
-              <w:t xml:space="preserve">Ich kann erklären, warum die Bastille zum Symbol wurde, und zwei Artikel der Menschenrechtserklärung wiedergeben.</w:t>
-            </w:r>
-          </w:p>
-        </w:tc>
-        <w:tc>
-          <w:tcPr>
-            <w:tcW w:type="dxa" w:w="2850"/>
-            <w:tcBorders>
-              <w:top w:val="single" w:color="FFFFFF" w:sz="12"/>
-              <w:left w:val="single" w:color="FFFFFF" w:sz="12"/>
-              <w:bottom w:val="single" w:color="FFFFFF" w:sz="12"/>
-              <w:right w:val="single" w:color="FFFFFF" w:sz="12"/>
+              <w:t xml:space="preserve">Ich kann erklären, warum der Sturm auf die Bastille zum Symbol wurde. Ich kann zwei Artikel der Menschenrechtserklärung mit eigenen Worten wiedergeben.</w:t>
+            </w:r>
+          </w:p>
+        </w:tc>
+        <w:tc>
+          <w:tcPr>
+            <w:tcW w:type="dxa" w:w="2400"/>
+            <w:tcBorders>
+              <w:top w:val="single" w:color="5B6B8C" w:sz="8"/>
+              <w:left w:val="single" w:color="5B6B8C" w:sz="8"/>
+              <w:bottom w:val="single" w:color="5B6B8C" w:sz="8"/>
+              <w:right w:val="single" w:color="5B6B8C" w:sz="8"/>
             </w:tcBorders>
             <w:shd w:fill="FFFFFF" w:color="auto" w:val="clear"/>
             <w:tcMar>
@@ -2822,12 +2822,12 @@
         </w:tc>
         <w:tc>
           <w:tcPr>
-            <w:tcW w:type="dxa" w:w="3100"/>
-            <w:tcBorders>
-              <w:top w:val="single" w:color="FFFFFF" w:sz="12"/>
-              <w:left w:val="single" w:color="FFFFFF" w:sz="12"/>
-              <w:bottom w:val="single" w:color="FFFFFF" w:sz="12"/>
-              <w:right w:val="single" w:color="FFFFFF" w:sz="12"/>
+            <w:tcW w:type="dxa" w:w="2800"/>
+            <w:tcBorders>
+              <w:top w:val="single" w:color="5B6B8C" w:sz="8"/>
+              <w:left w:val="single" w:color="5B6B8C" w:sz="8"/>
+              <w:bottom w:val="single" w:color="5B6B8C" w:sz="8"/>
+              <w:right w:val="single" w:color="5B6B8C" w:sz="8"/>
             </w:tcBorders>
             <w:shd w:fill="FFFFFF" w:color="auto" w:val="clear"/>
             <w:tcMar>
@@ -2855,12 +2855,12 @@
         </w:tc>
         <w:tc>
           <w:tcPr>
-            <w:tcW w:type="dxa" w:w="2638"/>
-            <w:tcBorders>
-              <w:top w:val="single" w:color="FFFFFF" w:sz="12"/>
-              <w:left w:val="single" w:color="FFFFFF" w:sz="12"/>
-              <w:bottom w:val="single" w:color="FFFFFF" w:sz="12"/>
-              <w:right w:val="single" w:color="FFFFFF" w:sz="12"/>
+            <w:tcW w:type="dxa" w:w="2238"/>
+            <w:tcBorders>
+              <w:top w:val="single" w:color="5B6B8C" w:sz="8"/>
+              <w:left w:val="single" w:color="5B6B8C" w:sz="8"/>
+              <w:bottom w:val="single" w:color="5B6B8C" w:sz="8"/>
+              <w:right w:val="single" w:color="5B6B8C" w:sz="8"/>
             </w:tcBorders>
             <w:shd w:fill="FFFFFF" w:color="auto" w:val="clear"/>
             <w:tcMar>
@@ -2893,12 +2893,12 @@
         </w:trPr>
         <w:tc>
           <w:tcPr>
-            <w:tcW w:type="dxa" w:w="800"/>
-            <w:tcBorders>
-              <w:top w:val="single" w:color="B9C6E8" w:sz="4"/>
-              <w:left w:val="single" w:color="E8A33D" w:sz="24"/>
-              <w:bottom w:val="single" w:color="B9C6E8" w:sz="4"/>
-              <w:right w:val="single" w:color="B9C6E8" w:sz="4"/>
+            <w:tcW w:type="dxa" w:w="700"/>
+            <w:tcBorders>
+              <w:top w:val="single" w:color="5B6B8C" w:sz="8"/>
+              <w:left w:val="single" w:color="E8A33D" w:sz="36"/>
+              <w:bottom w:val="single" w:color="5B6B8C" w:sz="8"/>
+              <w:right w:val="single" w:color="5B6B8C" w:sz="8"/>
             </w:tcBorders>
             <w:shd w:fill="F4F7FD" w:color="auto" w:val="clear"/>
             <w:tcMar>
@@ -2928,12 +2928,12 @@
         </w:tc>
         <w:tc>
           <w:tcPr>
-            <w:tcW w:type="dxa" w:w="1650"/>
-            <w:tcBorders>
-              <w:top w:val="single" w:color="FFFFFF" w:sz="12"/>
-              <w:left w:val="single" w:color="FFFFFF" w:sz="12"/>
-              <w:bottom w:val="single" w:color="FFFFFF" w:sz="12"/>
-              <w:right w:val="single" w:color="FFFFFF" w:sz="12"/>
+            <w:tcW w:type="dxa" w:w="1400"/>
+            <w:tcBorders>
+              <w:top w:val="single" w:color="5B6B8C" w:sz="8"/>
+              <w:left w:val="single" w:color="5B6B8C" w:sz="8"/>
+              <w:bottom w:val="single" w:color="5B6B8C" w:sz="8"/>
+              <w:right w:val="single" w:color="5B6B8C" w:sz="8"/>
             </w:tcBorders>
             <w:shd w:fill="F4F7FD" w:color="auto" w:val="clear"/>
             <w:tcMar>
@@ -2977,12 +2977,12 @@
         </w:tc>
         <w:tc>
           <w:tcPr>
-            <w:tcW w:type="dxa" w:w="4400"/>
-            <w:tcBorders>
-              <w:top w:val="single" w:color="FFFFFF" w:sz="12"/>
-              <w:left w:val="single" w:color="FFFFFF" w:sz="12"/>
-              <w:bottom w:val="single" w:color="FFFFFF" w:sz="12"/>
-              <w:right w:val="single" w:color="FFFFFF" w:sz="12"/>
+            <w:tcW w:type="dxa" w:w="5900"/>
+            <w:tcBorders>
+              <w:top w:val="single" w:color="5B6B8C" w:sz="8"/>
+              <w:left w:val="single" w:color="5B6B8C" w:sz="8"/>
+              <w:bottom w:val="single" w:color="5B6B8C" w:sz="8"/>
+              <w:right w:val="single" w:color="5B6B8C" w:sz="8"/>
             </w:tcBorders>
             <w:shd w:fill="F4F7FD" w:color="auto" w:val="clear"/>
             <w:tcMar>
@@ -3020,18 +3020,18 @@
                 <w:sz w:val="16"/>
                 <w:szCs w:val="16"/>
               </w:rPr>
-              <w:t xml:space="preserve">Ich kann am Schaubild erklären, wer welche Macht hatte und wer wählen durfte (Aktiv- und Passivbürger).</w:t>
-            </w:r>
-          </w:p>
-        </w:tc>
-        <w:tc>
-          <w:tcPr>
-            <w:tcW w:type="dxa" w:w="2850"/>
-            <w:tcBorders>
-              <w:top w:val="single" w:color="FFFFFF" w:sz="12"/>
-              <w:left w:val="single" w:color="FFFFFF" w:sz="12"/>
-              <w:bottom w:val="single" w:color="FFFFFF" w:sz="12"/>
-              <w:right w:val="single" w:color="FFFFFF" w:sz="12"/>
+              <w:t xml:space="preserve">Ich kann am Schaubild erklären, wer in der konstitutionellen Monarchie welche Macht hatte. Ich kann erklären, wer 1791 wählen durfte und wer nicht.</w:t>
+            </w:r>
+          </w:p>
+        </w:tc>
+        <w:tc>
+          <w:tcPr>
+            <w:tcW w:type="dxa" w:w="2400"/>
+            <w:tcBorders>
+              <w:top w:val="single" w:color="5B6B8C" w:sz="8"/>
+              <w:left w:val="single" w:color="5B6B8C" w:sz="8"/>
+              <w:bottom w:val="single" w:color="5B6B8C" w:sz="8"/>
+              <w:right w:val="single" w:color="5B6B8C" w:sz="8"/>
             </w:tcBorders>
             <w:shd w:fill="F4F7FD" w:color="auto" w:val="clear"/>
             <w:tcMar>
@@ -3059,12 +3059,12 @@
         </w:tc>
         <w:tc>
           <w:tcPr>
-            <w:tcW w:type="dxa" w:w="3100"/>
-            <w:tcBorders>
-              <w:top w:val="single" w:color="FFFFFF" w:sz="12"/>
-              <w:left w:val="single" w:color="FFFFFF" w:sz="12"/>
-              <w:bottom w:val="single" w:color="FFFFFF" w:sz="12"/>
-              <w:right w:val="single" w:color="FFFFFF" w:sz="12"/>
+            <w:tcW w:type="dxa" w:w="2800"/>
+            <w:tcBorders>
+              <w:top w:val="single" w:color="5B6B8C" w:sz="8"/>
+              <w:left w:val="single" w:color="5B6B8C" w:sz="8"/>
+              <w:bottom w:val="single" w:color="5B6B8C" w:sz="8"/>
+              <w:right w:val="single" w:color="5B6B8C" w:sz="8"/>
             </w:tcBorders>
             <w:shd w:fill="F4F7FD" w:color="auto" w:val="clear"/>
             <w:tcMar>
@@ -3092,12 +3092,12 @@
         </w:tc>
         <w:tc>
           <w:tcPr>
-            <w:tcW w:type="dxa" w:w="2638"/>
-            <w:tcBorders>
-              <w:top w:val="single" w:color="FFFFFF" w:sz="12"/>
-              <w:left w:val="single" w:color="FFFFFF" w:sz="12"/>
-              <w:bottom w:val="single" w:color="FFFFFF" w:sz="12"/>
-              <w:right w:val="single" w:color="FFFFFF" w:sz="12"/>
+            <w:tcW w:type="dxa" w:w="2238"/>
+            <w:tcBorders>
+              <w:top w:val="single" w:color="5B6B8C" w:sz="8"/>
+              <w:left w:val="single" w:color="5B6B8C" w:sz="8"/>
+              <w:bottom w:val="single" w:color="5B6B8C" w:sz="8"/>
+              <w:right w:val="single" w:color="5B6B8C" w:sz="8"/>
             </w:tcBorders>
             <w:shd w:fill="F4F7FD" w:color="auto" w:val="clear"/>
             <w:tcMar>
@@ -3130,12 +3130,12 @@
         </w:trPr>
         <w:tc>
           <w:tcPr>
-            <w:tcW w:type="dxa" w:w="800"/>
-            <w:tcBorders>
-              <w:top w:val="single" w:color="B9C6E8" w:sz="4"/>
-              <w:left w:val="single" w:color="D9534F" w:sz="24"/>
-              <w:bottom w:val="single" w:color="B9C6E8" w:sz="4"/>
-              <w:right w:val="single" w:color="B9C6E8" w:sz="4"/>
+            <w:tcW w:type="dxa" w:w="700"/>
+            <w:tcBorders>
+              <w:top w:val="single" w:color="5B6B8C" w:sz="8"/>
+              <w:left w:val="single" w:color="D9534F" w:sz="36"/>
+              <w:bottom w:val="single" w:color="5B6B8C" w:sz="8"/>
+              <w:right w:val="single" w:color="5B6B8C" w:sz="8"/>
             </w:tcBorders>
             <w:shd w:fill="FCEFEE" w:color="auto" w:val="clear"/>
             <w:tcMar>
@@ -3165,12 +3165,12 @@
         </w:tc>
         <w:tc>
           <w:tcPr>
-            <w:tcW w:type="dxa" w:w="1650"/>
-            <w:tcBorders>
-              <w:top w:val="single" w:color="FFFFFF" w:sz="12"/>
-              <w:left w:val="single" w:color="FFFFFF" w:sz="12"/>
-              <w:bottom w:val="single" w:color="FFFFFF" w:sz="12"/>
-              <w:right w:val="single" w:color="FFFFFF" w:sz="12"/>
+            <w:tcW w:type="dxa" w:w="1400"/>
+            <w:tcBorders>
+              <w:top w:val="single" w:color="5B6B8C" w:sz="8"/>
+              <w:left w:val="single" w:color="5B6B8C" w:sz="8"/>
+              <w:bottom w:val="single" w:color="5B6B8C" w:sz="8"/>
+              <w:right w:val="single" w:color="5B6B8C" w:sz="8"/>
             </w:tcBorders>
             <w:shd w:fill="FCEFEE" w:color="auto" w:val="clear"/>
             <w:tcMar>
@@ -3214,12 +3214,12 @@
         </w:tc>
         <w:tc>
           <w:tcPr>
-            <w:tcW w:type="dxa" w:w="4400"/>
-            <w:tcBorders>
-              <w:top w:val="single" w:color="FFFFFF" w:sz="12"/>
-              <w:left w:val="single" w:color="FFFFFF" w:sz="12"/>
-              <w:bottom w:val="single" w:color="FFFFFF" w:sz="12"/>
-              <w:right w:val="single" w:color="FFFFFF" w:sz="12"/>
+            <w:tcW w:type="dxa" w:w="5900"/>
+            <w:tcBorders>
+              <w:top w:val="single" w:color="5B6B8C" w:sz="8"/>
+              <w:left w:val="single" w:color="5B6B8C" w:sz="8"/>
+              <w:bottom w:val="single" w:color="5B6B8C" w:sz="8"/>
+              <w:right w:val="single" w:color="5B6B8C" w:sz="8"/>
             </w:tcBorders>
             <w:shd w:fill="FCEFEE" w:color="auto" w:val="clear"/>
             <w:tcMar>
@@ -3257,18 +3257,18 @@
                 <w:sz w:val="16"/>
                 <w:szCs w:val="16"/>
               </w:rPr>
-              <w:t xml:space="preserve">Ich kann Ursachen, Ereignisse von 1789, Menschenrechte und Verfassung 1791 richtig zuordnen und erklären.</w:t>
-            </w:r>
-          </w:p>
-        </w:tc>
-        <w:tc>
-          <w:tcPr>
-            <w:tcW w:type="dxa" w:w="2850"/>
-            <w:tcBorders>
-              <w:top w:val="single" w:color="FFFFFF" w:sz="12"/>
-              <w:left w:val="single" w:color="FFFFFF" w:sz="12"/>
-              <w:bottom w:val="single" w:color="FFFFFF" w:sz="12"/>
-              <w:right w:val="single" w:color="FFFFFF" w:sz="12"/>
+              <w:t xml:space="preserve">Ich kann die Ursachen, die Ereignisse von 1789, die Menschenrechte und die Verfassung 1791 erklären.</w:t>
+            </w:r>
+          </w:p>
+        </w:tc>
+        <w:tc>
+          <w:tcPr>
+            <w:tcW w:type="dxa" w:w="2400"/>
+            <w:tcBorders>
+              <w:top w:val="single" w:color="5B6B8C" w:sz="8"/>
+              <w:left w:val="single" w:color="5B6B8C" w:sz="8"/>
+              <w:bottom w:val="single" w:color="5B6B8C" w:sz="8"/>
+              <w:right w:val="single" w:color="5B6B8C" w:sz="8"/>
             </w:tcBorders>
             <w:shd w:fill="FCEFEE" w:color="auto" w:val="clear"/>
             <w:tcMar>
@@ -3296,12 +3296,12 @@
         </w:tc>
         <w:tc>
           <w:tcPr>
-            <w:tcW w:type="dxa" w:w="3100"/>
-            <w:tcBorders>
-              <w:top w:val="single" w:color="FFFFFF" w:sz="12"/>
-              <w:left w:val="single" w:color="FFFFFF" w:sz="12"/>
-              <w:bottom w:val="single" w:color="FFFFFF" w:sz="12"/>
-              <w:right w:val="single" w:color="FFFFFF" w:sz="12"/>
+            <w:tcW w:type="dxa" w:w="2800"/>
+            <w:tcBorders>
+              <w:top w:val="single" w:color="5B6B8C" w:sz="8"/>
+              <w:left w:val="single" w:color="5B6B8C" w:sz="8"/>
+              <w:bottom w:val="single" w:color="5B6B8C" w:sz="8"/>
+              <w:right w:val="single" w:color="5B6B8C" w:sz="8"/>
             </w:tcBorders>
             <w:shd w:fill="FCEFEE" w:color="auto" w:val="clear"/>
             <w:tcMar>
@@ -3329,12 +3329,12 @@
         </w:tc>
         <w:tc>
           <w:tcPr>
-            <w:tcW w:type="dxa" w:w="2638"/>
-            <w:tcBorders>
-              <w:top w:val="single" w:color="FFFFFF" w:sz="12"/>
-              <w:left w:val="single" w:color="FFFFFF" w:sz="12"/>
-              <w:bottom w:val="single" w:color="FFFFFF" w:sz="12"/>
-              <w:right w:val="single" w:color="FFFFFF" w:sz="12"/>
+            <w:tcW w:type="dxa" w:w="2238"/>
+            <w:tcBorders>
+              <w:top w:val="single" w:color="5B6B8C" w:sz="8"/>
+              <w:left w:val="single" w:color="5B6B8C" w:sz="8"/>
+              <w:bottom w:val="single" w:color="5B6B8C" w:sz="8"/>
+              <w:right w:val="single" w:color="5B6B8C" w:sz="8"/>
             </w:tcBorders>
             <w:shd w:fill="FCEFEE" w:color="auto" w:val="clear"/>
             <w:tcMar>
@@ -3367,12 +3367,12 @@
         </w:trPr>
         <w:tc>
           <w:tcPr>
-            <w:tcW w:type="dxa" w:w="800"/>
-            <w:tcBorders>
-              <w:top w:val="single" w:color="B9C6E8" w:sz="4"/>
-              <w:left w:val="single" w:color="1E2761" w:sz="24"/>
-              <w:bottom w:val="single" w:color="B9C6E8" w:sz="4"/>
-              <w:right w:val="single" w:color="B9C6E8" w:sz="4"/>
+            <w:tcW w:type="dxa" w:w="700"/>
+            <w:tcBorders>
+              <w:top w:val="single" w:color="5B6B8C" w:sz="8"/>
+              <w:left w:val="single" w:color="1E2761" w:sz="36"/>
+              <w:bottom w:val="single" w:color="5B6B8C" w:sz="8"/>
+              <w:right w:val="single" w:color="5B6B8C" w:sz="8"/>
             </w:tcBorders>
             <w:shd w:fill="F4F7FD" w:color="auto" w:val="clear"/>
             <w:tcMar>
@@ -3402,12 +3402,12 @@
         </w:tc>
         <w:tc>
           <w:tcPr>
-            <w:tcW w:type="dxa" w:w="1650"/>
-            <w:tcBorders>
-              <w:top w:val="single" w:color="FFFFFF" w:sz="12"/>
-              <w:left w:val="single" w:color="FFFFFF" w:sz="12"/>
-              <w:bottom w:val="single" w:color="FFFFFF" w:sz="12"/>
-              <w:right w:val="single" w:color="FFFFFF" w:sz="12"/>
+            <w:tcW w:type="dxa" w:w="1400"/>
+            <w:tcBorders>
+              <w:top w:val="single" w:color="5B6B8C" w:sz="8"/>
+              <w:left w:val="single" w:color="5B6B8C" w:sz="8"/>
+              <w:bottom w:val="single" w:color="5B6B8C" w:sz="8"/>
+              <w:right w:val="single" w:color="5B6B8C" w:sz="8"/>
             </w:tcBorders>
             <w:shd w:fill="F4F7FD" w:color="auto" w:val="clear"/>
             <w:tcMar>
@@ -3451,12 +3451,12 @@
         </w:tc>
         <w:tc>
           <w:tcPr>
-            <w:tcW w:type="dxa" w:w="4400"/>
-            <w:tcBorders>
-              <w:top w:val="single" w:color="FFFFFF" w:sz="12"/>
-              <w:left w:val="single" w:color="FFFFFF" w:sz="12"/>
-              <w:bottom w:val="single" w:color="FFFFFF" w:sz="12"/>
-              <w:right w:val="single" w:color="FFFFFF" w:sz="12"/>
+            <w:tcW w:type="dxa" w:w="5900"/>
+            <w:tcBorders>
+              <w:top w:val="single" w:color="5B6B8C" w:sz="8"/>
+              <w:left w:val="single" w:color="5B6B8C" w:sz="8"/>
+              <w:bottom w:val="single" w:color="5B6B8C" w:sz="8"/>
+              <w:right w:val="single" w:color="5B6B8C" w:sz="8"/>
             </w:tcBorders>
             <w:shd w:fill="F4F7FD" w:color="auto" w:val="clear"/>
             <w:tcMar>
@@ -3494,18 +3494,18 @@
                 <w:sz w:val="16"/>
                 <w:szCs w:val="16"/>
               </w:rPr>
-              <w:t xml:space="preserve">Ich kann in einer Kette erklären, warum die konstitutionelle Monarchie 1792 scheiterte.</w:t>
-            </w:r>
-          </w:p>
-        </w:tc>
-        <w:tc>
-          <w:tcPr>
-            <w:tcW w:type="dxa" w:w="2850"/>
-            <w:tcBorders>
-              <w:top w:val="single" w:color="FFFFFF" w:sz="12"/>
-              <w:left w:val="single" w:color="FFFFFF" w:sz="12"/>
-              <w:bottom w:val="single" w:color="FFFFFF" w:sz="12"/>
-              <w:right w:val="single" w:color="FFFFFF" w:sz="12"/>
+              <w:t xml:space="preserve">Ich kann erklären, warum die konstitutionelle Monarchie 1792 scheiterte. Ich kann die Ereignisse von 1791 bis 1793 in der richtigen Reihenfolge nennen.</w:t>
+            </w:r>
+          </w:p>
+        </w:tc>
+        <w:tc>
+          <w:tcPr>
+            <w:tcW w:type="dxa" w:w="2400"/>
+            <w:tcBorders>
+              <w:top w:val="single" w:color="5B6B8C" w:sz="8"/>
+              <w:left w:val="single" w:color="5B6B8C" w:sz="8"/>
+              <w:bottom w:val="single" w:color="5B6B8C" w:sz="8"/>
+              <w:right w:val="single" w:color="5B6B8C" w:sz="8"/>
             </w:tcBorders>
             <w:shd w:fill="F4F7FD" w:color="auto" w:val="clear"/>
             <w:tcMar>
@@ -3533,12 +3533,12 @@
         </w:tc>
         <w:tc>
           <w:tcPr>
-            <w:tcW w:type="dxa" w:w="3100"/>
-            <w:tcBorders>
-              <w:top w:val="single" w:color="FFFFFF" w:sz="12"/>
-              <w:left w:val="single" w:color="FFFFFF" w:sz="12"/>
-              <w:bottom w:val="single" w:color="FFFFFF" w:sz="12"/>
-              <w:right w:val="single" w:color="FFFFFF" w:sz="12"/>
+            <w:tcW w:type="dxa" w:w="2800"/>
+            <w:tcBorders>
+              <w:top w:val="single" w:color="5B6B8C" w:sz="8"/>
+              <w:left w:val="single" w:color="5B6B8C" w:sz="8"/>
+              <w:bottom w:val="single" w:color="5B6B8C" w:sz="8"/>
+              <w:right w:val="single" w:color="5B6B8C" w:sz="8"/>
             </w:tcBorders>
             <w:shd w:fill="F4F7FD" w:color="auto" w:val="clear"/>
             <w:tcMar>
@@ -3566,12 +3566,12 @@
         </w:tc>
         <w:tc>
           <w:tcPr>
-            <w:tcW w:type="dxa" w:w="2638"/>
-            <w:tcBorders>
-              <w:top w:val="single" w:color="FFFFFF" w:sz="12"/>
-              <w:left w:val="single" w:color="FFFFFF" w:sz="12"/>
-              <w:bottom w:val="single" w:color="FFFFFF" w:sz="12"/>
-              <w:right w:val="single" w:color="FFFFFF" w:sz="12"/>
+            <w:tcW w:type="dxa" w:w="2238"/>
+            <w:tcBorders>
+              <w:top w:val="single" w:color="5B6B8C" w:sz="8"/>
+              <w:left w:val="single" w:color="5B6B8C" w:sz="8"/>
+              <w:bottom w:val="single" w:color="5B6B8C" w:sz="8"/>
+              <w:right w:val="single" w:color="5B6B8C" w:sz="8"/>
             </w:tcBorders>
             <w:shd w:fill="F4F7FD" w:color="auto" w:val="clear"/>
             <w:tcMar>
@@ -3604,12 +3604,12 @@
         </w:trPr>
         <w:tc>
           <w:tcPr>
-            <w:tcW w:type="dxa" w:w="800"/>
-            <w:tcBorders>
-              <w:top w:val="single" w:color="B9C6E8" w:sz="4"/>
-              <w:left w:val="single" w:color="2E9E6B" w:sz="24"/>
-              <w:bottom w:val="single" w:color="B9C6E8" w:sz="4"/>
-              <w:right w:val="single" w:color="B9C6E8" w:sz="4"/>
+            <w:tcW w:type="dxa" w:w="700"/>
+            <w:tcBorders>
+              <w:top w:val="single" w:color="5B6B8C" w:sz="8"/>
+              <w:left w:val="single" w:color="2E9E6B" w:sz="36"/>
+              <w:bottom w:val="single" w:color="5B6B8C" w:sz="8"/>
+              <w:right w:val="single" w:color="5B6B8C" w:sz="8"/>
             </w:tcBorders>
             <w:shd w:fill="FFFFFF" w:color="auto" w:val="clear"/>
             <w:tcMar>
@@ -3639,12 +3639,12 @@
         </w:tc>
         <w:tc>
           <w:tcPr>
-            <w:tcW w:type="dxa" w:w="1650"/>
-            <w:tcBorders>
-              <w:top w:val="single" w:color="FFFFFF" w:sz="12"/>
-              <w:left w:val="single" w:color="FFFFFF" w:sz="12"/>
-              <w:bottom w:val="single" w:color="FFFFFF" w:sz="12"/>
-              <w:right w:val="single" w:color="FFFFFF" w:sz="12"/>
+            <w:tcW w:type="dxa" w:w="1400"/>
+            <w:tcBorders>
+              <w:top w:val="single" w:color="5B6B8C" w:sz="8"/>
+              <w:left w:val="single" w:color="5B6B8C" w:sz="8"/>
+              <w:bottom w:val="single" w:color="5B6B8C" w:sz="8"/>
+              <w:right w:val="single" w:color="5B6B8C" w:sz="8"/>
             </w:tcBorders>
             <w:shd w:fill="FFFFFF" w:color="auto" w:val="clear"/>
             <w:tcMar>
@@ -3688,12 +3688,12 @@
         </w:tc>
         <w:tc>
           <w:tcPr>
-            <w:tcW w:type="dxa" w:w="4400"/>
-            <w:tcBorders>
-              <w:top w:val="single" w:color="FFFFFF" w:sz="12"/>
-              <w:left w:val="single" w:color="FFFFFF" w:sz="12"/>
-              <w:bottom w:val="single" w:color="FFFFFF" w:sz="12"/>
-              <w:right w:val="single" w:color="FFFFFF" w:sz="12"/>
+            <w:tcW w:type="dxa" w:w="5900"/>
+            <w:tcBorders>
+              <w:top w:val="single" w:color="5B6B8C" w:sz="8"/>
+              <w:left w:val="single" w:color="5B6B8C" w:sz="8"/>
+              <w:bottom w:val="single" w:color="5B6B8C" w:sz="8"/>
+              <w:right w:val="single" w:color="5B6B8C" w:sz="8"/>
             </w:tcBorders>
             <w:shd w:fill="FFFFFF" w:color="auto" w:val="clear"/>
             <w:tcMar>
@@ -3731,18 +3731,18 @@
                 <w:sz w:val="16"/>
                 <w:szCs w:val="16"/>
               </w:rPr>
-              <w:t xml:space="preserve">Ich kann ein Sachurteil zum Terror formulieren und ein Werturteil mit Maßstab begründen.</w:t>
-            </w:r>
-          </w:p>
-        </w:tc>
-        <w:tc>
-          <w:tcPr>
-            <w:tcW w:type="dxa" w:w="2850"/>
-            <w:tcBorders>
-              <w:top w:val="single" w:color="FFFFFF" w:sz="12"/>
-              <w:left w:val="single" w:color="FFFFFF" w:sz="12"/>
-              <w:bottom w:val="single" w:color="FFFFFF" w:sz="12"/>
-              <w:right w:val="single" w:color="FFFFFF" w:sz="12"/>
+              <w:t xml:space="preserve">Ich kann ein Sachurteil zum Terror der Jakobiner mit Beleg formulieren. Ich kann ein Werturteil dazu mit offengelegtem Maßstab begründen.</w:t>
+            </w:r>
+          </w:p>
+        </w:tc>
+        <w:tc>
+          <w:tcPr>
+            <w:tcW w:type="dxa" w:w="2400"/>
+            <w:tcBorders>
+              <w:top w:val="single" w:color="5B6B8C" w:sz="8"/>
+              <w:left w:val="single" w:color="5B6B8C" w:sz="8"/>
+              <w:bottom w:val="single" w:color="5B6B8C" w:sz="8"/>
+              <w:right w:val="single" w:color="5B6B8C" w:sz="8"/>
             </w:tcBorders>
             <w:shd w:fill="FFFFFF" w:color="auto" w:val="clear"/>
             <w:tcMar>
@@ -3770,12 +3770,12 @@
         </w:tc>
         <w:tc>
           <w:tcPr>
-            <w:tcW w:type="dxa" w:w="3100"/>
-            <w:tcBorders>
-              <w:top w:val="single" w:color="FFFFFF" w:sz="12"/>
-              <w:left w:val="single" w:color="FFFFFF" w:sz="12"/>
-              <w:bottom w:val="single" w:color="FFFFFF" w:sz="12"/>
-              <w:right w:val="single" w:color="FFFFFF" w:sz="12"/>
+            <w:tcW w:type="dxa" w:w="2800"/>
+            <w:tcBorders>
+              <w:top w:val="single" w:color="5B6B8C" w:sz="8"/>
+              <w:left w:val="single" w:color="5B6B8C" w:sz="8"/>
+              <w:bottom w:val="single" w:color="5B6B8C" w:sz="8"/>
+              <w:right w:val="single" w:color="5B6B8C" w:sz="8"/>
             </w:tcBorders>
             <w:shd w:fill="FFFFFF" w:color="auto" w:val="clear"/>
             <w:tcMar>
@@ -3803,12 +3803,12 @@
         </w:tc>
         <w:tc>
           <w:tcPr>
-            <w:tcW w:type="dxa" w:w="2638"/>
-            <w:tcBorders>
-              <w:top w:val="single" w:color="FFFFFF" w:sz="12"/>
-              <w:left w:val="single" w:color="FFFFFF" w:sz="12"/>
-              <w:bottom w:val="single" w:color="FFFFFF" w:sz="12"/>
-              <w:right w:val="single" w:color="FFFFFF" w:sz="12"/>
+            <w:tcW w:type="dxa" w:w="2238"/>
+            <w:tcBorders>
+              <w:top w:val="single" w:color="5B6B8C" w:sz="8"/>
+              <w:left w:val="single" w:color="5B6B8C" w:sz="8"/>
+              <w:bottom w:val="single" w:color="5B6B8C" w:sz="8"/>
+              <w:right w:val="single" w:color="5B6B8C" w:sz="8"/>
             </w:tcBorders>
             <w:shd w:fill="FFFFFF" w:color="auto" w:val="clear"/>
             <w:tcMar>
@@ -3841,12 +3841,12 @@
         </w:trPr>
         <w:tc>
           <w:tcPr>
-            <w:tcW w:type="dxa" w:w="800"/>
-            <w:tcBorders>
-              <w:top w:val="single" w:color="B9C6E8" w:sz="4"/>
-              <w:left w:val="single" w:color="1E2761" w:sz="24"/>
-              <w:bottom w:val="single" w:color="B9C6E8" w:sz="4"/>
-              <w:right w:val="single" w:color="B9C6E8" w:sz="4"/>
+            <w:tcW w:type="dxa" w:w="700"/>
+            <w:tcBorders>
+              <w:top w:val="single" w:color="5B6B8C" w:sz="8"/>
+              <w:left w:val="single" w:color="1E2761" w:sz="36"/>
+              <w:bottom w:val="single" w:color="5B6B8C" w:sz="8"/>
+              <w:right w:val="single" w:color="5B6B8C" w:sz="8"/>
             </w:tcBorders>
             <w:shd w:fill="F4F7FD" w:color="auto" w:val="clear"/>
             <w:tcMar>
@@ -3876,12 +3876,12 @@
         </w:tc>
         <w:tc>
           <w:tcPr>
-            <w:tcW w:type="dxa" w:w="1650"/>
-            <w:tcBorders>
-              <w:top w:val="single" w:color="FFFFFF" w:sz="12"/>
-              <w:left w:val="single" w:color="FFFFFF" w:sz="12"/>
-              <w:bottom w:val="single" w:color="FFFFFF" w:sz="12"/>
-              <w:right w:val="single" w:color="FFFFFF" w:sz="12"/>
+            <w:tcW w:type="dxa" w:w="1400"/>
+            <w:tcBorders>
+              <w:top w:val="single" w:color="5B6B8C" w:sz="8"/>
+              <w:left w:val="single" w:color="5B6B8C" w:sz="8"/>
+              <w:bottom w:val="single" w:color="5B6B8C" w:sz="8"/>
+              <w:right w:val="single" w:color="5B6B8C" w:sz="8"/>
             </w:tcBorders>
             <w:shd w:fill="F4F7FD" w:color="auto" w:val="clear"/>
             <w:tcMar>
@@ -3925,12 +3925,12 @@
         </w:tc>
         <w:tc>
           <w:tcPr>
-            <w:tcW w:type="dxa" w:w="4400"/>
-            <w:tcBorders>
-              <w:top w:val="single" w:color="FFFFFF" w:sz="12"/>
-              <w:left w:val="single" w:color="FFFFFF" w:sz="12"/>
-              <w:bottom w:val="single" w:color="FFFFFF" w:sz="12"/>
-              <w:right w:val="single" w:color="FFFFFF" w:sz="12"/>
+            <w:tcW w:type="dxa" w:w="5900"/>
+            <w:tcBorders>
+              <w:top w:val="single" w:color="5B6B8C" w:sz="8"/>
+              <w:left w:val="single" w:color="5B6B8C" w:sz="8"/>
+              <w:bottom w:val="single" w:color="5B6B8C" w:sz="8"/>
+              <w:right w:val="single" w:color="5B6B8C" w:sz="8"/>
             </w:tcBorders>
             <w:shd w:fill="F4F7FD" w:color="auto" w:val="clear"/>
             <w:tcMar>
@@ -3968,18 +3968,18 @@
                 <w:sz w:val="16"/>
                 <w:szCs w:val="16"/>
               </w:rPr>
-              <w:t xml:space="preserve">Ich kann erklären, warum viele Menschen 1799 einen starken Mann akzeptierten.</w:t>
-            </w:r>
-          </w:p>
-        </w:tc>
-        <w:tc>
-          <w:tcPr>
-            <w:tcW w:type="dxa" w:w="2850"/>
-            <w:tcBorders>
-              <w:top w:val="single" w:color="FFFFFF" w:sz="12"/>
-              <w:left w:val="single" w:color="FFFFFF" w:sz="12"/>
-              <w:bottom w:val="single" w:color="FFFFFF" w:sz="12"/>
-              <w:right w:val="single" w:color="FFFFFF" w:sz="12"/>
+              <w:t xml:space="preserve">Ich kann den Weg vom Ende des Terrors 1794 bis zum Staatsstreich 1799 am Zeitstrahl darstellen. Ich kann zwei Gründe nennen, warum viele Menschen 1799 einen starken Mann akzeptierten.</w:t>
+            </w:r>
+          </w:p>
+        </w:tc>
+        <w:tc>
+          <w:tcPr>
+            <w:tcW w:type="dxa" w:w="2400"/>
+            <w:tcBorders>
+              <w:top w:val="single" w:color="5B6B8C" w:sz="8"/>
+              <w:left w:val="single" w:color="5B6B8C" w:sz="8"/>
+              <w:bottom w:val="single" w:color="5B6B8C" w:sz="8"/>
+              <w:right w:val="single" w:color="5B6B8C" w:sz="8"/>
             </w:tcBorders>
             <w:shd w:fill="F4F7FD" w:color="auto" w:val="clear"/>
             <w:tcMar>
@@ -4007,12 +4007,12 @@
         </w:tc>
         <w:tc>
           <w:tcPr>
-            <w:tcW w:type="dxa" w:w="3100"/>
-            <w:tcBorders>
-              <w:top w:val="single" w:color="FFFFFF" w:sz="12"/>
-              <w:left w:val="single" w:color="FFFFFF" w:sz="12"/>
-              <w:bottom w:val="single" w:color="FFFFFF" w:sz="12"/>
-              <w:right w:val="single" w:color="FFFFFF" w:sz="12"/>
+            <w:tcW w:type="dxa" w:w="2800"/>
+            <w:tcBorders>
+              <w:top w:val="single" w:color="5B6B8C" w:sz="8"/>
+              <w:left w:val="single" w:color="5B6B8C" w:sz="8"/>
+              <w:bottom w:val="single" w:color="5B6B8C" w:sz="8"/>
+              <w:right w:val="single" w:color="5B6B8C" w:sz="8"/>
             </w:tcBorders>
             <w:shd w:fill="F4F7FD" w:color="auto" w:val="clear"/>
             <w:tcMar>
@@ -4040,12 +4040,12 @@
         </w:tc>
         <w:tc>
           <w:tcPr>
-            <w:tcW w:type="dxa" w:w="2638"/>
-            <w:tcBorders>
-              <w:top w:val="single" w:color="FFFFFF" w:sz="12"/>
-              <w:left w:val="single" w:color="FFFFFF" w:sz="12"/>
-              <w:bottom w:val="single" w:color="FFFFFF" w:sz="12"/>
-              <w:right w:val="single" w:color="FFFFFF" w:sz="12"/>
+            <w:tcW w:type="dxa" w:w="2238"/>
+            <w:tcBorders>
+              <w:top w:val="single" w:color="5B6B8C" w:sz="8"/>
+              <w:left w:val="single" w:color="5B6B8C" w:sz="8"/>
+              <w:bottom w:val="single" w:color="5B6B8C" w:sz="8"/>
+              <w:right w:val="single" w:color="5B6B8C" w:sz="8"/>
             </w:tcBorders>
             <w:shd w:fill="F4F7FD" w:color="auto" w:val="clear"/>
             <w:tcMar>
@@ -4078,12 +4078,12 @@
         </w:trPr>
         <w:tc>
           <w:tcPr>
-            <w:tcW w:type="dxa" w:w="800"/>
-            <w:tcBorders>
-              <w:top w:val="single" w:color="B9C6E8" w:sz="4"/>
-              <w:left w:val="single" w:color="2E9E6B" w:sz="24"/>
-              <w:bottom w:val="single" w:color="B9C6E8" w:sz="4"/>
-              <w:right w:val="single" w:color="B9C6E8" w:sz="4"/>
+            <w:tcW w:type="dxa" w:w="700"/>
+            <w:tcBorders>
+              <w:top w:val="single" w:color="5B6B8C" w:sz="8"/>
+              <w:left w:val="single" w:color="2E9E6B" w:sz="36"/>
+              <w:bottom w:val="single" w:color="5B6B8C" w:sz="8"/>
+              <w:right w:val="single" w:color="5B6B8C" w:sz="8"/>
             </w:tcBorders>
             <w:shd w:fill="FFFFFF" w:color="auto" w:val="clear"/>
             <w:tcMar>
@@ -4113,12 +4113,12 @@
         </w:tc>
         <w:tc>
           <w:tcPr>
-            <w:tcW w:type="dxa" w:w="1650"/>
-            <w:tcBorders>
-              <w:top w:val="single" w:color="FFFFFF" w:sz="12"/>
-              <w:left w:val="single" w:color="FFFFFF" w:sz="12"/>
-              <w:bottom w:val="single" w:color="FFFFFF" w:sz="12"/>
-              <w:right w:val="single" w:color="FFFFFF" w:sz="12"/>
+            <w:tcW w:type="dxa" w:w="1400"/>
+            <w:tcBorders>
+              <w:top w:val="single" w:color="5B6B8C" w:sz="8"/>
+              <w:left w:val="single" w:color="5B6B8C" w:sz="8"/>
+              <w:bottom w:val="single" w:color="5B6B8C" w:sz="8"/>
+              <w:right w:val="single" w:color="5B6B8C" w:sz="8"/>
             </w:tcBorders>
             <w:shd w:fill="FFFFFF" w:color="auto" w:val="clear"/>
             <w:tcMar>
@@ -4162,12 +4162,12 @@
         </w:tc>
         <w:tc>
           <w:tcPr>
-            <w:tcW w:type="dxa" w:w="4400"/>
-            <w:tcBorders>
-              <w:top w:val="single" w:color="FFFFFF" w:sz="12"/>
-              <w:left w:val="single" w:color="FFFFFF" w:sz="12"/>
-              <w:bottom w:val="single" w:color="FFFFFF" w:sz="12"/>
-              <w:right w:val="single" w:color="FFFFFF" w:sz="12"/>
+            <w:tcW w:type="dxa" w:w="5900"/>
+            <w:tcBorders>
+              <w:top w:val="single" w:color="5B6B8C" w:sz="8"/>
+              <w:left w:val="single" w:color="5B6B8C" w:sz="8"/>
+              <w:bottom w:val="single" w:color="5B6B8C" w:sz="8"/>
+              <w:right w:val="single" w:color="5B6B8C" w:sz="8"/>
             </w:tcBorders>
             <w:shd w:fill="FFFFFF" w:color="auto" w:val="clear"/>
             <w:tcMar>
@@ -4205,18 +4205,18 @@
                 <w:sz w:val="16"/>
                 <w:szCs w:val="16"/>
               </w:rPr>
-              <w:t xml:space="preserve">Ich kann zwei Reformen und zwei Gründe für den Fall nennen und ein Urteil angeleitet schreiben.</w:t>
-            </w:r>
-          </w:p>
-        </w:tc>
-        <w:tc>
-          <w:tcPr>
-            <w:tcW w:type="dxa" w:w="2850"/>
-            <w:tcBorders>
-              <w:top w:val="single" w:color="FFFFFF" w:sz="12"/>
-              <w:left w:val="single" w:color="FFFFFF" w:sz="12"/>
-              <w:bottom w:val="single" w:color="FFFFFF" w:sz="12"/>
-              <w:right w:val="single" w:color="FFFFFF" w:sz="12"/>
+              <w:t xml:space="preserve">Ich kann zwei Reformen Napoleons nennen. Ich kann zwei Gründe für sein Ende erklären. Ich kann mit Hilfen ein Urteil zu „Erbe der Revolution oder Verrat?“ schreiben.</w:t>
+            </w:r>
+          </w:p>
+        </w:tc>
+        <w:tc>
+          <w:tcPr>
+            <w:tcW w:type="dxa" w:w="2400"/>
+            <w:tcBorders>
+              <w:top w:val="single" w:color="5B6B8C" w:sz="8"/>
+              <w:left w:val="single" w:color="5B6B8C" w:sz="8"/>
+              <w:bottom w:val="single" w:color="5B6B8C" w:sz="8"/>
+              <w:right w:val="single" w:color="5B6B8C" w:sz="8"/>
             </w:tcBorders>
             <w:shd w:fill="FFFFFF" w:color="auto" w:val="clear"/>
             <w:tcMar>
@@ -4244,12 +4244,12 @@
         </w:tc>
         <w:tc>
           <w:tcPr>
-            <w:tcW w:type="dxa" w:w="3100"/>
-            <w:tcBorders>
-              <w:top w:val="single" w:color="FFFFFF" w:sz="12"/>
-              <w:left w:val="single" w:color="FFFFFF" w:sz="12"/>
-              <w:bottom w:val="single" w:color="FFFFFF" w:sz="12"/>
-              <w:right w:val="single" w:color="FFFFFF" w:sz="12"/>
+            <w:tcW w:type="dxa" w:w="2800"/>
+            <w:tcBorders>
+              <w:top w:val="single" w:color="5B6B8C" w:sz="8"/>
+              <w:left w:val="single" w:color="5B6B8C" w:sz="8"/>
+              <w:bottom w:val="single" w:color="5B6B8C" w:sz="8"/>
+              <w:right w:val="single" w:color="5B6B8C" w:sz="8"/>
             </w:tcBorders>
             <w:shd w:fill="FFFFFF" w:color="auto" w:val="clear"/>
             <w:tcMar>
@@ -4277,12 +4277,12 @@
         </w:tc>
         <w:tc>
           <w:tcPr>
-            <w:tcW w:type="dxa" w:w="2638"/>
-            <w:tcBorders>
-              <w:top w:val="single" w:color="FFFFFF" w:sz="12"/>
-              <w:left w:val="single" w:color="FFFFFF" w:sz="12"/>
-              <w:bottom w:val="single" w:color="FFFFFF" w:sz="12"/>
-              <w:right w:val="single" w:color="FFFFFF" w:sz="12"/>
+            <w:tcW w:type="dxa" w:w="2238"/>
+            <w:tcBorders>
+              <w:top w:val="single" w:color="5B6B8C" w:sz="8"/>
+              <w:left w:val="single" w:color="5B6B8C" w:sz="8"/>
+              <w:bottom w:val="single" w:color="5B6B8C" w:sz="8"/>
+              <w:right w:val="single" w:color="5B6B8C" w:sz="8"/>
             </w:tcBorders>
             <w:shd w:fill="FFFFFF" w:color="auto" w:val="clear"/>
             <w:tcMar>
@@ -4315,12 +4315,12 @@
         </w:trPr>
         <w:tc>
           <w:tcPr>
-            <w:tcW w:type="dxa" w:w="800"/>
-            <w:tcBorders>
-              <w:top w:val="single" w:color="B9C6E8" w:sz="4"/>
-              <w:left w:val="single" w:color="D9534F" w:sz="24"/>
-              <w:bottom w:val="single" w:color="B9C6E8" w:sz="4"/>
-              <w:right w:val="single" w:color="B9C6E8" w:sz="4"/>
+            <w:tcW w:type="dxa" w:w="700"/>
+            <w:tcBorders>
+              <w:top w:val="single" w:color="5B6B8C" w:sz="8"/>
+              <w:left w:val="single" w:color="D9534F" w:sz="36"/>
+              <w:bottom w:val="single" w:color="5B6B8C" w:sz="8"/>
+              <w:right w:val="single" w:color="5B6B8C" w:sz="8"/>
             </w:tcBorders>
             <w:shd w:fill="FCEFEE" w:color="auto" w:val="clear"/>
             <w:tcMar>
@@ -4350,12 +4350,12 @@
         </w:tc>
         <w:tc>
           <w:tcPr>
-            <w:tcW w:type="dxa" w:w="1650"/>
-            <w:tcBorders>
-              <w:top w:val="single" w:color="FFFFFF" w:sz="12"/>
-              <w:left w:val="single" w:color="FFFFFF" w:sz="12"/>
-              <w:bottom w:val="single" w:color="FFFFFF" w:sz="12"/>
-              <w:right w:val="single" w:color="FFFFFF" w:sz="12"/>
+            <w:tcW w:type="dxa" w:w="1400"/>
+            <w:tcBorders>
+              <w:top w:val="single" w:color="5B6B8C" w:sz="8"/>
+              <w:left w:val="single" w:color="5B6B8C" w:sz="8"/>
+              <w:bottom w:val="single" w:color="5B6B8C" w:sz="8"/>
+              <w:right w:val="single" w:color="5B6B8C" w:sz="8"/>
             </w:tcBorders>
             <w:shd w:fill="FCEFEE" w:color="auto" w:val="clear"/>
             <w:tcMar>
@@ -4399,12 +4399,12 @@
         </w:tc>
         <w:tc>
           <w:tcPr>
-            <w:tcW w:type="dxa" w:w="4400"/>
-            <w:tcBorders>
-              <w:top w:val="single" w:color="FFFFFF" w:sz="12"/>
-              <w:left w:val="single" w:color="FFFFFF" w:sz="12"/>
-              <w:bottom w:val="single" w:color="FFFFFF" w:sz="12"/>
-              <w:right w:val="single" w:color="FFFFFF" w:sz="12"/>
+            <w:tcW w:type="dxa" w:w="5900"/>
+            <w:tcBorders>
+              <w:top w:val="single" w:color="5B6B8C" w:sz="8"/>
+              <w:left w:val="single" w:color="5B6B8C" w:sz="8"/>
+              <w:bottom w:val="single" w:color="5B6B8C" w:sz="8"/>
+              <w:right w:val="single" w:color="5B6B8C" w:sz="8"/>
             </w:tcBorders>
             <w:shd w:fill="FCEFEE" w:color="auto" w:val="clear"/>
             <w:tcMar>
@@ -4442,18 +4442,18 @@
                 <w:sz w:val="16"/>
                 <w:szCs w:val="16"/>
               </w:rPr>
-              <w:t xml:space="preserve">Ich kann Ereignisse von 1792 bis 1815 erklären und ein begründetes Urteil schreiben.</w:t>
-            </w:r>
-          </w:p>
-        </w:tc>
-        <w:tc>
-          <w:tcPr>
-            <w:tcW w:type="dxa" w:w="2850"/>
-            <w:tcBorders>
-              <w:top w:val="single" w:color="FFFFFF" w:sz="12"/>
-              <w:left w:val="single" w:color="FFFFFF" w:sz="12"/>
-              <w:bottom w:val="single" w:color="FFFFFF" w:sz="12"/>
-              <w:right w:val="single" w:color="FFFFFF" w:sz="12"/>
+              <w:t xml:space="preserve">Ich kann die Ereignisse von 1792 bis 1815 erklären. Ich kann ein begründetes Urteil schreiben.</w:t>
+            </w:r>
+          </w:p>
+        </w:tc>
+        <w:tc>
+          <w:tcPr>
+            <w:tcW w:type="dxa" w:w="2400"/>
+            <w:tcBorders>
+              <w:top w:val="single" w:color="5B6B8C" w:sz="8"/>
+              <w:left w:val="single" w:color="5B6B8C" w:sz="8"/>
+              <w:bottom w:val="single" w:color="5B6B8C" w:sz="8"/>
+              <w:right w:val="single" w:color="5B6B8C" w:sz="8"/>
             </w:tcBorders>
             <w:shd w:fill="FCEFEE" w:color="auto" w:val="clear"/>
             <w:tcMar>
@@ -4481,12 +4481,12 @@
         </w:tc>
         <w:tc>
           <w:tcPr>
-            <w:tcW w:type="dxa" w:w="3100"/>
-            <w:tcBorders>
-              <w:top w:val="single" w:color="FFFFFF" w:sz="12"/>
-              <w:left w:val="single" w:color="FFFFFF" w:sz="12"/>
-              <w:bottom w:val="single" w:color="FFFFFF" w:sz="12"/>
-              <w:right w:val="single" w:color="FFFFFF" w:sz="12"/>
+            <w:tcW w:type="dxa" w:w="2800"/>
+            <w:tcBorders>
+              <w:top w:val="single" w:color="5B6B8C" w:sz="8"/>
+              <w:left w:val="single" w:color="5B6B8C" w:sz="8"/>
+              <w:bottom w:val="single" w:color="5B6B8C" w:sz="8"/>
+              <w:right w:val="single" w:color="5B6B8C" w:sz="8"/>
             </w:tcBorders>
             <w:shd w:fill="FCEFEE" w:color="auto" w:val="clear"/>
             <w:tcMar>
@@ -4514,12 +4514,12 @@
         </w:tc>
         <w:tc>
           <w:tcPr>
-            <w:tcW w:type="dxa" w:w="2638"/>
-            <w:tcBorders>
-              <w:top w:val="single" w:color="FFFFFF" w:sz="12"/>
-              <w:left w:val="single" w:color="FFFFFF" w:sz="12"/>
-              <w:bottom w:val="single" w:color="FFFFFF" w:sz="12"/>
-              <w:right w:val="single" w:color="FFFFFF" w:sz="12"/>
+            <w:tcW w:type="dxa" w:w="2238"/>
+            <w:tcBorders>
+              <w:top w:val="single" w:color="5B6B8C" w:sz="8"/>
+              <w:left w:val="single" w:color="5B6B8C" w:sz="8"/>
+              <w:bottom w:val="single" w:color="5B6B8C" w:sz="8"/>
+              <w:right w:val="single" w:color="5B6B8C" w:sz="8"/>
             </w:tcBorders>
             <w:shd w:fill="FCEFEE" w:color="auto" w:val="clear"/>
             <w:tcMar>
@@ -4552,12 +4552,12 @@
         </w:trPr>
         <w:tc>
           <w:tcPr>
-            <w:tcW w:type="dxa" w:w="800"/>
-            <w:tcBorders>
-              <w:top w:val="single" w:color="B9C6E8" w:sz="4"/>
-              <w:left w:val="single" w:color="2E9E6B" w:sz="24"/>
-              <w:bottom w:val="single" w:color="B9C6E8" w:sz="4"/>
-              <w:right w:val="single" w:color="B9C6E8" w:sz="4"/>
+            <w:tcW w:type="dxa" w:w="700"/>
+            <w:tcBorders>
+              <w:top w:val="single" w:color="5B6B8C" w:sz="8"/>
+              <w:left w:val="single" w:color="2E9E6B" w:sz="36"/>
+              <w:bottom w:val="single" w:color="5B6B8C" w:sz="8"/>
+              <w:right w:val="single" w:color="5B6B8C" w:sz="8"/>
             </w:tcBorders>
             <w:shd w:fill="FFFFFF" w:color="auto" w:val="clear"/>
             <w:tcMar>
@@ -4587,12 +4587,12 @@
         </w:tc>
         <w:tc>
           <w:tcPr>
-            <w:tcW w:type="dxa" w:w="1650"/>
-            <w:tcBorders>
-              <w:top w:val="single" w:color="FFFFFF" w:sz="12"/>
-              <w:left w:val="single" w:color="FFFFFF" w:sz="12"/>
-              <w:bottom w:val="single" w:color="FFFFFF" w:sz="12"/>
-              <w:right w:val="single" w:color="FFFFFF" w:sz="12"/>
+            <w:tcW w:type="dxa" w:w="1400"/>
+            <w:tcBorders>
+              <w:top w:val="single" w:color="5B6B8C" w:sz="8"/>
+              <w:left w:val="single" w:color="5B6B8C" w:sz="8"/>
+              <w:bottom w:val="single" w:color="5B6B8C" w:sz="8"/>
+              <w:right w:val="single" w:color="5B6B8C" w:sz="8"/>
             </w:tcBorders>
             <w:shd w:fill="FFFFFF" w:color="auto" w:val="clear"/>
             <w:tcMar>
@@ -4636,12 +4636,12 @@
         </w:tc>
         <w:tc>
           <w:tcPr>
-            <w:tcW w:type="dxa" w:w="4400"/>
-            <w:tcBorders>
-              <w:top w:val="single" w:color="FFFFFF" w:sz="12"/>
-              <w:left w:val="single" w:color="FFFFFF" w:sz="12"/>
-              <w:bottom w:val="single" w:color="FFFFFF" w:sz="12"/>
-              <w:right w:val="single" w:color="FFFFFF" w:sz="12"/>
+            <w:tcW w:type="dxa" w:w="5900"/>
+            <w:tcBorders>
+              <w:top w:val="single" w:color="5B6B8C" w:sz="8"/>
+              <w:left w:val="single" w:color="5B6B8C" w:sz="8"/>
+              <w:bottom w:val="single" w:color="5B6B8C" w:sz="8"/>
+              <w:right w:val="single" w:color="5B6B8C" w:sz="8"/>
             </w:tcBorders>
             <w:shd w:fill="FFFFFF" w:color="auto" w:val="clear"/>
             <w:tcMar>
@@ -4679,18 +4679,18 @@
                 <w:sz w:val="16"/>
                 <w:szCs w:val="16"/>
               </w:rPr>
-              <w:t xml:space="preserve">Ich kann ein begründetes Urteil zu „War die Revolution ein Erfolg?“ schreiben und mit meiner Eingangsseite vergleichen.</w:t>
-            </w:r>
-          </w:p>
-        </w:tc>
-        <w:tc>
-          <w:tcPr>
-            <w:tcW w:type="dxa" w:w="2850"/>
-            <w:tcBorders>
-              <w:top w:val="single" w:color="FFFFFF" w:sz="12"/>
-              <w:left w:val="single" w:color="FFFFFF" w:sz="12"/>
-              <w:bottom w:val="single" w:color="FFFFFF" w:sz="12"/>
-              <w:right w:val="single" w:color="FFFFFF" w:sz="12"/>
+              <w:t xml:space="preserve">Ich kann ein begründetes Urteil zu „War die Revolution ein Erfolg?“ schreiben. Ich kann es mit meiner Eingangsseite aus Stunde 2 vergleichen.</w:t>
+            </w:r>
+          </w:p>
+        </w:tc>
+        <w:tc>
+          <w:tcPr>
+            <w:tcW w:type="dxa" w:w="2400"/>
+            <w:tcBorders>
+              <w:top w:val="single" w:color="5B6B8C" w:sz="8"/>
+              <w:left w:val="single" w:color="5B6B8C" w:sz="8"/>
+              <w:bottom w:val="single" w:color="5B6B8C" w:sz="8"/>
+              <w:right w:val="single" w:color="5B6B8C" w:sz="8"/>
             </w:tcBorders>
             <w:shd w:fill="FFFFFF" w:color="auto" w:val="clear"/>
             <w:tcMar>
@@ -4718,12 +4718,12 @@
         </w:tc>
         <w:tc>
           <w:tcPr>
-            <w:tcW w:type="dxa" w:w="3100"/>
-            <w:tcBorders>
-              <w:top w:val="single" w:color="FFFFFF" w:sz="12"/>
-              <w:left w:val="single" w:color="FFFFFF" w:sz="12"/>
-              <w:bottom w:val="single" w:color="FFFFFF" w:sz="12"/>
-              <w:right w:val="single" w:color="FFFFFF" w:sz="12"/>
+            <w:tcW w:type="dxa" w:w="2800"/>
+            <w:tcBorders>
+              <w:top w:val="single" w:color="5B6B8C" w:sz="8"/>
+              <w:left w:val="single" w:color="5B6B8C" w:sz="8"/>
+              <w:bottom w:val="single" w:color="5B6B8C" w:sz="8"/>
+              <w:right w:val="single" w:color="5B6B8C" w:sz="8"/>
             </w:tcBorders>
             <w:shd w:fill="FFFFFF" w:color="auto" w:val="clear"/>
             <w:tcMar>
@@ -4751,12 +4751,12 @@
         </w:tc>
         <w:tc>
           <w:tcPr>
-            <w:tcW w:type="dxa" w:w="2638"/>
-            <w:tcBorders>
-              <w:top w:val="single" w:color="FFFFFF" w:sz="12"/>
-              <w:left w:val="single" w:color="FFFFFF" w:sz="12"/>
-              <w:bottom w:val="single" w:color="FFFFFF" w:sz="12"/>
-              <w:right w:val="single" w:color="FFFFFF" w:sz="12"/>
+            <w:tcW w:type="dxa" w:w="2238"/>
+            <w:tcBorders>
+              <w:top w:val="single" w:color="5B6B8C" w:sz="8"/>
+              <w:left w:val="single" w:color="5B6B8C" w:sz="8"/>
+              <w:bottom w:val="single" w:color="5B6B8C" w:sz="8"/>
+              <w:right w:val="single" w:color="5B6B8C" w:sz="8"/>
             </w:tcBorders>
             <w:shd w:fill="FFFFFF" w:color="auto" w:val="clear"/>
             <w:tcMar>
@@ -4841,10 +4841,10 @@
           <w:tcPr>
             <w:tcW w:type="dxa" w:w="3000"/>
             <w:tcBorders>
-              <w:top w:val="single" w:color="FFFFFF" w:sz="12"/>
-              <w:left w:val="single" w:color="FFFFFF" w:sz="12"/>
-              <w:bottom w:val="single" w:color="FFFFFF" w:sz="12"/>
-              <w:right w:val="single" w:color="FFFFFF" w:sz="12"/>
+              <w:top w:val="single" w:color="1E2761" w:sz="8"/>
+              <w:left w:val="single" w:color="1E2761" w:sz="8"/>
+              <w:bottom w:val="single" w:color="1E2761" w:sz="8"/>
+              <w:right w:val="single" w:color="1E2761" w:sz="8"/>
             </w:tcBorders>
             <w:shd w:fill="1E2761" w:color="auto" w:val="clear"/>
             <w:tcMar>
@@ -4876,10 +4876,10 @@
           <w:tcPr>
             <w:tcW w:type="dxa" w:w="1130"/>
             <w:tcBorders>
-              <w:top w:val="single" w:color="FFFFFF" w:sz="12"/>
-              <w:left w:val="single" w:color="FFFFFF" w:sz="12"/>
-              <w:bottom w:val="single" w:color="FFFFFF" w:sz="12"/>
-              <w:right w:val="single" w:color="FFFFFF" w:sz="12"/>
+              <w:top w:val="single" w:color="FFFFFF" w:sz="8"/>
+              <w:left w:val="single" w:color="FFFFFF" w:sz="8"/>
+              <w:bottom w:val="single" w:color="FFFFFF" w:sz="8"/>
+              <w:right w:val="single" w:color="FFFFFF" w:sz="8"/>
             </w:tcBorders>
             <w:shd w:fill="1E2761" w:color="auto" w:val="clear"/>
             <w:tcMar>
@@ -4912,10 +4912,10 @@
           <w:tcPr>
             <w:tcW w:type="dxa" w:w="1130"/>
             <w:tcBorders>
-              <w:top w:val="single" w:color="FFFFFF" w:sz="12"/>
-              <w:left w:val="single" w:color="FFFFFF" w:sz="12"/>
-              <w:bottom w:val="single" w:color="FFFFFF" w:sz="12"/>
-              <w:right w:val="single" w:color="FFFFFF" w:sz="12"/>
+              <w:top w:val="single" w:color="FFFFFF" w:sz="8"/>
+              <w:left w:val="single" w:color="FFFFFF" w:sz="8"/>
+              <w:bottom w:val="single" w:color="FFFFFF" w:sz="8"/>
+              <w:right w:val="single" w:color="FFFFFF" w:sz="8"/>
             </w:tcBorders>
             <w:shd w:fill="1E2761" w:color="auto" w:val="clear"/>
             <w:tcMar>
@@ -4948,10 +4948,10 @@
           <w:tcPr>
             <w:tcW w:type="dxa" w:w="1130"/>
             <w:tcBorders>
-              <w:top w:val="single" w:color="FFFFFF" w:sz="12"/>
-              <w:left w:val="single" w:color="FFFFFF" w:sz="12"/>
-              <w:bottom w:val="single" w:color="FFFFFF" w:sz="12"/>
-              <w:right w:val="single" w:color="FFFFFF" w:sz="12"/>
+              <w:top w:val="single" w:color="FFFFFF" w:sz="8"/>
+              <w:left w:val="single" w:color="FFFFFF" w:sz="8"/>
+              <w:bottom w:val="single" w:color="FFFFFF" w:sz="8"/>
+              <w:right w:val="single" w:color="FFFFFF" w:sz="8"/>
             </w:tcBorders>
             <w:shd w:fill="1E2761" w:color="auto" w:val="clear"/>
             <w:tcMar>
@@ -4984,10 +4984,10 @@
           <w:tcPr>
             <w:tcW w:type="dxa" w:w="1130"/>
             <w:tcBorders>
-              <w:top w:val="single" w:color="FFFFFF" w:sz="12"/>
-              <w:left w:val="single" w:color="FFFFFF" w:sz="12"/>
-              <w:bottom w:val="single" w:color="FFFFFF" w:sz="12"/>
-              <w:right w:val="single" w:color="FFFFFF" w:sz="12"/>
+              <w:top w:val="single" w:color="FFFFFF" w:sz="8"/>
+              <w:left w:val="single" w:color="FFFFFF" w:sz="8"/>
+              <w:bottom w:val="single" w:color="FFFFFF" w:sz="8"/>
+              <w:right w:val="single" w:color="FFFFFF" w:sz="8"/>
             </w:tcBorders>
             <w:shd w:fill="1E2761" w:color="auto" w:val="clear"/>
             <w:tcMar>
@@ -5020,10 +5020,10 @@
           <w:tcPr>
             <w:tcW w:type="dxa" w:w="1130"/>
             <w:tcBorders>
-              <w:top w:val="single" w:color="FFFFFF" w:sz="12"/>
-              <w:left w:val="single" w:color="FFFFFF" w:sz="12"/>
-              <w:bottom w:val="single" w:color="FFFFFF" w:sz="12"/>
-              <w:right w:val="single" w:color="FFFFFF" w:sz="12"/>
+              <w:top w:val="single" w:color="FFFFFF" w:sz="8"/>
+              <w:left w:val="single" w:color="FFFFFF" w:sz="8"/>
+              <w:bottom w:val="single" w:color="FFFFFF" w:sz="8"/>
+              <w:right w:val="single" w:color="FFFFFF" w:sz="8"/>
             </w:tcBorders>
             <w:shd w:fill="D9534F" w:color="auto" w:val="clear"/>
             <w:tcMar>
@@ -5056,10 +5056,10 @@
           <w:tcPr>
             <w:tcW w:type="dxa" w:w="1130"/>
             <w:tcBorders>
-              <w:top w:val="single" w:color="FFFFFF" w:sz="12"/>
-              <w:left w:val="single" w:color="FFFFFF" w:sz="12"/>
-              <w:bottom w:val="single" w:color="FFFFFF" w:sz="12"/>
-              <w:right w:val="single" w:color="FFFFFF" w:sz="12"/>
+              <w:top w:val="single" w:color="FFFFFF" w:sz="8"/>
+              <w:left w:val="single" w:color="FFFFFF" w:sz="8"/>
+              <w:bottom w:val="single" w:color="FFFFFF" w:sz="8"/>
+              <w:right w:val="single" w:color="FFFFFF" w:sz="8"/>
             </w:tcBorders>
             <w:shd w:fill="1E2761" w:color="auto" w:val="clear"/>
             <w:tcMar>
@@ -5092,10 +5092,10 @@
           <w:tcPr>
             <w:tcW w:type="dxa" w:w="1130"/>
             <w:tcBorders>
-              <w:top w:val="single" w:color="FFFFFF" w:sz="12"/>
-              <w:left w:val="single" w:color="FFFFFF" w:sz="12"/>
-              <w:bottom w:val="single" w:color="FFFFFF" w:sz="12"/>
-              <w:right w:val="single" w:color="FFFFFF" w:sz="12"/>
+              <w:top w:val="single" w:color="FFFFFF" w:sz="8"/>
+              <w:left w:val="single" w:color="FFFFFF" w:sz="8"/>
+              <w:bottom w:val="single" w:color="FFFFFF" w:sz="8"/>
+              <w:right w:val="single" w:color="FFFFFF" w:sz="8"/>
             </w:tcBorders>
             <w:shd w:fill="1E2761" w:color="auto" w:val="clear"/>
             <w:tcMar>
@@ -5128,10 +5128,10 @@
           <w:tcPr>
             <w:tcW w:type="dxa" w:w="1130"/>
             <w:tcBorders>
-              <w:top w:val="single" w:color="FFFFFF" w:sz="12"/>
-              <w:left w:val="single" w:color="FFFFFF" w:sz="12"/>
-              <w:bottom w:val="single" w:color="FFFFFF" w:sz="12"/>
-              <w:right w:val="single" w:color="FFFFFF" w:sz="12"/>
+              <w:top w:val="single" w:color="FFFFFF" w:sz="8"/>
+              <w:left w:val="single" w:color="FFFFFF" w:sz="8"/>
+              <w:bottom w:val="single" w:color="FFFFFF" w:sz="8"/>
+              <w:right w:val="single" w:color="FFFFFF" w:sz="8"/>
             </w:tcBorders>
             <w:shd w:fill="1E2761" w:color="auto" w:val="clear"/>
             <w:tcMar>
@@ -5164,10 +5164,10 @@
           <w:tcPr>
             <w:tcW w:type="dxa" w:w="1130"/>
             <w:tcBorders>
-              <w:top w:val="single" w:color="FFFFFF" w:sz="12"/>
-              <w:left w:val="single" w:color="FFFFFF" w:sz="12"/>
-              <w:bottom w:val="single" w:color="FFFFFF" w:sz="12"/>
-              <w:right w:val="single" w:color="FFFFFF" w:sz="12"/>
+              <w:top w:val="single" w:color="FFFFFF" w:sz="8"/>
+              <w:left w:val="single" w:color="FFFFFF" w:sz="8"/>
+              <w:bottom w:val="single" w:color="FFFFFF" w:sz="8"/>
+              <w:right w:val="single" w:color="FFFFFF" w:sz="8"/>
             </w:tcBorders>
             <w:shd w:fill="1E2761" w:color="auto" w:val="clear"/>
             <w:tcMar>
@@ -5200,10 +5200,10 @@
           <w:tcPr>
             <w:tcW w:type="dxa" w:w="1130"/>
             <w:tcBorders>
-              <w:top w:val="single" w:color="FFFFFF" w:sz="12"/>
-              <w:left w:val="single" w:color="FFFFFF" w:sz="12"/>
-              <w:bottom w:val="single" w:color="FFFFFF" w:sz="12"/>
-              <w:right w:val="single" w:color="FFFFFF" w:sz="12"/>
+              <w:top w:val="single" w:color="FFFFFF" w:sz="8"/>
+              <w:left w:val="single" w:color="FFFFFF" w:sz="8"/>
+              <w:bottom w:val="single" w:color="FFFFFF" w:sz="8"/>
+              <w:right w:val="single" w:color="FFFFFF" w:sz="8"/>
             </w:tcBorders>
             <w:shd w:fill="D9534F" w:color="auto" w:val="clear"/>
             <w:tcMar>
@@ -5236,10 +5236,10 @@
           <w:tcPr>
             <w:tcW w:type="dxa" w:w="1138"/>
             <w:tcBorders>
-              <w:top w:val="single" w:color="FFFFFF" w:sz="12"/>
-              <w:left w:val="single" w:color="FFFFFF" w:sz="12"/>
-              <w:bottom w:val="single" w:color="FFFFFF" w:sz="12"/>
-              <w:right w:val="single" w:color="FFFFFF" w:sz="12"/>
+              <w:top w:val="single" w:color="FFFFFF" w:sz="8"/>
+              <w:left w:val="single" w:color="FFFFFF" w:sz="8"/>
+              <w:bottom w:val="single" w:color="FFFFFF" w:sz="8"/>
+              <w:right w:val="single" w:color="FFFFFF" w:sz="8"/>
             </w:tcBorders>
             <w:shd w:fill="1E2761" w:color="auto" w:val="clear"/>
             <w:tcMar>
@@ -5278,10 +5278,10 @@
           <w:tcPr>
             <w:tcW w:type="dxa" w:w="3000"/>
             <w:tcBorders>
-              <w:top w:val="single" w:color="FFFFFF" w:sz="12"/>
-              <w:left w:val="single" w:color="FFFFFF" w:sz="12"/>
-              <w:bottom w:val="single" w:color="FFFFFF" w:sz="12"/>
-              <w:right w:val="single" w:color="FFFFFF" w:sz="12"/>
+              <w:top w:val="single" w:color="5B6B8C" w:sz="8"/>
+              <w:left w:val="single" w:color="5B6B8C" w:sz="8"/>
+              <w:bottom w:val="single" w:color="5B6B8C" w:sz="8"/>
+              <w:right w:val="single" w:color="5B6B8C" w:sz="8"/>
             </w:tcBorders>
             <w:shd w:fill="F4F7FD" w:color="auto" w:val="clear"/>
             <w:tcMar>
@@ -5313,10 +5313,10 @@
           <w:tcPr>
             <w:tcW w:type="dxa" w:w="1130"/>
             <w:tcBorders>
-              <w:top w:val="single" w:color="FFFFFF" w:sz="12"/>
-              <w:left w:val="single" w:color="FFFFFF" w:sz="12"/>
-              <w:bottom w:val="single" w:color="FFFFFF" w:sz="12"/>
-              <w:right w:val="single" w:color="FFFFFF" w:sz="12"/>
+              <w:top w:val="single" w:color="5B6B8C" w:sz="8"/>
+              <w:left w:val="single" w:color="5B6B8C" w:sz="8"/>
+              <w:bottom w:val="single" w:color="5B6B8C" w:sz="8"/>
+              <w:right w:val="single" w:color="5B6B8C" w:sz="8"/>
             </w:tcBorders>
             <w:shd w:fill="CADCFC" w:color="auto" w:val="clear"/>
             <w:tcMar>
@@ -5349,10 +5349,10 @@
           <w:tcPr>
             <w:tcW w:type="dxa" w:w="1130"/>
             <w:tcBorders>
-              <w:top w:val="single" w:color="FFFFFF" w:sz="12"/>
-              <w:left w:val="single" w:color="FFFFFF" w:sz="12"/>
-              <w:bottom w:val="single" w:color="FFFFFF" w:sz="12"/>
-              <w:right w:val="single" w:color="FFFFFF" w:sz="12"/>
+              <w:top w:val="single" w:color="5B6B8C" w:sz="8"/>
+              <w:left w:val="single" w:color="5B6B8C" w:sz="8"/>
+              <w:bottom w:val="single" w:color="5B6B8C" w:sz="8"/>
+              <w:right w:val="single" w:color="5B6B8C" w:sz="8"/>
             </w:tcBorders>
             <w:shd w:fill="F4F7FD" w:color="auto" w:val="clear"/>
             <w:tcMar>
@@ -5382,10 +5382,10 @@
           <w:tcPr>
             <w:tcW w:type="dxa" w:w="1130"/>
             <w:tcBorders>
-              <w:top w:val="single" w:color="FFFFFF" w:sz="12"/>
-              <w:left w:val="single" w:color="FFFFFF" w:sz="12"/>
-              <w:bottom w:val="single" w:color="FFFFFF" w:sz="12"/>
-              <w:right w:val="single" w:color="FFFFFF" w:sz="12"/>
+              <w:top w:val="single" w:color="5B6B8C" w:sz="8"/>
+              <w:left w:val="single" w:color="5B6B8C" w:sz="8"/>
+              <w:bottom w:val="single" w:color="5B6B8C" w:sz="8"/>
+              <w:right w:val="single" w:color="5B6B8C" w:sz="8"/>
             </w:tcBorders>
             <w:shd w:fill="F4F7FD" w:color="auto" w:val="clear"/>
             <w:tcMar>
@@ -5415,10 +5415,10 @@
           <w:tcPr>
             <w:tcW w:type="dxa" w:w="1130"/>
             <w:tcBorders>
-              <w:top w:val="single" w:color="FFFFFF" w:sz="12"/>
-              <w:left w:val="single" w:color="FFFFFF" w:sz="12"/>
-              <w:bottom w:val="single" w:color="FFFFFF" w:sz="12"/>
-              <w:right w:val="single" w:color="FFFFFF" w:sz="12"/>
+              <w:top w:val="single" w:color="5B6B8C" w:sz="8"/>
+              <w:left w:val="single" w:color="5B6B8C" w:sz="8"/>
+              <w:bottom w:val="single" w:color="5B6B8C" w:sz="8"/>
+              <w:right w:val="single" w:color="5B6B8C" w:sz="8"/>
             </w:tcBorders>
             <w:shd w:fill="F4F7FD" w:color="auto" w:val="clear"/>
             <w:tcMar>
@@ -5448,10 +5448,10 @@
           <w:tcPr>
             <w:tcW w:type="dxa" w:w="1130"/>
             <w:tcBorders>
-              <w:top w:val="single" w:color="FFFFFF" w:sz="12"/>
-              <w:left w:val="single" w:color="FFFFFF" w:sz="12"/>
-              <w:bottom w:val="single" w:color="FFFFFF" w:sz="12"/>
-              <w:right w:val="single" w:color="FFFFFF" w:sz="12"/>
+              <w:top w:val="single" w:color="5B6B8C" w:sz="8"/>
+              <w:left w:val="single" w:color="5B6B8C" w:sz="8"/>
+              <w:bottom w:val="single" w:color="5B6B8C" w:sz="8"/>
+              <w:right w:val="single" w:color="5B6B8C" w:sz="8"/>
             </w:tcBorders>
             <w:shd w:fill="FCEFEE" w:color="auto" w:val="clear"/>
             <w:tcMar>
@@ -5481,10 +5481,10 @@
           <w:tcPr>
             <w:tcW w:type="dxa" w:w="1130"/>
             <w:tcBorders>
-              <w:top w:val="single" w:color="FFFFFF" w:sz="12"/>
-              <w:left w:val="single" w:color="FFFFFF" w:sz="12"/>
-              <w:bottom w:val="single" w:color="FFFFFF" w:sz="12"/>
-              <w:right w:val="single" w:color="FFFFFF" w:sz="12"/>
+              <w:top w:val="single" w:color="5B6B8C" w:sz="8"/>
+              <w:left w:val="single" w:color="5B6B8C" w:sz="8"/>
+              <w:bottom w:val="single" w:color="5B6B8C" w:sz="8"/>
+              <w:right w:val="single" w:color="5B6B8C" w:sz="8"/>
             </w:tcBorders>
             <w:shd w:fill="CADCFC" w:color="auto" w:val="clear"/>
             <w:tcMar>
@@ -5517,10 +5517,10 @@
           <w:tcPr>
             <w:tcW w:type="dxa" w:w="1130"/>
             <w:tcBorders>
-              <w:top w:val="single" w:color="FFFFFF" w:sz="12"/>
-              <w:left w:val="single" w:color="FFFFFF" w:sz="12"/>
-              <w:bottom w:val="single" w:color="FFFFFF" w:sz="12"/>
-              <w:right w:val="single" w:color="FFFFFF" w:sz="12"/>
+              <w:top w:val="single" w:color="5B6B8C" w:sz="8"/>
+              <w:left w:val="single" w:color="5B6B8C" w:sz="8"/>
+              <w:bottom w:val="single" w:color="5B6B8C" w:sz="8"/>
+              <w:right w:val="single" w:color="5B6B8C" w:sz="8"/>
             </w:tcBorders>
             <w:shd w:fill="F4F7FD" w:color="auto" w:val="clear"/>
             <w:tcMar>
@@ -5550,10 +5550,10 @@
           <w:tcPr>
             <w:tcW w:type="dxa" w:w="1130"/>
             <w:tcBorders>
-              <w:top w:val="single" w:color="FFFFFF" w:sz="12"/>
-              <w:left w:val="single" w:color="FFFFFF" w:sz="12"/>
-              <w:bottom w:val="single" w:color="FFFFFF" w:sz="12"/>
-              <w:right w:val="single" w:color="FFFFFF" w:sz="12"/>
+              <w:top w:val="single" w:color="5B6B8C" w:sz="8"/>
+              <w:left w:val="single" w:color="5B6B8C" w:sz="8"/>
+              <w:bottom w:val="single" w:color="5B6B8C" w:sz="8"/>
+              <w:right w:val="single" w:color="5B6B8C" w:sz="8"/>
             </w:tcBorders>
             <w:shd w:fill="1E2761" w:color="auto" w:val="clear"/>
             <w:tcMar>
@@ -5586,10 +5586,10 @@
           <w:tcPr>
             <w:tcW w:type="dxa" w:w="1130"/>
             <w:tcBorders>
-              <w:top w:val="single" w:color="FFFFFF" w:sz="12"/>
-              <w:left w:val="single" w:color="FFFFFF" w:sz="12"/>
-              <w:bottom w:val="single" w:color="FFFFFF" w:sz="12"/>
-              <w:right w:val="single" w:color="FFFFFF" w:sz="12"/>
+              <w:top w:val="single" w:color="5B6B8C" w:sz="8"/>
+              <w:left w:val="single" w:color="5B6B8C" w:sz="8"/>
+              <w:bottom w:val="single" w:color="5B6B8C" w:sz="8"/>
+              <w:right w:val="single" w:color="5B6B8C" w:sz="8"/>
             </w:tcBorders>
             <w:shd w:fill="F4F7FD" w:color="auto" w:val="clear"/>
             <w:tcMar>
@@ -5619,10 +5619,10 @@
           <w:tcPr>
             <w:tcW w:type="dxa" w:w="1130"/>
             <w:tcBorders>
-              <w:top w:val="single" w:color="FFFFFF" w:sz="12"/>
-              <w:left w:val="single" w:color="FFFFFF" w:sz="12"/>
-              <w:bottom w:val="single" w:color="FFFFFF" w:sz="12"/>
-              <w:right w:val="single" w:color="FFFFFF" w:sz="12"/>
+              <w:top w:val="single" w:color="5B6B8C" w:sz="8"/>
+              <w:left w:val="single" w:color="5B6B8C" w:sz="8"/>
+              <w:bottom w:val="single" w:color="5B6B8C" w:sz="8"/>
+              <w:right w:val="single" w:color="5B6B8C" w:sz="8"/>
             </w:tcBorders>
             <w:shd w:fill="1E2761" w:color="auto" w:val="clear"/>
             <w:tcMar>
@@ -5655,10 +5655,10 @@
           <w:tcPr>
             <w:tcW w:type="dxa" w:w="1138"/>
             <w:tcBorders>
-              <w:top w:val="single" w:color="FFFFFF" w:sz="12"/>
-              <w:left w:val="single" w:color="FFFFFF" w:sz="12"/>
-              <w:bottom w:val="single" w:color="FFFFFF" w:sz="12"/>
-              <w:right w:val="single" w:color="FFFFFF" w:sz="12"/>
+              <w:top w:val="single" w:color="5B6B8C" w:sz="8"/>
+              <w:left w:val="single" w:color="5B6B8C" w:sz="8"/>
+              <w:bottom w:val="single" w:color="5B6B8C" w:sz="8"/>
+              <w:right w:val="single" w:color="5B6B8C" w:sz="8"/>
             </w:tcBorders>
             <w:shd w:fill="F4F7FD" w:color="auto" w:val="clear"/>
             <w:tcMar>
@@ -5694,10 +5694,10 @@
           <w:tcPr>
             <w:tcW w:type="dxa" w:w="3000"/>
             <w:tcBorders>
-              <w:top w:val="single" w:color="FFFFFF" w:sz="12"/>
-              <w:left w:val="single" w:color="FFFFFF" w:sz="12"/>
-              <w:bottom w:val="single" w:color="FFFFFF" w:sz="12"/>
-              <w:right w:val="single" w:color="FFFFFF" w:sz="12"/>
+              <w:top w:val="single" w:color="5B6B8C" w:sz="8"/>
+              <w:left w:val="single" w:color="5B6B8C" w:sz="8"/>
+              <w:bottom w:val="single" w:color="5B6B8C" w:sz="8"/>
+              <w:right w:val="single" w:color="5B6B8C" w:sz="8"/>
             </w:tcBorders>
             <w:shd w:fill="FFFFFF" w:color="auto" w:val="clear"/>
             <w:tcMar>
@@ -5729,10 +5729,10 @@
           <w:tcPr>
             <w:tcW w:type="dxa" w:w="1130"/>
             <w:tcBorders>
-              <w:top w:val="single" w:color="FFFFFF" w:sz="12"/>
-              <w:left w:val="single" w:color="FFFFFF" w:sz="12"/>
-              <w:bottom w:val="single" w:color="FFFFFF" w:sz="12"/>
-              <w:right w:val="single" w:color="FFFFFF" w:sz="12"/>
+              <w:top w:val="single" w:color="5B6B8C" w:sz="8"/>
+              <w:left w:val="single" w:color="5B6B8C" w:sz="8"/>
+              <w:bottom w:val="single" w:color="5B6B8C" w:sz="8"/>
+              <w:right w:val="single" w:color="5B6B8C" w:sz="8"/>
             </w:tcBorders>
             <w:shd w:fill="FFFFFF" w:color="auto" w:val="clear"/>
             <w:tcMar>
@@ -5762,10 +5762,10 @@
           <w:tcPr>
             <w:tcW w:type="dxa" w:w="1130"/>
             <w:tcBorders>
-              <w:top w:val="single" w:color="FFFFFF" w:sz="12"/>
-              <w:left w:val="single" w:color="FFFFFF" w:sz="12"/>
-              <w:bottom w:val="single" w:color="FFFFFF" w:sz="12"/>
-              <w:right w:val="single" w:color="FFFFFF" w:sz="12"/>
+              <w:top w:val="single" w:color="5B6B8C" w:sz="8"/>
+              <w:left w:val="single" w:color="5B6B8C" w:sz="8"/>
+              <w:bottom w:val="single" w:color="5B6B8C" w:sz="8"/>
+              <w:right w:val="single" w:color="5B6B8C" w:sz="8"/>
             </w:tcBorders>
             <w:shd w:fill="E8A33D" w:color="auto" w:val="clear"/>
             <w:tcMar>
@@ -5798,10 +5798,10 @@
           <w:tcPr>
             <w:tcW w:type="dxa" w:w="1130"/>
             <w:tcBorders>
-              <w:top w:val="single" w:color="FFFFFF" w:sz="12"/>
-              <w:left w:val="single" w:color="FFFFFF" w:sz="12"/>
-              <w:bottom w:val="single" w:color="FFFFFF" w:sz="12"/>
-              <w:right w:val="single" w:color="FFFFFF" w:sz="12"/>
+              <w:top w:val="single" w:color="5B6B8C" w:sz="8"/>
+              <w:left w:val="single" w:color="5B6B8C" w:sz="8"/>
+              <w:bottom w:val="single" w:color="5B6B8C" w:sz="8"/>
+              <w:right w:val="single" w:color="5B6B8C" w:sz="8"/>
             </w:tcBorders>
             <w:shd w:fill="FFFFFF" w:color="auto" w:val="clear"/>
             <w:tcMar>
@@ -5831,10 +5831,10 @@
           <w:tcPr>
             <w:tcW w:type="dxa" w:w="1130"/>
             <w:tcBorders>
-              <w:top w:val="single" w:color="FFFFFF" w:sz="12"/>
-              <w:left w:val="single" w:color="FFFFFF" w:sz="12"/>
-              <w:bottom w:val="single" w:color="FFFFFF" w:sz="12"/>
-              <w:right w:val="single" w:color="FFFFFF" w:sz="12"/>
+              <w:top w:val="single" w:color="5B6B8C" w:sz="8"/>
+              <w:left w:val="single" w:color="5B6B8C" w:sz="8"/>
+              <w:bottom w:val="single" w:color="5B6B8C" w:sz="8"/>
+              <w:right w:val="single" w:color="5B6B8C" w:sz="8"/>
             </w:tcBorders>
             <w:shd w:fill="FFFFFF" w:color="auto" w:val="clear"/>
             <w:tcMar>
@@ -5864,10 +5864,10 @@
           <w:tcPr>
             <w:tcW w:type="dxa" w:w="1130"/>
             <w:tcBorders>
-              <w:top w:val="single" w:color="FFFFFF" w:sz="12"/>
-              <w:left w:val="single" w:color="FFFFFF" w:sz="12"/>
-              <w:bottom w:val="single" w:color="FFFFFF" w:sz="12"/>
-              <w:right w:val="single" w:color="FFFFFF" w:sz="12"/>
+              <w:top w:val="single" w:color="5B6B8C" w:sz="8"/>
+              <w:left w:val="single" w:color="5B6B8C" w:sz="8"/>
+              <w:bottom w:val="single" w:color="5B6B8C" w:sz="8"/>
+              <w:right w:val="single" w:color="5B6B8C" w:sz="8"/>
             </w:tcBorders>
             <w:shd w:fill="1E2761" w:color="auto" w:val="clear"/>
             <w:tcMar>
@@ -5900,10 +5900,10 @@
           <w:tcPr>
             <w:tcW w:type="dxa" w:w="1130"/>
             <w:tcBorders>
-              <w:top w:val="single" w:color="FFFFFF" w:sz="12"/>
-              <w:left w:val="single" w:color="FFFFFF" w:sz="12"/>
-              <w:bottom w:val="single" w:color="FFFFFF" w:sz="12"/>
-              <w:right w:val="single" w:color="FFFFFF" w:sz="12"/>
+              <w:top w:val="single" w:color="5B6B8C" w:sz="8"/>
+              <w:left w:val="single" w:color="5B6B8C" w:sz="8"/>
+              <w:bottom w:val="single" w:color="5B6B8C" w:sz="8"/>
+              <w:right w:val="single" w:color="5B6B8C" w:sz="8"/>
             </w:tcBorders>
             <w:shd w:fill="FFFFFF" w:color="auto" w:val="clear"/>
             <w:tcMar>
@@ -5933,10 +5933,10 @@
           <w:tcPr>
             <w:tcW w:type="dxa" w:w="1130"/>
             <w:tcBorders>
-              <w:top w:val="single" w:color="FFFFFF" w:sz="12"/>
-              <w:left w:val="single" w:color="FFFFFF" w:sz="12"/>
-              <w:bottom w:val="single" w:color="FFFFFF" w:sz="12"/>
-              <w:right w:val="single" w:color="FFFFFF" w:sz="12"/>
+              <w:top w:val="single" w:color="5B6B8C" w:sz="8"/>
+              <w:left w:val="single" w:color="5B6B8C" w:sz="8"/>
+              <w:bottom w:val="single" w:color="5B6B8C" w:sz="8"/>
+              <w:right w:val="single" w:color="5B6B8C" w:sz="8"/>
             </w:tcBorders>
             <w:shd w:fill="FFFFFF" w:color="auto" w:val="clear"/>
             <w:tcMar>
@@ -5966,10 +5966,10 @@
           <w:tcPr>
             <w:tcW w:type="dxa" w:w="1130"/>
             <w:tcBorders>
-              <w:top w:val="single" w:color="FFFFFF" w:sz="12"/>
-              <w:left w:val="single" w:color="FFFFFF" w:sz="12"/>
-              <w:bottom w:val="single" w:color="FFFFFF" w:sz="12"/>
-              <w:right w:val="single" w:color="FFFFFF" w:sz="12"/>
+              <w:top w:val="single" w:color="5B6B8C" w:sz="8"/>
+              <w:left w:val="single" w:color="5B6B8C" w:sz="8"/>
+              <w:bottom w:val="single" w:color="5B6B8C" w:sz="8"/>
+              <w:right w:val="single" w:color="5B6B8C" w:sz="8"/>
             </w:tcBorders>
             <w:shd w:fill="FFFFFF" w:color="auto" w:val="clear"/>
             <w:tcMar>
@@ -5999,10 +5999,10 @@
           <w:tcPr>
             <w:tcW w:type="dxa" w:w="1130"/>
             <w:tcBorders>
-              <w:top w:val="single" w:color="FFFFFF" w:sz="12"/>
-              <w:left w:val="single" w:color="FFFFFF" w:sz="12"/>
-              <w:bottom w:val="single" w:color="FFFFFF" w:sz="12"/>
-              <w:right w:val="single" w:color="FFFFFF" w:sz="12"/>
+              <w:top w:val="single" w:color="5B6B8C" w:sz="8"/>
+              <w:left w:val="single" w:color="5B6B8C" w:sz="8"/>
+              <w:bottom w:val="single" w:color="5B6B8C" w:sz="8"/>
+              <w:right w:val="single" w:color="5B6B8C" w:sz="8"/>
             </w:tcBorders>
             <w:shd w:fill="FFFFFF" w:color="auto" w:val="clear"/>
             <w:tcMar>
@@ -6032,10 +6032,10 @@
           <w:tcPr>
             <w:tcW w:type="dxa" w:w="1130"/>
             <w:tcBorders>
-              <w:top w:val="single" w:color="FFFFFF" w:sz="12"/>
-              <w:left w:val="single" w:color="FFFFFF" w:sz="12"/>
-              <w:bottom w:val="single" w:color="FFFFFF" w:sz="12"/>
-              <w:right w:val="single" w:color="FFFFFF" w:sz="12"/>
+              <w:top w:val="single" w:color="5B6B8C" w:sz="8"/>
+              <w:left w:val="single" w:color="5B6B8C" w:sz="8"/>
+              <w:bottom w:val="single" w:color="5B6B8C" w:sz="8"/>
+              <w:right w:val="single" w:color="5B6B8C" w:sz="8"/>
             </w:tcBorders>
             <w:shd w:fill="FCEFEE" w:color="auto" w:val="clear"/>
             <w:tcMar>
@@ -6065,10 +6065,10 @@
           <w:tcPr>
             <w:tcW w:type="dxa" w:w="1138"/>
             <w:tcBorders>
-              <w:top w:val="single" w:color="FFFFFF" w:sz="12"/>
-              <w:left w:val="single" w:color="FFFFFF" w:sz="12"/>
-              <w:bottom w:val="single" w:color="FFFFFF" w:sz="12"/>
-              <w:right w:val="single" w:color="FFFFFF" w:sz="12"/>
+              <w:top w:val="single" w:color="5B6B8C" w:sz="8"/>
+              <w:left w:val="single" w:color="5B6B8C" w:sz="8"/>
+              <w:bottom w:val="single" w:color="5B6B8C" w:sz="8"/>
+              <w:right w:val="single" w:color="5B6B8C" w:sz="8"/>
             </w:tcBorders>
             <w:shd w:fill="FFFFFF" w:color="auto" w:val="clear"/>
             <w:tcMar>
@@ -6104,10 +6104,10 @@
           <w:tcPr>
             <w:tcW w:type="dxa" w:w="3000"/>
             <w:tcBorders>
-              <w:top w:val="single" w:color="FFFFFF" w:sz="12"/>
-              <w:left w:val="single" w:color="FFFFFF" w:sz="12"/>
-              <w:bottom w:val="single" w:color="FFFFFF" w:sz="12"/>
-              <w:right w:val="single" w:color="FFFFFF" w:sz="12"/>
+              <w:top w:val="single" w:color="5B6B8C" w:sz="8"/>
+              <w:left w:val="single" w:color="5B6B8C" w:sz="8"/>
+              <w:bottom w:val="single" w:color="5B6B8C" w:sz="8"/>
+              <w:right w:val="single" w:color="5B6B8C" w:sz="8"/>
             </w:tcBorders>
             <w:shd w:fill="F4F7FD" w:color="auto" w:val="clear"/>
             <w:tcMar>
@@ -6139,10 +6139,10 @@
           <w:tcPr>
             <w:tcW w:type="dxa" w:w="1130"/>
             <w:tcBorders>
-              <w:top w:val="single" w:color="FFFFFF" w:sz="12"/>
-              <w:left w:val="single" w:color="FFFFFF" w:sz="12"/>
-              <w:bottom w:val="single" w:color="FFFFFF" w:sz="12"/>
-              <w:right w:val="single" w:color="FFFFFF" w:sz="12"/>
+              <w:top w:val="single" w:color="5B6B8C" w:sz="8"/>
+              <w:left w:val="single" w:color="5B6B8C" w:sz="8"/>
+              <w:bottom w:val="single" w:color="5B6B8C" w:sz="8"/>
+              <w:right w:val="single" w:color="5B6B8C" w:sz="8"/>
             </w:tcBorders>
             <w:shd w:fill="F4F7FD" w:color="auto" w:val="clear"/>
             <w:tcMar>
@@ -6172,10 +6172,10 @@
           <w:tcPr>
             <w:tcW w:type="dxa" w:w="1130"/>
             <w:tcBorders>
-              <w:top w:val="single" w:color="FFFFFF" w:sz="12"/>
-              <w:left w:val="single" w:color="FFFFFF" w:sz="12"/>
-              <w:bottom w:val="single" w:color="FFFFFF" w:sz="12"/>
-              <w:right w:val="single" w:color="FFFFFF" w:sz="12"/>
+              <w:top w:val="single" w:color="5B6B8C" w:sz="8"/>
+              <w:left w:val="single" w:color="5B6B8C" w:sz="8"/>
+              <w:bottom w:val="single" w:color="5B6B8C" w:sz="8"/>
+              <w:right w:val="single" w:color="5B6B8C" w:sz="8"/>
             </w:tcBorders>
             <w:shd w:fill="F4F7FD" w:color="auto" w:val="clear"/>
             <w:tcMar>
@@ -6205,10 +6205,10 @@
           <w:tcPr>
             <w:tcW w:type="dxa" w:w="1130"/>
             <w:tcBorders>
-              <w:top w:val="single" w:color="FFFFFF" w:sz="12"/>
-              <w:left w:val="single" w:color="FFFFFF" w:sz="12"/>
-              <w:bottom w:val="single" w:color="FFFFFF" w:sz="12"/>
-              <w:right w:val="single" w:color="FFFFFF" w:sz="12"/>
+              <w:top w:val="single" w:color="5B6B8C" w:sz="8"/>
+              <w:left w:val="single" w:color="5B6B8C" w:sz="8"/>
+              <w:bottom w:val="single" w:color="5B6B8C" w:sz="8"/>
+              <w:right w:val="single" w:color="5B6B8C" w:sz="8"/>
             </w:tcBorders>
             <w:shd w:fill="CADCFC" w:color="auto" w:val="clear"/>
             <w:tcMar>
@@ -6241,10 +6241,10 @@
           <w:tcPr>
             <w:tcW w:type="dxa" w:w="1130"/>
             <w:tcBorders>
-              <w:top w:val="single" w:color="FFFFFF" w:sz="12"/>
-              <w:left w:val="single" w:color="FFFFFF" w:sz="12"/>
-              <w:bottom w:val="single" w:color="FFFFFF" w:sz="12"/>
-              <w:right w:val="single" w:color="FFFFFF" w:sz="12"/>
+              <w:top w:val="single" w:color="5B6B8C" w:sz="8"/>
+              <w:left w:val="single" w:color="5B6B8C" w:sz="8"/>
+              <w:bottom w:val="single" w:color="5B6B8C" w:sz="8"/>
+              <w:right w:val="single" w:color="5B6B8C" w:sz="8"/>
             </w:tcBorders>
             <w:shd w:fill="F4F7FD" w:color="auto" w:val="clear"/>
             <w:tcMar>
@@ -6274,10 +6274,10 @@
           <w:tcPr>
             <w:tcW w:type="dxa" w:w="1130"/>
             <w:tcBorders>
-              <w:top w:val="single" w:color="FFFFFF" w:sz="12"/>
-              <w:left w:val="single" w:color="FFFFFF" w:sz="12"/>
-              <w:bottom w:val="single" w:color="FFFFFF" w:sz="12"/>
-              <w:right w:val="single" w:color="FFFFFF" w:sz="12"/>
+              <w:top w:val="single" w:color="5B6B8C" w:sz="8"/>
+              <w:left w:val="single" w:color="5B6B8C" w:sz="8"/>
+              <w:bottom w:val="single" w:color="5B6B8C" w:sz="8"/>
+              <w:right w:val="single" w:color="5B6B8C" w:sz="8"/>
             </w:tcBorders>
             <w:shd w:fill="FCEFEE" w:color="auto" w:val="clear"/>
             <w:tcMar>
@@ -6307,10 +6307,10 @@
           <w:tcPr>
             <w:tcW w:type="dxa" w:w="1130"/>
             <w:tcBorders>
-              <w:top w:val="single" w:color="FFFFFF" w:sz="12"/>
-              <w:left w:val="single" w:color="FFFFFF" w:sz="12"/>
-              <w:bottom w:val="single" w:color="FFFFFF" w:sz="12"/>
-              <w:right w:val="single" w:color="FFFFFF" w:sz="12"/>
+              <w:top w:val="single" w:color="5B6B8C" w:sz="8"/>
+              <w:left w:val="single" w:color="5B6B8C" w:sz="8"/>
+              <w:bottom w:val="single" w:color="5B6B8C" w:sz="8"/>
+              <w:right w:val="single" w:color="5B6B8C" w:sz="8"/>
             </w:tcBorders>
             <w:shd w:fill="F4F7FD" w:color="auto" w:val="clear"/>
             <w:tcMar>
@@ -6340,10 +6340,10 @@
           <w:tcPr>
             <w:tcW w:type="dxa" w:w="1130"/>
             <w:tcBorders>
-              <w:top w:val="single" w:color="FFFFFF" w:sz="12"/>
-              <w:left w:val="single" w:color="FFFFFF" w:sz="12"/>
-              <w:bottom w:val="single" w:color="FFFFFF" w:sz="12"/>
-              <w:right w:val="single" w:color="FFFFFF" w:sz="12"/>
+              <w:top w:val="single" w:color="5B6B8C" w:sz="8"/>
+              <w:left w:val="single" w:color="5B6B8C" w:sz="8"/>
+              <w:bottom w:val="single" w:color="5B6B8C" w:sz="8"/>
+              <w:right w:val="single" w:color="5B6B8C" w:sz="8"/>
             </w:tcBorders>
             <w:shd w:fill="F4F7FD" w:color="auto" w:val="clear"/>
             <w:tcMar>
@@ -6373,10 +6373,10 @@
           <w:tcPr>
             <w:tcW w:type="dxa" w:w="1130"/>
             <w:tcBorders>
-              <w:top w:val="single" w:color="FFFFFF" w:sz="12"/>
-              <w:left w:val="single" w:color="FFFFFF" w:sz="12"/>
-              <w:bottom w:val="single" w:color="FFFFFF" w:sz="12"/>
-              <w:right w:val="single" w:color="FFFFFF" w:sz="12"/>
+              <w:top w:val="single" w:color="5B6B8C" w:sz="8"/>
+              <w:left w:val="single" w:color="5B6B8C" w:sz="8"/>
+              <w:bottom w:val="single" w:color="5B6B8C" w:sz="8"/>
+              <w:right w:val="single" w:color="5B6B8C" w:sz="8"/>
             </w:tcBorders>
             <w:shd w:fill="F4F7FD" w:color="auto" w:val="clear"/>
             <w:tcMar>
@@ -6406,10 +6406,10 @@
           <w:tcPr>
             <w:tcW w:type="dxa" w:w="1130"/>
             <w:tcBorders>
-              <w:top w:val="single" w:color="FFFFFF" w:sz="12"/>
-              <w:left w:val="single" w:color="FFFFFF" w:sz="12"/>
-              <w:bottom w:val="single" w:color="FFFFFF" w:sz="12"/>
-              <w:right w:val="single" w:color="FFFFFF" w:sz="12"/>
+              <w:top w:val="single" w:color="5B6B8C" w:sz="8"/>
+              <w:left w:val="single" w:color="5B6B8C" w:sz="8"/>
+              <w:bottom w:val="single" w:color="5B6B8C" w:sz="8"/>
+              <w:right w:val="single" w:color="5B6B8C" w:sz="8"/>
             </w:tcBorders>
             <w:shd w:fill="F4F7FD" w:color="auto" w:val="clear"/>
             <w:tcMar>
@@ -6439,10 +6439,10 @@
           <w:tcPr>
             <w:tcW w:type="dxa" w:w="1130"/>
             <w:tcBorders>
-              <w:top w:val="single" w:color="FFFFFF" w:sz="12"/>
-              <w:left w:val="single" w:color="FFFFFF" w:sz="12"/>
-              <w:bottom w:val="single" w:color="FFFFFF" w:sz="12"/>
-              <w:right w:val="single" w:color="FFFFFF" w:sz="12"/>
+              <w:top w:val="single" w:color="5B6B8C" w:sz="8"/>
+              <w:left w:val="single" w:color="5B6B8C" w:sz="8"/>
+              <w:bottom w:val="single" w:color="5B6B8C" w:sz="8"/>
+              <w:right w:val="single" w:color="5B6B8C" w:sz="8"/>
             </w:tcBorders>
             <w:shd w:fill="FCEFEE" w:color="auto" w:val="clear"/>
             <w:tcMar>
@@ -6472,10 +6472,10 @@
           <w:tcPr>
             <w:tcW w:type="dxa" w:w="1138"/>
             <w:tcBorders>
-              <w:top w:val="single" w:color="FFFFFF" w:sz="12"/>
-              <w:left w:val="single" w:color="FFFFFF" w:sz="12"/>
-              <w:bottom w:val="single" w:color="FFFFFF" w:sz="12"/>
-              <w:right w:val="single" w:color="FFFFFF" w:sz="12"/>
+              <w:top w:val="single" w:color="5B6B8C" w:sz="8"/>
+              <w:left w:val="single" w:color="5B6B8C" w:sz="8"/>
+              <w:bottom w:val="single" w:color="5B6B8C" w:sz="8"/>
+              <w:right w:val="single" w:color="5B6B8C" w:sz="8"/>
             </w:tcBorders>
             <w:shd w:fill="F4F7FD" w:color="auto" w:val="clear"/>
             <w:tcMar>
@@ -6511,10 +6511,10 @@
           <w:tcPr>
             <w:tcW w:type="dxa" w:w="3000"/>
             <w:tcBorders>
-              <w:top w:val="single" w:color="FFFFFF" w:sz="12"/>
-              <w:left w:val="single" w:color="FFFFFF" w:sz="12"/>
-              <w:bottom w:val="single" w:color="FFFFFF" w:sz="12"/>
-              <w:right w:val="single" w:color="FFFFFF" w:sz="12"/>
+              <w:top w:val="single" w:color="5B6B8C" w:sz="8"/>
+              <w:left w:val="single" w:color="5B6B8C" w:sz="8"/>
+              <w:bottom w:val="single" w:color="5B6B8C" w:sz="8"/>
+              <w:right w:val="single" w:color="5B6B8C" w:sz="8"/>
             </w:tcBorders>
             <w:shd w:fill="FFFFFF" w:color="auto" w:val="clear"/>
             <w:tcMar>
@@ -6546,10 +6546,10 @@
           <w:tcPr>
             <w:tcW w:type="dxa" w:w="1130"/>
             <w:tcBorders>
-              <w:top w:val="single" w:color="FFFFFF" w:sz="12"/>
-              <w:left w:val="single" w:color="FFFFFF" w:sz="12"/>
-              <w:bottom w:val="single" w:color="FFFFFF" w:sz="12"/>
-              <w:right w:val="single" w:color="FFFFFF" w:sz="12"/>
+              <w:top w:val="single" w:color="5B6B8C" w:sz="8"/>
+              <w:left w:val="single" w:color="5B6B8C" w:sz="8"/>
+              <w:bottom w:val="single" w:color="5B6B8C" w:sz="8"/>
+              <w:right w:val="single" w:color="5B6B8C" w:sz="8"/>
             </w:tcBorders>
             <w:shd w:fill="FFFFFF" w:color="auto" w:val="clear"/>
             <w:tcMar>
@@ -6579,10 +6579,10 @@
           <w:tcPr>
             <w:tcW w:type="dxa" w:w="1130"/>
             <w:tcBorders>
-              <w:top w:val="single" w:color="FFFFFF" w:sz="12"/>
-              <w:left w:val="single" w:color="FFFFFF" w:sz="12"/>
-              <w:bottom w:val="single" w:color="FFFFFF" w:sz="12"/>
-              <w:right w:val="single" w:color="FFFFFF" w:sz="12"/>
+              <w:top w:val="single" w:color="5B6B8C" w:sz="8"/>
+              <w:left w:val="single" w:color="5B6B8C" w:sz="8"/>
+              <w:bottom w:val="single" w:color="5B6B8C" w:sz="8"/>
+              <w:right w:val="single" w:color="5B6B8C" w:sz="8"/>
             </w:tcBorders>
             <w:shd w:fill="FFFFFF" w:color="auto" w:val="clear"/>
             <w:tcMar>
@@ -6612,10 +6612,10 @@
           <w:tcPr>
             <w:tcW w:type="dxa" w:w="1130"/>
             <w:tcBorders>
-              <w:top w:val="single" w:color="FFFFFF" w:sz="12"/>
-              <w:left w:val="single" w:color="FFFFFF" w:sz="12"/>
-              <w:bottom w:val="single" w:color="FFFFFF" w:sz="12"/>
-              <w:right w:val="single" w:color="FFFFFF" w:sz="12"/>
+              <w:top w:val="single" w:color="5B6B8C" w:sz="8"/>
+              <w:left w:val="single" w:color="5B6B8C" w:sz="8"/>
+              <w:bottom w:val="single" w:color="5B6B8C" w:sz="8"/>
+              <w:right w:val="single" w:color="5B6B8C" w:sz="8"/>
             </w:tcBorders>
             <w:shd w:fill="FFFFFF" w:color="auto" w:val="clear"/>
             <w:tcMar>
@@ -6645,10 +6645,10 @@
           <w:tcPr>
             <w:tcW w:type="dxa" w:w="1130"/>
             <w:tcBorders>
-              <w:top w:val="single" w:color="FFFFFF" w:sz="12"/>
-              <w:left w:val="single" w:color="FFFFFF" w:sz="12"/>
-              <w:bottom w:val="single" w:color="FFFFFF" w:sz="12"/>
-              <w:right w:val="single" w:color="FFFFFF" w:sz="12"/>
+              <w:top w:val="single" w:color="5B6B8C" w:sz="8"/>
+              <w:left w:val="single" w:color="5B6B8C" w:sz="8"/>
+              <w:bottom w:val="single" w:color="5B6B8C" w:sz="8"/>
+              <w:right w:val="single" w:color="5B6B8C" w:sz="8"/>
             </w:tcBorders>
             <w:shd w:fill="E8A33D" w:color="auto" w:val="clear"/>
             <w:tcMar>
@@ -6681,10 +6681,10 @@
           <w:tcPr>
             <w:tcW w:type="dxa" w:w="1130"/>
             <w:tcBorders>
-              <w:top w:val="single" w:color="FFFFFF" w:sz="12"/>
-              <w:left w:val="single" w:color="FFFFFF" w:sz="12"/>
-              <w:bottom w:val="single" w:color="FFFFFF" w:sz="12"/>
-              <w:right w:val="single" w:color="FFFFFF" w:sz="12"/>
+              <w:top w:val="single" w:color="5B6B8C" w:sz="8"/>
+              <w:left w:val="single" w:color="5B6B8C" w:sz="8"/>
+              <w:bottom w:val="single" w:color="5B6B8C" w:sz="8"/>
+              <w:right w:val="single" w:color="5B6B8C" w:sz="8"/>
             </w:tcBorders>
             <w:shd w:fill="FCEFEE" w:color="auto" w:val="clear"/>
             <w:tcMar>
@@ -6714,10 +6714,10 @@
           <w:tcPr>
             <w:tcW w:type="dxa" w:w="1130"/>
             <w:tcBorders>
-              <w:top w:val="single" w:color="FFFFFF" w:sz="12"/>
-              <w:left w:val="single" w:color="FFFFFF" w:sz="12"/>
-              <w:bottom w:val="single" w:color="FFFFFF" w:sz="12"/>
-              <w:right w:val="single" w:color="FFFFFF" w:sz="12"/>
+              <w:top w:val="single" w:color="5B6B8C" w:sz="8"/>
+              <w:left w:val="single" w:color="5B6B8C" w:sz="8"/>
+              <w:bottom w:val="single" w:color="5B6B8C" w:sz="8"/>
+              <w:right w:val="single" w:color="5B6B8C" w:sz="8"/>
             </w:tcBorders>
             <w:shd w:fill="FFFFFF" w:color="auto" w:val="clear"/>
             <w:tcMar>
@@ -6747,10 +6747,10 @@
           <w:tcPr>
             <w:tcW w:type="dxa" w:w="1130"/>
             <w:tcBorders>
-              <w:top w:val="single" w:color="FFFFFF" w:sz="12"/>
-              <w:left w:val="single" w:color="FFFFFF" w:sz="12"/>
-              <w:bottom w:val="single" w:color="FFFFFF" w:sz="12"/>
-              <w:right w:val="single" w:color="FFFFFF" w:sz="12"/>
+              <w:top w:val="single" w:color="5B6B8C" w:sz="8"/>
+              <w:left w:val="single" w:color="5B6B8C" w:sz="8"/>
+              <w:bottom w:val="single" w:color="5B6B8C" w:sz="8"/>
+              <w:right w:val="single" w:color="5B6B8C" w:sz="8"/>
             </w:tcBorders>
             <w:shd w:fill="FFFFFF" w:color="auto" w:val="clear"/>
             <w:tcMar>
@@ -6780,10 +6780,10 @@
           <w:tcPr>
             <w:tcW w:type="dxa" w:w="1130"/>
             <w:tcBorders>
-              <w:top w:val="single" w:color="FFFFFF" w:sz="12"/>
-              <w:left w:val="single" w:color="FFFFFF" w:sz="12"/>
-              <w:bottom w:val="single" w:color="FFFFFF" w:sz="12"/>
-              <w:right w:val="single" w:color="FFFFFF" w:sz="12"/>
+              <w:top w:val="single" w:color="5B6B8C" w:sz="8"/>
+              <w:left w:val="single" w:color="5B6B8C" w:sz="8"/>
+              <w:bottom w:val="single" w:color="5B6B8C" w:sz="8"/>
+              <w:right w:val="single" w:color="5B6B8C" w:sz="8"/>
             </w:tcBorders>
             <w:shd w:fill="FFFFFF" w:color="auto" w:val="clear"/>
             <w:tcMar>
@@ -6813,10 +6813,10 @@
           <w:tcPr>
             <w:tcW w:type="dxa" w:w="1130"/>
             <w:tcBorders>
-              <w:top w:val="single" w:color="FFFFFF" w:sz="12"/>
-              <w:left w:val="single" w:color="FFFFFF" w:sz="12"/>
-              <w:bottom w:val="single" w:color="FFFFFF" w:sz="12"/>
-              <w:right w:val="single" w:color="FFFFFF" w:sz="12"/>
+              <w:top w:val="single" w:color="5B6B8C" w:sz="8"/>
+              <w:left w:val="single" w:color="5B6B8C" w:sz="8"/>
+              <w:bottom w:val="single" w:color="5B6B8C" w:sz="8"/>
+              <w:right w:val="single" w:color="5B6B8C" w:sz="8"/>
             </w:tcBorders>
             <w:shd w:fill="FFFFFF" w:color="auto" w:val="clear"/>
             <w:tcMar>
@@ -6846,10 +6846,10 @@
           <w:tcPr>
             <w:tcW w:type="dxa" w:w="1130"/>
             <w:tcBorders>
-              <w:top w:val="single" w:color="FFFFFF" w:sz="12"/>
-              <w:left w:val="single" w:color="FFFFFF" w:sz="12"/>
-              <w:bottom w:val="single" w:color="FFFFFF" w:sz="12"/>
-              <w:right w:val="single" w:color="FFFFFF" w:sz="12"/>
+              <w:top w:val="single" w:color="5B6B8C" w:sz="8"/>
+              <w:left w:val="single" w:color="5B6B8C" w:sz="8"/>
+              <w:bottom w:val="single" w:color="5B6B8C" w:sz="8"/>
+              <w:right w:val="single" w:color="5B6B8C" w:sz="8"/>
             </w:tcBorders>
             <w:shd w:fill="1E2761" w:color="auto" w:val="clear"/>
             <w:tcMar>
@@ -6882,10 +6882,10 @@
           <w:tcPr>
             <w:tcW w:type="dxa" w:w="1138"/>
             <w:tcBorders>
-              <w:top w:val="single" w:color="FFFFFF" w:sz="12"/>
-              <w:left w:val="single" w:color="FFFFFF" w:sz="12"/>
-              <w:bottom w:val="single" w:color="FFFFFF" w:sz="12"/>
-              <w:right w:val="single" w:color="FFFFFF" w:sz="12"/>
+              <w:top w:val="single" w:color="5B6B8C" w:sz="8"/>
+              <w:left w:val="single" w:color="5B6B8C" w:sz="8"/>
+              <w:bottom w:val="single" w:color="5B6B8C" w:sz="8"/>
+              <w:right w:val="single" w:color="5B6B8C" w:sz="8"/>
             </w:tcBorders>
             <w:shd w:fill="FFFFFF" w:color="auto" w:val="clear"/>
             <w:tcMar>
@@ -6921,10 +6921,10 @@
           <w:tcPr>
             <w:tcW w:type="dxa" w:w="3000"/>
             <w:tcBorders>
-              <w:top w:val="single" w:color="FFFFFF" w:sz="12"/>
-              <w:left w:val="single" w:color="FFFFFF" w:sz="12"/>
-              <w:bottom w:val="single" w:color="FFFFFF" w:sz="12"/>
-              <w:right w:val="single" w:color="FFFFFF" w:sz="12"/>
+              <w:top w:val="single" w:color="5B6B8C" w:sz="8"/>
+              <w:left w:val="single" w:color="5B6B8C" w:sz="8"/>
+              <w:bottom w:val="single" w:color="5B6B8C" w:sz="8"/>
+              <w:right w:val="single" w:color="5B6B8C" w:sz="8"/>
             </w:tcBorders>
             <w:shd w:fill="F4F7FD" w:color="auto" w:val="clear"/>
             <w:tcMar>
@@ -6956,10 +6956,10 @@
           <w:tcPr>
             <w:tcW w:type="dxa" w:w="1130"/>
             <w:tcBorders>
-              <w:top w:val="single" w:color="FFFFFF" w:sz="12"/>
-              <w:left w:val="single" w:color="FFFFFF" w:sz="12"/>
-              <w:bottom w:val="single" w:color="FFFFFF" w:sz="12"/>
-              <w:right w:val="single" w:color="FFFFFF" w:sz="12"/>
+              <w:top w:val="single" w:color="5B6B8C" w:sz="8"/>
+              <w:left w:val="single" w:color="5B6B8C" w:sz="8"/>
+              <w:bottom w:val="single" w:color="5B6B8C" w:sz="8"/>
+              <w:right w:val="single" w:color="5B6B8C" w:sz="8"/>
             </w:tcBorders>
             <w:shd w:fill="CADCFC" w:color="auto" w:val="clear"/>
             <w:tcMar>
@@ -6992,10 +6992,10 @@
           <w:tcPr>
             <w:tcW w:type="dxa" w:w="1130"/>
             <w:tcBorders>
-              <w:top w:val="single" w:color="FFFFFF" w:sz="12"/>
-              <w:left w:val="single" w:color="FFFFFF" w:sz="12"/>
-              <w:bottom w:val="single" w:color="FFFFFF" w:sz="12"/>
-              <w:right w:val="single" w:color="FFFFFF" w:sz="12"/>
+              <w:top w:val="single" w:color="5B6B8C" w:sz="8"/>
+              <w:left w:val="single" w:color="5B6B8C" w:sz="8"/>
+              <w:bottom w:val="single" w:color="5B6B8C" w:sz="8"/>
+              <w:right w:val="single" w:color="5B6B8C" w:sz="8"/>
             </w:tcBorders>
             <w:shd w:fill="F4F7FD" w:color="auto" w:val="clear"/>
             <w:tcMar>
@@ -7025,10 +7025,10 @@
           <w:tcPr>
             <w:tcW w:type="dxa" w:w="1130"/>
             <w:tcBorders>
-              <w:top w:val="single" w:color="FFFFFF" w:sz="12"/>
-              <w:left w:val="single" w:color="FFFFFF" w:sz="12"/>
-              <w:bottom w:val="single" w:color="FFFFFF" w:sz="12"/>
-              <w:right w:val="single" w:color="FFFFFF" w:sz="12"/>
+              <w:top w:val="single" w:color="5B6B8C" w:sz="8"/>
+              <w:left w:val="single" w:color="5B6B8C" w:sz="8"/>
+              <w:bottom w:val="single" w:color="5B6B8C" w:sz="8"/>
+              <w:right w:val="single" w:color="5B6B8C" w:sz="8"/>
             </w:tcBorders>
             <w:shd w:fill="F4F7FD" w:color="auto" w:val="clear"/>
             <w:tcMar>
@@ -7058,10 +7058,10 @@
           <w:tcPr>
             <w:tcW w:type="dxa" w:w="1130"/>
             <w:tcBorders>
-              <w:top w:val="single" w:color="FFFFFF" w:sz="12"/>
-              <w:left w:val="single" w:color="FFFFFF" w:sz="12"/>
-              <w:bottom w:val="single" w:color="FFFFFF" w:sz="12"/>
-              <w:right w:val="single" w:color="FFFFFF" w:sz="12"/>
+              <w:top w:val="single" w:color="5B6B8C" w:sz="8"/>
+              <w:left w:val="single" w:color="5B6B8C" w:sz="8"/>
+              <w:bottom w:val="single" w:color="5B6B8C" w:sz="8"/>
+              <w:right w:val="single" w:color="5B6B8C" w:sz="8"/>
             </w:tcBorders>
             <w:shd w:fill="F4F7FD" w:color="auto" w:val="clear"/>
             <w:tcMar>
@@ -7091,10 +7091,10 @@
           <w:tcPr>
             <w:tcW w:type="dxa" w:w="1130"/>
             <w:tcBorders>
-              <w:top w:val="single" w:color="FFFFFF" w:sz="12"/>
-              <w:left w:val="single" w:color="FFFFFF" w:sz="12"/>
-              <w:bottom w:val="single" w:color="FFFFFF" w:sz="12"/>
-              <w:right w:val="single" w:color="FFFFFF" w:sz="12"/>
+              <w:top w:val="single" w:color="5B6B8C" w:sz="8"/>
+              <w:left w:val="single" w:color="5B6B8C" w:sz="8"/>
+              <w:bottom w:val="single" w:color="5B6B8C" w:sz="8"/>
+              <w:right w:val="single" w:color="5B6B8C" w:sz="8"/>
             </w:tcBorders>
             <w:shd w:fill="FCEFEE" w:color="auto" w:val="clear"/>
             <w:tcMar>
@@ -7124,10 +7124,10 @@
           <w:tcPr>
             <w:tcW w:type="dxa" w:w="1130"/>
             <w:tcBorders>
-              <w:top w:val="single" w:color="FFFFFF" w:sz="12"/>
-              <w:left w:val="single" w:color="FFFFFF" w:sz="12"/>
-              <w:bottom w:val="single" w:color="FFFFFF" w:sz="12"/>
-              <w:right w:val="single" w:color="FFFFFF" w:sz="12"/>
+              <w:top w:val="single" w:color="5B6B8C" w:sz="8"/>
+              <w:left w:val="single" w:color="5B6B8C" w:sz="8"/>
+              <w:bottom w:val="single" w:color="5B6B8C" w:sz="8"/>
+              <w:right w:val="single" w:color="5B6B8C" w:sz="8"/>
             </w:tcBorders>
             <w:shd w:fill="F4F7FD" w:color="auto" w:val="clear"/>
             <w:tcMar>
@@ -7157,10 +7157,10 @@
           <w:tcPr>
             <w:tcW w:type="dxa" w:w="1130"/>
             <w:tcBorders>
-              <w:top w:val="single" w:color="FFFFFF" w:sz="12"/>
-              <w:left w:val="single" w:color="FFFFFF" w:sz="12"/>
-              <w:bottom w:val="single" w:color="FFFFFF" w:sz="12"/>
-              <w:right w:val="single" w:color="FFFFFF" w:sz="12"/>
+              <w:top w:val="single" w:color="5B6B8C" w:sz="8"/>
+              <w:left w:val="single" w:color="5B6B8C" w:sz="8"/>
+              <w:bottom w:val="single" w:color="5B6B8C" w:sz="8"/>
+              <w:right w:val="single" w:color="5B6B8C" w:sz="8"/>
             </w:tcBorders>
             <w:shd w:fill="E8A33D" w:color="auto" w:val="clear"/>
             <w:tcMar>
@@ -7193,10 +7193,10 @@
           <w:tcPr>
             <w:tcW w:type="dxa" w:w="1130"/>
             <w:tcBorders>
-              <w:top w:val="single" w:color="FFFFFF" w:sz="12"/>
-              <w:left w:val="single" w:color="FFFFFF" w:sz="12"/>
-              <w:bottom w:val="single" w:color="FFFFFF" w:sz="12"/>
-              <w:right w:val="single" w:color="FFFFFF" w:sz="12"/>
+              <w:top w:val="single" w:color="5B6B8C" w:sz="8"/>
+              <w:left w:val="single" w:color="5B6B8C" w:sz="8"/>
+              <w:bottom w:val="single" w:color="5B6B8C" w:sz="8"/>
+              <w:right w:val="single" w:color="5B6B8C" w:sz="8"/>
             </w:tcBorders>
             <w:shd w:fill="F4F7FD" w:color="auto" w:val="clear"/>
             <w:tcMar>
@@ -7226,10 +7226,10 @@
           <w:tcPr>
             <w:tcW w:type="dxa" w:w="1130"/>
             <w:tcBorders>
-              <w:top w:val="single" w:color="FFFFFF" w:sz="12"/>
-              <w:left w:val="single" w:color="FFFFFF" w:sz="12"/>
-              <w:bottom w:val="single" w:color="FFFFFF" w:sz="12"/>
-              <w:right w:val="single" w:color="FFFFFF" w:sz="12"/>
+              <w:top w:val="single" w:color="5B6B8C" w:sz="8"/>
+              <w:left w:val="single" w:color="5B6B8C" w:sz="8"/>
+              <w:bottom w:val="single" w:color="5B6B8C" w:sz="8"/>
+              <w:right w:val="single" w:color="5B6B8C" w:sz="8"/>
             </w:tcBorders>
             <w:shd w:fill="CADCFC" w:color="auto" w:val="clear"/>
             <w:tcMar>
@@ -7262,10 +7262,10 @@
           <w:tcPr>
             <w:tcW w:type="dxa" w:w="1130"/>
             <w:tcBorders>
-              <w:top w:val="single" w:color="FFFFFF" w:sz="12"/>
-              <w:left w:val="single" w:color="FFFFFF" w:sz="12"/>
-              <w:bottom w:val="single" w:color="FFFFFF" w:sz="12"/>
-              <w:right w:val="single" w:color="FFFFFF" w:sz="12"/>
+              <w:top w:val="single" w:color="5B6B8C" w:sz="8"/>
+              <w:left w:val="single" w:color="5B6B8C" w:sz="8"/>
+              <w:bottom w:val="single" w:color="5B6B8C" w:sz="8"/>
+              <w:right w:val="single" w:color="5B6B8C" w:sz="8"/>
             </w:tcBorders>
             <w:shd w:fill="1E2761" w:color="auto" w:val="clear"/>
             <w:tcMar>
@@ -7298,10 +7298,10 @@
           <w:tcPr>
             <w:tcW w:type="dxa" w:w="1138"/>
             <w:tcBorders>
-              <w:top w:val="single" w:color="FFFFFF" w:sz="12"/>
-              <w:left w:val="single" w:color="FFFFFF" w:sz="12"/>
-              <w:bottom w:val="single" w:color="FFFFFF" w:sz="12"/>
-              <w:right w:val="single" w:color="FFFFFF" w:sz="12"/>
+              <w:top w:val="single" w:color="5B6B8C" w:sz="8"/>
+              <w:left w:val="single" w:color="5B6B8C" w:sz="8"/>
+              <w:bottom w:val="single" w:color="5B6B8C" w:sz="8"/>
+              <w:right w:val="single" w:color="5B6B8C" w:sz="8"/>
             </w:tcBorders>
             <w:shd w:fill="1E2761" w:color="auto" w:val="clear"/>
             <w:tcMar>

</xml_diff>

<commit_message>
Sequenz: Entscheidungen zu Karikatur, Marsch der Frauen, Varennes
Co-Authored-By: Claude Sonnet 5.5 <noreply@anthropic.com>
Claude-Session: https://claude.ai/code/session_01GXwmzpsaCraifErTDddPwN
</commit_message>
<xml_diff>
--- a/Geschichte_8D/Sequenz_Franzoesische_Revolution_8D.docx
+++ b/Geschichte_8D/Sequenz_Franzoesische_Revolution_8D.docx
@@ -2612,7 +2612,7 @@
                 <w:sz w:val="16"/>
                 <w:szCs w:val="16"/>
               </w:rPr>
-              <w:t xml:space="preserve">Methode direkt (Modell, dann angeleitet); Eingangsdiagnose</w:t>
+              <w:t xml:space="preserve">Methode direkt (Modell, dann angeleitet) an „Für die Mühsal geboren“ (Buch S. 111); Eingangsdiagnose</w:t>
             </w:r>
           </w:p>
         </w:tc>
@@ -3797,7 +3797,7 @@
                 <w:sz w:val="16"/>
                 <w:szCs w:val="16"/>
               </w:rPr>
-              <w:t xml:space="preserve">Urteil direkt (Modell, Satzanfänge in 3 Stufen)</w:t>
+              <w:t xml:space="preserve">Urteil direkt (Modell, Satzanfänge in 3 Stufen); Statistik S. 121; Karikatur-Methode wiederholt (Robespierre als Henker)</w:t>
             </w:r>
           </w:p>
         </w:tc>
@@ -5938,27 +5938,30 @@
               <w:bottom w:val="single" w:color="5B6B8C" w:sz="8"/>
               <w:right w:val="single" w:color="5B6B8C" w:sz="8"/>
             </w:tcBorders>
-            <w:shd w:fill="FFFFFF" w:color="auto" w:val="clear"/>
+            <w:shd w:fill="CADCFC" w:color="auto" w:val="clear"/>
             <w:tcMar>
               <w:top w:type="dxa" w:w="80"/>
               <w:left w:type="dxa" w:w="90"/>
               <w:bottom w:type="dxa" w:w="80"/>
               <w:right w:type="dxa" w:w="90"/>
             </w:tcMar>
-            <w:vAlign w:val="top"/>
-          </w:tcPr>
-          <w:p>
-            <w:pPr>
-              <w:spacing w:after="0" w:before="0"/>
-            </w:pPr>
-            <w:r>
-              <w:rPr>
-                <w:rFonts w:ascii="Calibri" w:cs="Calibri" w:eastAsia="Calibri" w:hAnsi="Calibri"/>
-                <w:color w:val="000000"/>
-                <w:sz w:val="18"/>
-                <w:szCs w:val="18"/>
-              </w:rPr>
-              <w:t xml:space="preserve"> </w:t>
+            <w:vAlign w:val="center"/>
+          </w:tcPr>
+          <w:p>
+            <w:pPr>
+              <w:spacing w:after="0" w:before="0"/>
+              <w:jc w:val="center"/>
+            </w:pPr>
+            <w:r>
+              <w:rPr>
+                <w:rFonts w:ascii="Calibri" w:cs="Calibri" w:eastAsia="Calibri" w:hAnsi="Calibri"/>
+                <w:b/>
+                <w:bCs/>
+                <w:color w:val="000000"/>
+                <w:sz w:val="24"/>
+                <w:szCs w:val="24"/>
+              </w:rPr>
+              <w:t xml:space="preserve">a</w:t>
             </w:r>
           </w:p>
         </w:tc>

</xml_diff>

<commit_message>
Sequenz-Dokument: vierte Seite mit Abschlussfragen, Vorwissen, Methoden-Ideen und Lehrbuchseiten
Co-Authored-By: Claude Sonnet 5.5 <noreply@anthropic.com>
Claude-Session: https://claude.ai/code/session_01GXwmzpsaCraifErTDddPwN
</commit_message>
<xml_diff>
--- a/Geschichte_8D/Sequenz_Franzoesische_Revolution_8D.docx
+++ b/Geschichte_8D/Sequenz_Franzoesische_Revolution_8D.docx
@@ -7799,6 +7799,2225 @@
                 <w:szCs w:val="19"/>
               </w:rPr>
               <w:t xml:space="preserve">Reserve nur bei der 8C (29.01.)</w:t>
+            </w:r>
+          </w:p>
+        </w:tc>
+      </w:tr>
+    </w:tbl>
+    <w:p>
+      <w:r>
+        <w:br w:type="page"/>
+      </w:r>
+    </w:p>
+    <w:p>
+      <w:pPr>
+        <w:keepNext/>
+        <w:spacing w:after="80" w:before="80"/>
+      </w:pPr>
+      <w:r>
+        <w:rPr>
+          <w:rFonts w:ascii="Cambria" w:cs="Cambria" w:eastAsia="Cambria" w:hAnsi="Cambria"/>
+          <w:b/>
+          <w:bCs/>
+          <w:color w:val="1E2761"/>
+          <w:sz w:val="30"/>
+          <w:szCs w:val="30"/>
+        </w:rPr>
+        <w:t xml:space="preserve">Orientierung je Stunde: Abschlussfrage, Vorwissen, Methode, Lehrbuch</w:t>
+      </w:r>
+    </w:p>
+    <w:p>
+      <w:pPr>
+        <w:spacing w:after="60" w:before="0"/>
+      </w:pPr>
+      <w:r>
+        <w:rPr>
+          <w:rFonts w:ascii="Calibri" w:cs="Calibri" w:eastAsia="Calibri" w:hAnsi="Calibri"/>
+          <w:i/>
+          <w:iCs/>
+          <w:color w:val="5B6B8C"/>
+          <w:sz w:val="18"/>
+          <w:szCs w:val="18"/>
+        </w:rPr>
+        <w:t xml:space="preserve">Alles hier ist Orientierung, kein festes Muster. Abschlussfragen müssen den Schülerinnen und Schülern etwas bedeuten (persönliches Risiko, Gerechtigkeit) und mit dem Wissen der Stunde beantwortbar sein. Methoden aus der Sammlung (Geschichte 11) sind Ideen, in Klasse 8 darf es spielerischer sein, in der 8D auf das Lernklima achten.</w:t>
+      </w:r>
+    </w:p>
+    <w:tbl>
+      <w:tblPr>
+        <w:tblW w:type="dxa" w:w="15438"/>
+        <w:tblBorders>
+          <w:top w:val="single" w:color="auto" w:sz="4"/>
+          <w:left w:val="single" w:color="auto" w:sz="4"/>
+          <w:bottom w:val="single" w:color="auto" w:sz="4"/>
+          <w:right w:val="single" w:color="auto" w:sz="4"/>
+          <w:insideH w:val="single" w:color="auto" w:sz="4"/>
+          <w:insideV w:val="single" w:color="auto" w:sz="4"/>
+        </w:tblBorders>
+      </w:tblPr>
+      <w:tblGrid>
+        <w:gridCol w:w="650"/>
+        <w:gridCol w:w="4900"/>
+        <w:gridCol w:w="2750"/>
+        <w:gridCol w:w="3850"/>
+        <w:gridCol w:w="3288"/>
+      </w:tblGrid>
+      <w:tr>
+        <w:trPr>
+          <w:cantSplit/>
+          <w:trHeight w:val="320" w:hRule="atLeast"/>
+        </w:trPr>
+        <w:tc>
+          <w:tcPr>
+            <w:tcW w:type="dxa" w:w="650"/>
+            <w:tcBorders>
+              <w:top w:val="single" w:color="1E2761" w:sz="8"/>
+              <w:left w:val="single" w:color="1E2761" w:sz="8"/>
+              <w:bottom w:val="single" w:color="1E2761" w:sz="8"/>
+              <w:right w:val="single" w:color="1E2761" w:sz="8"/>
+            </w:tcBorders>
+            <w:shd w:fill="1E2761" w:color="auto" w:val="clear"/>
+            <w:tcMar>
+              <w:top w:type="dxa" w:w="55"/>
+              <w:left w:type="dxa" w:w="90"/>
+              <w:bottom w:type="dxa" w:w="55"/>
+              <w:right w:type="dxa" w:w="90"/>
+            </w:tcMar>
+            <w:vAlign w:val="center"/>
+          </w:tcPr>
+          <w:p>
+            <w:pPr>
+              <w:spacing w:after="0" w:before="0"/>
+            </w:pPr>
+            <w:r>
+              <w:rPr>
+                <w:rFonts w:ascii="Calibri" w:cs="Calibri" w:eastAsia="Calibri" w:hAnsi="Calibri"/>
+                <w:b/>
+                <w:bCs/>
+                <w:color w:val="FFFFFF"/>
+                <w:sz w:val="17"/>
+                <w:szCs w:val="17"/>
+              </w:rPr>
+              <w:t xml:space="preserve">Nr.</w:t>
+            </w:r>
+          </w:p>
+        </w:tc>
+        <w:tc>
+          <w:tcPr>
+            <w:tcW w:type="dxa" w:w="4900"/>
+            <w:tcBorders>
+              <w:top w:val="single" w:color="1E2761" w:sz="8"/>
+              <w:left w:val="single" w:color="1E2761" w:sz="8"/>
+              <w:bottom w:val="single" w:color="1E2761" w:sz="8"/>
+              <w:right w:val="single" w:color="1E2761" w:sz="8"/>
+            </w:tcBorders>
+            <w:shd w:fill="1E2761" w:color="auto" w:val="clear"/>
+            <w:tcMar>
+              <w:top w:type="dxa" w:w="55"/>
+              <w:left w:type="dxa" w:w="90"/>
+              <w:bottom w:type="dxa" w:w="55"/>
+              <w:right w:type="dxa" w:w="90"/>
+            </w:tcMar>
+            <w:vAlign w:val="center"/>
+          </w:tcPr>
+          <w:p>
+            <w:pPr>
+              <w:spacing w:after="0" w:before="0"/>
+            </w:pPr>
+            <w:r>
+              <w:rPr>
+                <w:rFonts w:ascii="Calibri" w:cs="Calibri" w:eastAsia="Calibri" w:hAnsi="Calibri"/>
+                <w:b/>
+                <w:bCs/>
+                <w:color w:val="FFFFFF"/>
+                <w:sz w:val="17"/>
+                <w:szCs w:val="17"/>
+              </w:rPr>
+              <w:t xml:space="preserve">Abschlussfrage (Berater: „Du bist Berater von …“)</w:t>
+            </w:r>
+          </w:p>
+        </w:tc>
+        <w:tc>
+          <w:tcPr>
+            <w:tcW w:type="dxa" w:w="2750"/>
+            <w:tcBorders>
+              <w:top w:val="single" w:color="1E2761" w:sz="8"/>
+              <w:left w:val="single" w:color="1E2761" w:sz="8"/>
+              <w:bottom w:val="single" w:color="1E2761" w:sz="8"/>
+              <w:right w:val="single" w:color="1E2761" w:sz="8"/>
+            </w:tcBorders>
+            <w:shd w:fill="1E2761" w:color="auto" w:val="clear"/>
+            <w:tcMar>
+              <w:top w:type="dxa" w:w="55"/>
+              <w:left w:type="dxa" w:w="90"/>
+              <w:bottom w:type="dxa" w:w="55"/>
+              <w:right w:type="dxa" w:w="90"/>
+            </w:tcMar>
+            <w:vAlign w:val="center"/>
+          </w:tcPr>
+          <w:p>
+            <w:pPr>
+              <w:spacing w:after="0" w:before="0"/>
+            </w:pPr>
+            <w:r>
+              <w:rPr>
+                <w:rFonts w:ascii="Calibri" w:cs="Calibri" w:eastAsia="Calibri" w:hAnsi="Calibri"/>
+                <w:b/>
+                <w:bCs/>
+                <w:color w:val="FFFFFF"/>
+                <w:sz w:val="17"/>
+                <w:szCs w:val="17"/>
+              </w:rPr>
+              <w:t xml:space="preserve">Vorwissen (Wiederholung)</w:t>
+            </w:r>
+          </w:p>
+        </w:tc>
+        <w:tc>
+          <w:tcPr>
+            <w:tcW w:type="dxa" w:w="3850"/>
+            <w:tcBorders>
+              <w:top w:val="single" w:color="1E2761" w:sz="8"/>
+              <w:left w:val="single" w:color="1E2761" w:sz="8"/>
+              <w:bottom w:val="single" w:color="1E2761" w:sz="8"/>
+              <w:right w:val="single" w:color="1E2761" w:sz="8"/>
+            </w:tcBorders>
+            <w:shd w:fill="1E2761" w:color="auto" w:val="clear"/>
+            <w:tcMar>
+              <w:top w:type="dxa" w:w="55"/>
+              <w:left w:type="dxa" w:w="90"/>
+              <w:bottom w:type="dxa" w:w="55"/>
+              <w:right w:type="dxa" w:w="90"/>
+            </w:tcMar>
+            <w:vAlign w:val="center"/>
+          </w:tcPr>
+          <w:p>
+            <w:pPr>
+              <w:spacing w:after="0" w:before="0"/>
+            </w:pPr>
+            <w:r>
+              <w:rPr>
+                <w:rFonts w:ascii="Calibri" w:cs="Calibri" w:eastAsia="Calibri" w:hAnsi="Calibri"/>
+                <w:b/>
+                <w:bCs/>
+                <w:color w:val="FFFFFF"/>
+                <w:sz w:val="17"/>
+                <w:szCs w:val="17"/>
+              </w:rPr>
+              <w:t xml:space="preserve">Methode (Idee)</w:t>
+            </w:r>
+          </w:p>
+        </w:tc>
+        <w:tc>
+          <w:tcPr>
+            <w:tcW w:type="dxa" w:w="3288"/>
+            <w:tcBorders>
+              <w:top w:val="single" w:color="1E2761" w:sz="8"/>
+              <w:left w:val="single" w:color="1E2761" w:sz="8"/>
+              <w:bottom w:val="single" w:color="1E2761" w:sz="8"/>
+              <w:right w:val="single" w:color="1E2761" w:sz="8"/>
+            </w:tcBorders>
+            <w:shd w:fill="1E2761" w:color="auto" w:val="clear"/>
+            <w:tcMar>
+              <w:top w:type="dxa" w:w="55"/>
+              <w:left w:type="dxa" w:w="90"/>
+              <w:bottom w:type="dxa" w:w="55"/>
+              <w:right w:type="dxa" w:w="90"/>
+            </w:tcMar>
+            <w:vAlign w:val="center"/>
+          </w:tcPr>
+          <w:p>
+            <w:pPr>
+              <w:spacing w:after="0" w:before="0"/>
+            </w:pPr>
+            <w:r>
+              <w:rPr>
+                <w:rFonts w:ascii="Calibri" w:cs="Calibri" w:eastAsia="Calibri" w:hAnsi="Calibri"/>
+                <w:b/>
+                <w:bCs/>
+                <w:color w:val="FFFFFF"/>
+                <w:sz w:val="17"/>
+                <w:szCs w:val="17"/>
+              </w:rPr>
+              <w:t xml:space="preserve">Lehrbuch (nur indirekt)</w:t>
+            </w:r>
+          </w:p>
+        </w:tc>
+      </w:tr>
+      <w:tr>
+        <w:trPr>
+          <w:cantSplit/>
+        </w:trPr>
+        <w:tc>
+          <w:tcPr>
+            <w:tcW w:type="dxa" w:w="650"/>
+            <w:tcBorders>
+              <w:top w:val="single" w:color="5B6B8C" w:sz="8"/>
+              <w:left w:val="single" w:color="5B6B8C" w:sz="8"/>
+              <w:bottom w:val="single" w:color="5B6B8C" w:sz="8"/>
+              <w:right w:val="single" w:color="5B6B8C" w:sz="8"/>
+            </w:tcBorders>
+            <w:shd w:fill="F4F7FD" w:color="auto" w:val="clear"/>
+            <w:tcMar>
+              <w:top w:type="dxa" w:w="40"/>
+              <w:left w:type="dxa" w:w="90"/>
+              <w:bottom w:type="dxa" w:w="40"/>
+              <w:right w:type="dxa" w:w="90"/>
+            </w:tcMar>
+            <w:vAlign w:val="top"/>
+          </w:tcPr>
+          <w:p>
+            <w:pPr>
+              <w:spacing w:after="0" w:before="0"/>
+            </w:pPr>
+            <w:r>
+              <w:rPr>
+                <w:rFonts w:ascii="Calibri" w:cs="Calibri" w:eastAsia="Calibri" w:hAnsi="Calibri"/>
+                <w:b/>
+                <w:bCs/>
+                <w:color w:val="1E2761"/>
+                <w:sz w:val="16"/>
+                <w:szCs w:val="16"/>
+              </w:rPr>
+              <w:t xml:space="preserve">1</w:t>
+            </w:r>
+          </w:p>
+        </w:tc>
+        <w:tc>
+          <w:tcPr>
+            <w:tcW w:type="dxa" w:w="4900"/>
+            <w:tcBorders>
+              <w:top w:val="single" w:color="5B6B8C" w:sz="8"/>
+              <w:left w:val="single" w:color="5B6B8C" w:sz="8"/>
+              <w:bottom w:val="single" w:color="5B6B8C" w:sz="8"/>
+              <w:right w:val="single" w:color="5B6B8C" w:sz="8"/>
+            </w:tcBorders>
+            <w:shd w:fill="F4F7FD" w:color="auto" w:val="clear"/>
+            <w:tcMar>
+              <w:top w:type="dxa" w:w="40"/>
+              <w:left w:type="dxa" w:w="90"/>
+              <w:bottom w:type="dxa" w:w="40"/>
+              <w:right w:type="dxa" w:w="90"/>
+            </w:tcMar>
+            <w:vAlign w:val="top"/>
+          </w:tcPr>
+          <w:p>
+            <w:pPr>
+              <w:spacing w:after="0" w:before="0"/>
+            </w:pPr>
+            <w:r>
+              <w:rPr>
+                <w:rFonts w:ascii="Calibri" w:cs="Calibri" w:eastAsia="Calibri" w:hAnsi="Calibri"/>
+                <w:b w:val="false"/>
+                <w:bCs w:val="false"/>
+                <w:color w:val="000000"/>
+                <w:sz w:val="16"/>
+                <w:szCs w:val="16"/>
+              </w:rPr>
+              <w:t xml:space="preserve">König Ludwig XVI.: Soll ich erlauben, dass der Dritte Stand (Bauern und Bürger) nach Köpfen abstimmt? (so geplant)</w:t>
+            </w:r>
+          </w:p>
+        </w:tc>
+        <w:tc>
+          <w:tcPr>
+            <w:tcW w:type="dxa" w:w="2750"/>
+            <w:tcBorders>
+              <w:top w:val="single" w:color="5B6B8C" w:sz="8"/>
+              <w:left w:val="single" w:color="5B6B8C" w:sz="8"/>
+              <w:bottom w:val="single" w:color="5B6B8C" w:sz="8"/>
+              <w:right w:val="single" w:color="5B6B8C" w:sz="8"/>
+            </w:tcBorders>
+            <w:shd w:fill="F4F7FD" w:color="auto" w:val="clear"/>
+            <w:tcMar>
+              <w:top w:type="dxa" w:w="40"/>
+              <w:left w:type="dxa" w:w="90"/>
+              <w:bottom w:type="dxa" w:w="40"/>
+              <w:right w:type="dxa" w:w="90"/>
+            </w:tcMar>
+            <w:vAlign w:val="top"/>
+          </w:tcPr>
+          <w:p>
+            <w:pPr>
+              <w:spacing w:after="0" w:before="0"/>
+            </w:pPr>
+            <w:r>
+              <w:rPr>
+                <w:rFonts w:ascii="Calibri" w:cs="Calibri" w:eastAsia="Calibri" w:hAnsi="Calibri"/>
+                <w:b w:val="false"/>
+                <w:bCs w:val="false"/>
+                <w:color w:val="000000"/>
+                <w:sz w:val="16"/>
+                <w:szCs w:val="16"/>
+              </w:rPr>
+              <w:t xml:space="preserve">Fehlertext Absolutismus und Stände</w:t>
+            </w:r>
+          </w:p>
+        </w:tc>
+        <w:tc>
+          <w:tcPr>
+            <w:tcW w:type="dxa" w:w="3850"/>
+            <w:tcBorders>
+              <w:top w:val="single" w:color="5B6B8C" w:sz="8"/>
+              <w:left w:val="single" w:color="5B6B8C" w:sz="8"/>
+              <w:bottom w:val="single" w:color="5B6B8C" w:sz="8"/>
+              <w:right w:val="single" w:color="5B6B8C" w:sz="8"/>
+            </w:tcBorders>
+            <w:shd w:fill="F4F7FD" w:color="auto" w:val="clear"/>
+            <w:tcMar>
+              <w:top w:type="dxa" w:w="40"/>
+              <w:left w:type="dxa" w:w="90"/>
+              <w:bottom w:type="dxa" w:w="40"/>
+              <w:right w:type="dxa" w:w="90"/>
+            </w:tcMar>
+            <w:vAlign w:val="top"/>
+          </w:tcPr>
+          <w:p>
+            <w:pPr>
+              <w:spacing w:after="0" w:before="0"/>
+            </w:pPr>
+            <w:r>
+              <w:rPr>
+                <w:rFonts w:ascii="Calibri" w:cs="Calibri" w:eastAsia="Calibri" w:hAnsi="Calibri"/>
+                <w:b w:val="false"/>
+                <w:bCs w:val="false"/>
+                <w:color w:val="000000"/>
+                <w:sz w:val="16"/>
+                <w:szCs w:val="16"/>
+              </w:rPr>
+              <w:t xml:space="preserve">Ständespiel (8D), Zeitstrahl, Kreide-Kette</w:t>
+            </w:r>
+          </w:p>
+        </w:tc>
+        <w:tc>
+          <w:tcPr>
+            <w:tcW w:type="dxa" w:w="3288"/>
+            <w:tcBorders>
+              <w:top w:val="single" w:color="5B6B8C" w:sz="8"/>
+              <w:left w:val="single" w:color="5B6B8C" w:sz="8"/>
+              <w:bottom w:val="single" w:color="5B6B8C" w:sz="8"/>
+              <w:right w:val="single" w:color="5B6B8C" w:sz="8"/>
+            </w:tcBorders>
+            <w:shd w:fill="F4F7FD" w:color="auto" w:val="clear"/>
+            <w:tcMar>
+              <w:top w:type="dxa" w:w="40"/>
+              <w:left w:type="dxa" w:w="90"/>
+              <w:bottom w:type="dxa" w:w="40"/>
+              <w:right w:type="dxa" w:w="90"/>
+            </w:tcMar>
+            <w:vAlign w:val="top"/>
+          </w:tcPr>
+          <w:p>
+            <w:pPr>
+              <w:spacing w:after="0" w:before="0"/>
+            </w:pPr>
+            <w:r>
+              <w:rPr>
+                <w:rFonts w:ascii="Calibri" w:cs="Calibri" w:eastAsia="Calibri" w:hAnsi="Calibri"/>
+                <w:b w:val="false"/>
+                <w:bCs w:val="false"/>
+                <w:color w:val="000000"/>
+                <w:sz w:val="16"/>
+                <w:szCs w:val="16"/>
+              </w:rPr>
+              <w:t xml:space="preserve">S. 110/111</w:t>
+            </w:r>
+          </w:p>
+        </w:tc>
+      </w:tr>
+      <w:tr>
+        <w:trPr>
+          <w:cantSplit/>
+        </w:trPr>
+        <w:tc>
+          <w:tcPr>
+            <w:tcW w:type="dxa" w:w="650"/>
+            <w:tcBorders>
+              <w:top w:val="single" w:color="5B6B8C" w:sz="8"/>
+              <w:left w:val="single" w:color="5B6B8C" w:sz="8"/>
+              <w:bottom w:val="single" w:color="5B6B8C" w:sz="8"/>
+              <w:right w:val="single" w:color="5B6B8C" w:sz="8"/>
+            </w:tcBorders>
+            <w:shd w:fill="FFFFFF" w:color="auto" w:val="clear"/>
+            <w:tcMar>
+              <w:top w:type="dxa" w:w="40"/>
+              <w:left w:type="dxa" w:w="90"/>
+              <w:bottom w:type="dxa" w:w="40"/>
+              <w:right w:type="dxa" w:w="90"/>
+            </w:tcMar>
+            <w:vAlign w:val="top"/>
+          </w:tcPr>
+          <w:p>
+            <w:pPr>
+              <w:spacing w:after="0" w:before="0"/>
+            </w:pPr>
+            <w:r>
+              <w:rPr>
+                <w:rFonts w:ascii="Calibri" w:cs="Calibri" w:eastAsia="Calibri" w:hAnsi="Calibri"/>
+                <w:b/>
+                <w:bCs/>
+                <w:color w:val="1E2761"/>
+                <w:sz w:val="16"/>
+                <w:szCs w:val="16"/>
+              </w:rPr>
+              <w:t xml:space="preserve">2</w:t>
+            </w:r>
+          </w:p>
+        </w:tc>
+        <w:tc>
+          <w:tcPr>
+            <w:tcW w:type="dxa" w:w="4900"/>
+            <w:tcBorders>
+              <w:top w:val="single" w:color="5B6B8C" w:sz="8"/>
+              <w:left w:val="single" w:color="5B6B8C" w:sz="8"/>
+              <w:bottom w:val="single" w:color="5B6B8C" w:sz="8"/>
+              <w:right w:val="single" w:color="5B6B8C" w:sz="8"/>
+            </w:tcBorders>
+            <w:shd w:fill="FFFFFF" w:color="auto" w:val="clear"/>
+            <w:tcMar>
+              <w:top w:type="dxa" w:w="40"/>
+              <w:left w:type="dxa" w:w="90"/>
+              <w:bottom w:type="dxa" w:w="40"/>
+              <w:right w:type="dxa" w:w="90"/>
+            </w:tcMar>
+            <w:vAlign w:val="top"/>
+          </w:tcPr>
+          <w:p>
+            <w:pPr>
+              <w:spacing w:after="0" w:before="0"/>
+            </w:pPr>
+            <w:r>
+              <w:rPr>
+                <w:rFonts w:ascii="Calibri" w:cs="Calibri" w:eastAsia="Calibri" w:hAnsi="Calibri"/>
+                <w:b w:val="false"/>
+                <w:bCs w:val="false"/>
+                <w:color w:val="000000"/>
+                <w:sz w:val="16"/>
+                <w:szCs w:val="16"/>
+              </w:rPr>
+              <w:t xml:space="preserve">Abgeordneter: Draußen stehen Soldaten. Wenn ich schwöre, kann ich verhaftet werden, auch meine Familie ist in Gefahr. Soll ich trotzdem schwören? (so geplant)</w:t>
+            </w:r>
+          </w:p>
+        </w:tc>
+        <w:tc>
+          <w:tcPr>
+            <w:tcW w:type="dxa" w:w="2750"/>
+            <w:tcBorders>
+              <w:top w:val="single" w:color="5B6B8C" w:sz="8"/>
+              <w:left w:val="single" w:color="5B6B8C" w:sz="8"/>
+              <w:bottom w:val="single" w:color="5B6B8C" w:sz="8"/>
+              <w:right w:val="single" w:color="5B6B8C" w:sz="8"/>
+            </w:tcBorders>
+            <w:shd w:fill="FFFFFF" w:color="auto" w:val="clear"/>
+            <w:tcMar>
+              <w:top w:type="dxa" w:w="40"/>
+              <w:left w:type="dxa" w:w="90"/>
+              <w:bottom w:type="dxa" w:w="40"/>
+              <w:right w:type="dxa" w:w="90"/>
+            </w:tcMar>
+            <w:vAlign w:val="top"/>
+          </w:tcPr>
+          <w:p>
+            <w:pPr>
+              <w:spacing w:after="0" w:before="0"/>
+            </w:pPr>
+            <w:r>
+              <w:rPr>
+                <w:rFonts w:ascii="Calibri" w:cs="Calibri" w:eastAsia="Calibri" w:hAnsi="Calibri"/>
+                <w:b w:val="false"/>
+                <w:bCs w:val="false"/>
+                <w:color w:val="000000"/>
+                <w:sz w:val="16"/>
+                <w:szCs w:val="16"/>
+              </w:rPr>
+              <w:t xml:space="preserve">Fehlertext: Abstimmung nach Ständen und nach Köpfen</w:t>
+            </w:r>
+          </w:p>
+        </w:tc>
+        <w:tc>
+          <w:tcPr>
+            <w:tcW w:type="dxa" w:w="3850"/>
+            <w:tcBorders>
+              <w:top w:val="single" w:color="5B6B8C" w:sz="8"/>
+              <w:left w:val="single" w:color="5B6B8C" w:sz="8"/>
+              <w:bottom w:val="single" w:color="5B6B8C" w:sz="8"/>
+              <w:right w:val="single" w:color="5B6B8C" w:sz="8"/>
+            </w:tcBorders>
+            <w:shd w:fill="FFFFFF" w:color="auto" w:val="clear"/>
+            <w:tcMar>
+              <w:top w:type="dxa" w:w="40"/>
+              <w:left w:type="dxa" w:w="90"/>
+              <w:bottom w:type="dxa" w:w="40"/>
+              <w:right w:type="dxa" w:w="90"/>
+            </w:tcMar>
+            <w:vAlign w:val="top"/>
+          </w:tcPr>
+          <w:p>
+            <w:pPr>
+              <w:spacing w:after="0" w:before="0"/>
+            </w:pPr>
+            <w:r>
+              <w:rPr>
+                <w:rFonts w:ascii="Calibri" w:cs="Calibri" w:eastAsia="Calibri" w:hAnsi="Calibri"/>
+                <w:b w:val="false"/>
+                <w:bCs w:val="false"/>
+                <w:color w:val="000000"/>
+                <w:sz w:val="16"/>
+                <w:szCs w:val="16"/>
+              </w:rPr>
+              <w:t xml:space="preserve">Karikatur direkt (Modell, dann Paare); Ideen: Zahlenjagd, Einordnen auf einer Linie (Beurteilen)</w:t>
+            </w:r>
+          </w:p>
+        </w:tc>
+        <w:tc>
+          <w:tcPr>
+            <w:tcW w:type="dxa" w:w="3288"/>
+            <w:tcBorders>
+              <w:top w:val="single" w:color="5B6B8C" w:sz="8"/>
+              <w:left w:val="single" w:color="5B6B8C" w:sz="8"/>
+              <w:bottom w:val="single" w:color="5B6B8C" w:sz="8"/>
+              <w:right w:val="single" w:color="5B6B8C" w:sz="8"/>
+            </w:tcBorders>
+            <w:shd w:fill="FFFFFF" w:color="auto" w:val="clear"/>
+            <w:tcMar>
+              <w:top w:type="dxa" w:w="40"/>
+              <w:left w:type="dxa" w:w="90"/>
+              <w:bottom w:type="dxa" w:w="40"/>
+              <w:right w:type="dxa" w:w="90"/>
+            </w:tcMar>
+            <w:vAlign w:val="top"/>
+          </w:tcPr>
+          <w:p>
+            <w:pPr>
+              <w:spacing w:after="0" w:before="0"/>
+            </w:pPr>
+            <w:r>
+              <w:rPr>
+                <w:rFonts w:ascii="Calibri" w:cs="Calibri" w:eastAsia="Calibri" w:hAnsi="Calibri"/>
+                <w:b w:val="false"/>
+                <w:bCs w:val="false"/>
+                <w:color w:val="000000"/>
+                <w:sz w:val="16"/>
+                <w:szCs w:val="16"/>
+              </w:rPr>
+              <w:t xml:space="preserve">S. 111 (Karikatur), 112/113 (Sieyès, Ballhausschwur), 116 (Dreischritt)</w:t>
+            </w:r>
+          </w:p>
+        </w:tc>
+      </w:tr>
+      <w:tr>
+        <w:trPr>
+          <w:cantSplit/>
+        </w:trPr>
+        <w:tc>
+          <w:tcPr>
+            <w:tcW w:type="dxa" w:w="650"/>
+            <w:tcBorders>
+              <w:top w:val="single" w:color="5B6B8C" w:sz="8"/>
+              <w:left w:val="single" w:color="5B6B8C" w:sz="8"/>
+              <w:bottom w:val="single" w:color="5B6B8C" w:sz="8"/>
+              <w:right w:val="single" w:color="5B6B8C" w:sz="8"/>
+            </w:tcBorders>
+            <w:shd w:fill="F4F7FD" w:color="auto" w:val="clear"/>
+            <w:tcMar>
+              <w:top w:type="dxa" w:w="40"/>
+              <w:left w:type="dxa" w:w="90"/>
+              <w:bottom w:type="dxa" w:w="40"/>
+              <w:right w:type="dxa" w:w="90"/>
+            </w:tcMar>
+            <w:vAlign w:val="top"/>
+          </w:tcPr>
+          <w:p>
+            <w:pPr>
+              <w:spacing w:after="0" w:before="0"/>
+            </w:pPr>
+            <w:r>
+              <w:rPr>
+                <w:rFonts w:ascii="Calibri" w:cs="Calibri" w:eastAsia="Calibri" w:hAnsi="Calibri"/>
+                <w:b/>
+                <w:bCs/>
+                <w:color w:val="1E2761"/>
+                <w:sz w:val="16"/>
+                <w:szCs w:val="16"/>
+              </w:rPr>
+              <w:t xml:space="preserve">3</w:t>
+            </w:r>
+          </w:p>
+        </w:tc>
+        <w:tc>
+          <w:tcPr>
+            <w:tcW w:type="dxa" w:w="4900"/>
+            <w:tcBorders>
+              <w:top w:val="single" w:color="5B6B8C" w:sz="8"/>
+              <w:left w:val="single" w:color="5B6B8C" w:sz="8"/>
+              <w:bottom w:val="single" w:color="5B6B8C" w:sz="8"/>
+              <w:right w:val="single" w:color="5B6B8C" w:sz="8"/>
+            </w:tcBorders>
+            <w:shd w:fill="F4F7FD" w:color="auto" w:val="clear"/>
+            <w:tcMar>
+              <w:top w:type="dxa" w:w="40"/>
+              <w:left w:type="dxa" w:w="90"/>
+              <w:bottom w:type="dxa" w:w="40"/>
+              <w:right w:type="dxa" w:w="90"/>
+            </w:tcMar>
+            <w:vAlign w:val="top"/>
+          </w:tcPr>
+          <w:p>
+            <w:pPr>
+              <w:spacing w:after="0" w:before="0"/>
+            </w:pPr>
+            <w:r>
+              <w:rPr>
+                <w:rFonts w:ascii="Calibri" w:cs="Calibri" w:eastAsia="Calibri" w:hAnsi="Calibri"/>
+                <w:b w:val="false"/>
+                <w:bCs w:val="false"/>
+                <w:color w:val="000000"/>
+                <w:sz w:val="16"/>
+                <w:szCs w:val="16"/>
+              </w:rPr>
+              <w:t xml:space="preserve">Adliger: Soll ich auf meine Vorrechte verzichten? (Risiko prüfen)</w:t>
+            </w:r>
+          </w:p>
+        </w:tc>
+        <w:tc>
+          <w:tcPr>
+            <w:tcW w:type="dxa" w:w="2750"/>
+            <w:tcBorders>
+              <w:top w:val="single" w:color="5B6B8C" w:sz="8"/>
+              <w:left w:val="single" w:color="5B6B8C" w:sz="8"/>
+              <w:bottom w:val="single" w:color="5B6B8C" w:sz="8"/>
+              <w:right w:val="single" w:color="5B6B8C" w:sz="8"/>
+            </w:tcBorders>
+            <w:shd w:fill="F4F7FD" w:color="auto" w:val="clear"/>
+            <w:tcMar>
+              <w:top w:type="dxa" w:w="40"/>
+              <w:left w:type="dxa" w:w="90"/>
+              <w:bottom w:type="dxa" w:w="40"/>
+              <w:right w:type="dxa" w:w="90"/>
+            </w:tcMar>
+            <w:vAlign w:val="top"/>
+          </w:tcPr>
+          <w:p>
+            <w:pPr>
+              <w:spacing w:after="0" w:before="0"/>
+            </w:pPr>
+            <w:r>
+              <w:rPr>
+                <w:rFonts w:ascii="Calibri" w:cs="Calibri" w:eastAsia="Calibri" w:hAnsi="Calibri"/>
+                <w:b w:val="false"/>
+                <w:bCs w:val="false"/>
+                <w:color w:val="000000"/>
+                <w:sz w:val="16"/>
+                <w:szCs w:val="16"/>
+              </w:rPr>
+              <w:t xml:space="preserve">Falschbehauptungen zu Stunde 2</w:t>
+            </w:r>
+          </w:p>
+        </w:tc>
+        <w:tc>
+          <w:tcPr>
+            <w:tcW w:type="dxa" w:w="3850"/>
+            <w:tcBorders>
+              <w:top w:val="single" w:color="5B6B8C" w:sz="8"/>
+              <w:left w:val="single" w:color="5B6B8C" w:sz="8"/>
+              <w:bottom w:val="single" w:color="5B6B8C" w:sz="8"/>
+              <w:right w:val="single" w:color="5B6B8C" w:sz="8"/>
+            </w:tcBorders>
+            <w:shd w:fill="F4F7FD" w:color="auto" w:val="clear"/>
+            <w:tcMar>
+              <w:top w:type="dxa" w:w="40"/>
+              <w:left w:type="dxa" w:w="90"/>
+              <w:bottom w:type="dxa" w:w="40"/>
+              <w:right w:type="dxa" w:w="90"/>
+            </w:tcMar>
+            <w:vAlign w:val="top"/>
+          </w:tcPr>
+          <w:p>
+            <w:pPr>
+              <w:spacing w:after="0" w:before="0"/>
+            </w:pPr>
+            <w:r>
+              <w:rPr>
+                <w:rFonts w:ascii="Calibri" w:cs="Calibri" w:eastAsia="Calibri" w:hAnsi="Calibri"/>
+                <w:b w:val="false"/>
+                <w:bCs w:val="false"/>
+                <w:color w:val="000000"/>
+                <w:sz w:val="16"/>
+                <w:szCs w:val="16"/>
+              </w:rPr>
+              <w:t xml:space="preserve">Entscheidungsfälle zu den Artikeln der Menschenrechte; Begriff „Revolution“ einführen</w:t>
+            </w:r>
+          </w:p>
+        </w:tc>
+        <w:tc>
+          <w:tcPr>
+            <w:tcW w:type="dxa" w:w="3288"/>
+            <w:tcBorders>
+              <w:top w:val="single" w:color="5B6B8C" w:sz="8"/>
+              <w:left w:val="single" w:color="5B6B8C" w:sz="8"/>
+              <w:bottom w:val="single" w:color="5B6B8C" w:sz="8"/>
+              <w:right w:val="single" w:color="5B6B8C" w:sz="8"/>
+            </w:tcBorders>
+            <w:shd w:fill="F4F7FD" w:color="auto" w:val="clear"/>
+            <w:tcMar>
+              <w:top w:type="dxa" w:w="40"/>
+              <w:left w:type="dxa" w:w="90"/>
+              <w:bottom w:type="dxa" w:w="40"/>
+              <w:right w:type="dxa" w:w="90"/>
+            </w:tcMar>
+            <w:vAlign w:val="top"/>
+          </w:tcPr>
+          <w:p>
+            <w:pPr>
+              <w:spacing w:after="0" w:before="0"/>
+            </w:pPr>
+            <w:r>
+              <w:rPr>
+                <w:rFonts w:ascii="Calibri" w:cs="Calibri" w:eastAsia="Calibri" w:hAnsi="Calibri"/>
+                <w:b w:val="false"/>
+                <w:bCs w:val="false"/>
+                <w:color w:val="000000"/>
+                <w:sz w:val="16"/>
+                <w:szCs w:val="16"/>
+              </w:rPr>
+              <w:t xml:space="preserve">S. 112/113 (Bastille, 4./5. August, Menschenrechte)</w:t>
+            </w:r>
+          </w:p>
+        </w:tc>
+      </w:tr>
+      <w:tr>
+        <w:trPr>
+          <w:cantSplit/>
+        </w:trPr>
+        <w:tc>
+          <w:tcPr>
+            <w:tcW w:type="dxa" w:w="650"/>
+            <w:tcBorders>
+              <w:top w:val="single" w:color="5B6B8C" w:sz="8"/>
+              <w:left w:val="single" w:color="5B6B8C" w:sz="8"/>
+              <w:bottom w:val="single" w:color="5B6B8C" w:sz="8"/>
+              <w:right w:val="single" w:color="5B6B8C" w:sz="8"/>
+            </w:tcBorders>
+            <w:shd w:fill="FFFFFF" w:color="auto" w:val="clear"/>
+            <w:tcMar>
+              <w:top w:type="dxa" w:w="40"/>
+              <w:left w:type="dxa" w:w="90"/>
+              <w:bottom w:type="dxa" w:w="40"/>
+              <w:right w:type="dxa" w:w="90"/>
+            </w:tcMar>
+            <w:vAlign w:val="top"/>
+          </w:tcPr>
+          <w:p>
+            <w:pPr>
+              <w:spacing w:after="0" w:before="0"/>
+            </w:pPr>
+            <w:r>
+              <w:rPr>
+                <w:rFonts w:ascii="Calibri" w:cs="Calibri" w:eastAsia="Calibri" w:hAnsi="Calibri"/>
+                <w:b/>
+                <w:bCs/>
+                <w:color w:val="1E2761"/>
+                <w:sz w:val="16"/>
+                <w:szCs w:val="16"/>
+              </w:rPr>
+              <w:t xml:space="preserve">4</w:t>
+            </w:r>
+          </w:p>
+        </w:tc>
+        <w:tc>
+          <w:tcPr>
+            <w:tcW w:type="dxa" w:w="4900"/>
+            <w:tcBorders>
+              <w:top w:val="single" w:color="5B6B8C" w:sz="8"/>
+              <w:left w:val="single" w:color="5B6B8C" w:sz="8"/>
+              <w:bottom w:val="single" w:color="5B6B8C" w:sz="8"/>
+              <w:right w:val="single" w:color="5B6B8C" w:sz="8"/>
+            </w:tcBorders>
+            <w:shd w:fill="FFFFFF" w:color="auto" w:val="clear"/>
+            <w:tcMar>
+              <w:top w:type="dxa" w:w="40"/>
+              <w:left w:type="dxa" w:w="90"/>
+              <w:bottom w:type="dxa" w:w="40"/>
+              <w:right w:type="dxa" w:w="90"/>
+            </w:tcMar>
+            <w:vAlign w:val="top"/>
+          </w:tcPr>
+          <w:p>
+            <w:pPr>
+              <w:spacing w:after="0" w:before="0"/>
+            </w:pPr>
+            <w:r>
+              <w:rPr>
+                <w:rFonts w:ascii="Calibri" w:cs="Calibri" w:eastAsia="Calibri" w:hAnsi="Calibri"/>
+                <w:b w:val="false"/>
+                <w:bCs w:val="false"/>
+                <w:color w:val="000000"/>
+                <w:sz w:val="16"/>
+                <w:szCs w:val="16"/>
+              </w:rPr>
+              <w:t xml:space="preserve">Nationalversammlung: Wer soll wählen dürfen? (Risiko prüfen)</w:t>
+            </w:r>
+          </w:p>
+        </w:tc>
+        <w:tc>
+          <w:tcPr>
+            <w:tcW w:type="dxa" w:w="2750"/>
+            <w:tcBorders>
+              <w:top w:val="single" w:color="5B6B8C" w:sz="8"/>
+              <w:left w:val="single" w:color="5B6B8C" w:sz="8"/>
+              <w:bottom w:val="single" w:color="5B6B8C" w:sz="8"/>
+              <w:right w:val="single" w:color="5B6B8C" w:sz="8"/>
+            </w:tcBorders>
+            <w:shd w:fill="FFFFFF" w:color="auto" w:val="clear"/>
+            <w:tcMar>
+              <w:top w:type="dxa" w:w="40"/>
+              <w:left w:type="dxa" w:w="90"/>
+              <w:bottom w:type="dxa" w:w="40"/>
+              <w:right w:type="dxa" w:w="90"/>
+            </w:tcMar>
+            <w:vAlign w:val="top"/>
+          </w:tcPr>
+          <w:p>
+            <w:pPr>
+              <w:spacing w:after="0" w:before="0"/>
+            </w:pPr>
+            <w:r>
+              <w:rPr>
+                <w:rFonts w:ascii="Calibri" w:cs="Calibri" w:eastAsia="Calibri" w:hAnsi="Calibri"/>
+                <w:b w:val="false"/>
+                <w:bCs w:val="false"/>
+                <w:color w:val="000000"/>
+                <w:sz w:val="16"/>
+                <w:szCs w:val="16"/>
+              </w:rPr>
+              <w:t xml:space="preserve">Schaubild mit Fehlern</w:t>
+            </w:r>
+          </w:p>
+        </w:tc>
+        <w:tc>
+          <w:tcPr>
+            <w:tcW w:type="dxa" w:w="3850"/>
+            <w:tcBorders>
+              <w:top w:val="single" w:color="5B6B8C" w:sz="8"/>
+              <w:left w:val="single" w:color="5B6B8C" w:sz="8"/>
+              <w:bottom w:val="single" w:color="5B6B8C" w:sz="8"/>
+              <w:right w:val="single" w:color="5B6B8C" w:sz="8"/>
+            </w:tcBorders>
+            <w:shd w:fill="FFFFFF" w:color="auto" w:val="clear"/>
+            <w:tcMar>
+              <w:top w:type="dxa" w:w="40"/>
+              <w:left w:type="dxa" w:w="90"/>
+              <w:bottom w:type="dxa" w:w="40"/>
+              <w:right w:type="dxa" w:w="90"/>
+            </w:tcMar>
+            <w:vAlign w:val="top"/>
+          </w:tcPr>
+          <w:p>
+            <w:pPr>
+              <w:spacing w:after="0" w:before="0"/>
+            </w:pPr>
+            <w:r>
+              <w:rPr>
+                <w:rFonts w:ascii="Calibri" w:cs="Calibri" w:eastAsia="Calibri" w:hAnsi="Calibri"/>
+                <w:b w:val="false"/>
+                <w:bCs w:val="false"/>
+                <w:color w:val="000000"/>
+                <w:sz w:val="16"/>
+                <w:szCs w:val="16"/>
+              </w:rPr>
+              <w:t xml:space="preserve">Stummes Schaubild, evtl. Fälle zur Wahlberechtigung</w:t>
+            </w:r>
+          </w:p>
+        </w:tc>
+        <w:tc>
+          <w:tcPr>
+            <w:tcW w:type="dxa" w:w="3288"/>
+            <w:tcBorders>
+              <w:top w:val="single" w:color="5B6B8C" w:sz="8"/>
+              <w:left w:val="single" w:color="5B6B8C" w:sz="8"/>
+              <w:bottom w:val="single" w:color="5B6B8C" w:sz="8"/>
+              <w:right w:val="single" w:color="5B6B8C" w:sz="8"/>
+            </w:tcBorders>
+            <w:shd w:fill="FFFFFF" w:color="auto" w:val="clear"/>
+            <w:tcMar>
+              <w:top w:type="dxa" w:w="40"/>
+              <w:left w:type="dxa" w:w="90"/>
+              <w:bottom w:type="dxa" w:w="40"/>
+              <w:right w:type="dxa" w:w="90"/>
+            </w:tcMar>
+            <w:vAlign w:val="top"/>
+          </w:tcPr>
+          <w:p>
+            <w:pPr>
+              <w:spacing w:after="0" w:before="0"/>
+            </w:pPr>
+            <w:r>
+              <w:rPr>
+                <w:rFonts w:ascii="Calibri" w:cs="Calibri" w:eastAsia="Calibri" w:hAnsi="Calibri"/>
+                <w:b w:val="false"/>
+                <w:bCs w:val="false"/>
+                <w:color w:val="000000"/>
+                <w:sz w:val="16"/>
+                <w:szCs w:val="16"/>
+              </w:rPr>
+              <w:t xml:space="preserve">S. 114/115 (Verfassung, Schaubild M2)</w:t>
+            </w:r>
+          </w:p>
+        </w:tc>
+      </w:tr>
+      <w:tr>
+        <w:trPr>
+          <w:cantSplit/>
+        </w:trPr>
+        <w:tc>
+          <w:tcPr>
+            <w:tcW w:type="dxa" w:w="650"/>
+            <w:tcBorders>
+              <w:top w:val="single" w:color="5B6B8C" w:sz="8"/>
+              <w:left w:val="single" w:color="5B6B8C" w:sz="8"/>
+              <w:bottom w:val="single" w:color="5B6B8C" w:sz="8"/>
+              <w:right w:val="single" w:color="5B6B8C" w:sz="8"/>
+            </w:tcBorders>
+            <w:shd w:fill="FCEFEE" w:color="auto" w:val="clear"/>
+            <w:tcMar>
+              <w:top w:type="dxa" w:w="40"/>
+              <w:left w:type="dxa" w:w="90"/>
+              <w:bottom w:type="dxa" w:w="40"/>
+              <w:right w:type="dxa" w:w="90"/>
+            </w:tcMar>
+            <w:vAlign w:val="top"/>
+          </w:tcPr>
+          <w:p>
+            <w:pPr>
+              <w:spacing w:after="0" w:before="0"/>
+            </w:pPr>
+            <w:r>
+              <w:rPr>
+                <w:rFonts w:ascii="Calibri" w:cs="Calibri" w:eastAsia="Calibri" w:hAnsi="Calibri"/>
+                <w:b/>
+                <w:bCs/>
+                <w:color w:val="1E2761"/>
+                <w:sz w:val="16"/>
+                <w:szCs w:val="16"/>
+              </w:rPr>
+              <w:t xml:space="preserve">5</w:t>
+            </w:r>
+          </w:p>
+        </w:tc>
+        <w:tc>
+          <w:tcPr>
+            <w:tcW w:type="dxa" w:w="4900"/>
+            <w:tcBorders>
+              <w:top w:val="single" w:color="5B6B8C" w:sz="8"/>
+              <w:left w:val="single" w:color="5B6B8C" w:sz="8"/>
+              <w:bottom w:val="single" w:color="5B6B8C" w:sz="8"/>
+              <w:right w:val="single" w:color="5B6B8C" w:sz="8"/>
+            </w:tcBorders>
+            <w:shd w:fill="FCEFEE" w:color="auto" w:val="clear"/>
+            <w:tcMar>
+              <w:top w:type="dxa" w:w="40"/>
+              <w:left w:type="dxa" w:w="90"/>
+              <w:bottom w:type="dxa" w:w="40"/>
+              <w:right w:type="dxa" w:w="90"/>
+            </w:tcMar>
+            <w:vAlign w:val="top"/>
+          </w:tcPr>
+          <w:p>
+            <w:pPr>
+              <w:spacing w:after="0" w:before="0"/>
+            </w:pPr>
+            <w:r>
+              <w:rPr>
+                <w:rFonts w:ascii="Calibri" w:cs="Calibri" w:eastAsia="Calibri" w:hAnsi="Calibri"/>
+                <w:b w:val="false"/>
+                <w:bCs w:val="false"/>
+                <w:color w:val="000000"/>
+                <w:sz w:val="16"/>
+                <w:szCs w:val="16"/>
+              </w:rPr>
+              <w:t xml:space="preserve">Test 1: Karikatur-Teilaufgabe, Wahr/falsch mit Begründung, Zuordnung</w:t>
+            </w:r>
+          </w:p>
+        </w:tc>
+        <w:tc>
+          <w:tcPr>
+            <w:tcW w:type="dxa" w:w="2750"/>
+            <w:tcBorders>
+              <w:top w:val="single" w:color="5B6B8C" w:sz="8"/>
+              <w:left w:val="single" w:color="5B6B8C" w:sz="8"/>
+              <w:bottom w:val="single" w:color="5B6B8C" w:sz="8"/>
+              <w:right w:val="single" w:color="5B6B8C" w:sz="8"/>
+            </w:tcBorders>
+            <w:shd w:fill="FCEFEE" w:color="auto" w:val="clear"/>
+            <w:tcMar>
+              <w:top w:type="dxa" w:w="40"/>
+              <w:left w:type="dxa" w:w="90"/>
+              <w:bottom w:type="dxa" w:w="40"/>
+              <w:right w:type="dxa" w:w="90"/>
+            </w:tcMar>
+            <w:vAlign w:val="top"/>
+          </w:tcPr>
+          <w:p>
+            <w:pPr>
+              <w:spacing w:after="0" w:before="0"/>
+            </w:pPr>
+            <w:r>
+              <w:rPr>
+                <w:rFonts w:ascii="Calibri" w:cs="Calibri" w:eastAsia="Calibri" w:hAnsi="Calibri"/>
+                <w:b w:val="false"/>
+                <w:bCs w:val="false"/>
+                <w:color w:val="000000"/>
+                <w:sz w:val="16"/>
+                <w:szCs w:val="16"/>
+              </w:rPr>
+              <w:t xml:space="preserve">–</w:t>
+            </w:r>
+          </w:p>
+        </w:tc>
+        <w:tc>
+          <w:tcPr>
+            <w:tcW w:type="dxa" w:w="3850"/>
+            <w:tcBorders>
+              <w:top w:val="single" w:color="5B6B8C" w:sz="8"/>
+              <w:left w:val="single" w:color="5B6B8C" w:sz="8"/>
+              <w:bottom w:val="single" w:color="5B6B8C" w:sz="8"/>
+              <w:right w:val="single" w:color="5B6B8C" w:sz="8"/>
+            </w:tcBorders>
+            <w:shd w:fill="FCEFEE" w:color="auto" w:val="clear"/>
+            <w:tcMar>
+              <w:top w:type="dxa" w:w="40"/>
+              <w:left w:type="dxa" w:w="90"/>
+              <w:bottom w:type="dxa" w:w="40"/>
+              <w:right w:type="dxa" w:w="90"/>
+            </w:tcMar>
+            <w:vAlign w:val="top"/>
+          </w:tcPr>
+          <w:p>
+            <w:pPr>
+              <w:spacing w:after="0" w:before="0"/>
+            </w:pPr>
+            <w:r>
+              <w:rPr>
+                <w:rFonts w:ascii="Calibri" w:cs="Calibri" w:eastAsia="Calibri" w:hAnsi="Calibri"/>
+                <w:b w:val="false"/>
+                <w:bCs w:val="false"/>
+                <w:color w:val="000000"/>
+                <w:sz w:val="16"/>
+                <w:szCs w:val="16"/>
+              </w:rPr>
+              <w:t xml:space="preserve">Vorbereitung: Fehlertext, „Antwort gegeben – Frage gesucht“</w:t>
+            </w:r>
+          </w:p>
+        </w:tc>
+        <w:tc>
+          <w:tcPr>
+            <w:tcW w:type="dxa" w:w="3288"/>
+            <w:tcBorders>
+              <w:top w:val="single" w:color="5B6B8C" w:sz="8"/>
+              <w:left w:val="single" w:color="5B6B8C" w:sz="8"/>
+              <w:bottom w:val="single" w:color="5B6B8C" w:sz="8"/>
+              <w:right w:val="single" w:color="5B6B8C" w:sz="8"/>
+            </w:tcBorders>
+            <w:shd w:fill="FCEFEE" w:color="auto" w:val="clear"/>
+            <w:tcMar>
+              <w:top w:type="dxa" w:w="40"/>
+              <w:left w:type="dxa" w:w="90"/>
+              <w:bottom w:type="dxa" w:w="40"/>
+              <w:right w:type="dxa" w:w="90"/>
+            </w:tcMar>
+            <w:vAlign w:val="top"/>
+          </w:tcPr>
+          <w:p>
+            <w:pPr>
+              <w:spacing w:after="0" w:before="0"/>
+            </w:pPr>
+            <w:r>
+              <w:rPr>
+                <w:rFonts w:ascii="Calibri" w:cs="Calibri" w:eastAsia="Calibri" w:hAnsi="Calibri"/>
+                <w:b w:val="false"/>
+                <w:bCs w:val="false"/>
+                <w:color w:val="000000"/>
+                <w:sz w:val="16"/>
+                <w:szCs w:val="16"/>
+              </w:rPr>
+              <w:t xml:space="preserve">–</w:t>
+            </w:r>
+          </w:p>
+        </w:tc>
+      </w:tr>
+      <w:tr>
+        <w:trPr>
+          <w:cantSplit/>
+        </w:trPr>
+        <w:tc>
+          <w:tcPr>
+            <w:tcW w:type="dxa" w:w="650"/>
+            <w:tcBorders>
+              <w:top w:val="single" w:color="5B6B8C" w:sz="8"/>
+              <w:left w:val="single" w:color="5B6B8C" w:sz="8"/>
+              <w:bottom w:val="single" w:color="5B6B8C" w:sz="8"/>
+              <w:right w:val="single" w:color="5B6B8C" w:sz="8"/>
+            </w:tcBorders>
+            <w:shd w:fill="FFFFFF" w:color="auto" w:val="clear"/>
+            <w:tcMar>
+              <w:top w:type="dxa" w:w="40"/>
+              <w:left w:type="dxa" w:w="90"/>
+              <w:bottom w:type="dxa" w:w="40"/>
+              <w:right w:type="dxa" w:w="90"/>
+            </w:tcMar>
+            <w:vAlign w:val="top"/>
+          </w:tcPr>
+          <w:p>
+            <w:pPr>
+              <w:spacing w:after="0" w:before="0"/>
+            </w:pPr>
+            <w:r>
+              <w:rPr>
+                <w:rFonts w:ascii="Calibri" w:cs="Calibri" w:eastAsia="Calibri" w:hAnsi="Calibri"/>
+                <w:b/>
+                <w:bCs/>
+                <w:color w:val="1E2761"/>
+                <w:sz w:val="16"/>
+                <w:szCs w:val="16"/>
+              </w:rPr>
+              <w:t xml:space="preserve">6</w:t>
+            </w:r>
+          </w:p>
+        </w:tc>
+        <w:tc>
+          <w:tcPr>
+            <w:tcW w:type="dxa" w:w="4900"/>
+            <w:tcBorders>
+              <w:top w:val="single" w:color="5B6B8C" w:sz="8"/>
+              <w:left w:val="single" w:color="5B6B8C" w:sz="8"/>
+              <w:bottom w:val="single" w:color="5B6B8C" w:sz="8"/>
+              <w:right w:val="single" w:color="5B6B8C" w:sz="8"/>
+            </w:tcBorders>
+            <w:shd w:fill="FFFFFF" w:color="auto" w:val="clear"/>
+            <w:tcMar>
+              <w:top w:type="dxa" w:w="40"/>
+              <w:left w:type="dxa" w:w="90"/>
+              <w:bottom w:type="dxa" w:w="40"/>
+              <w:right w:type="dxa" w:w="90"/>
+            </w:tcMar>
+            <w:vAlign w:val="top"/>
+          </w:tcPr>
+          <w:p>
+            <w:pPr>
+              <w:spacing w:after="0" w:before="0"/>
+            </w:pPr>
+            <w:r>
+              <w:rPr>
+                <w:rFonts w:ascii="Calibri" w:cs="Calibri" w:eastAsia="Calibri" w:hAnsi="Calibri"/>
+                <w:b w:val="false"/>
+                <w:bCs w:val="false"/>
+                <w:color w:val="000000"/>
+                <w:sz w:val="16"/>
+                <w:szCs w:val="16"/>
+              </w:rPr>
+              <w:t xml:space="preserve">Ludwig XVI.: Soll ich aus Paris fliehen?</w:t>
+            </w:r>
+          </w:p>
+        </w:tc>
+        <w:tc>
+          <w:tcPr>
+            <w:tcW w:type="dxa" w:w="2750"/>
+            <w:tcBorders>
+              <w:top w:val="single" w:color="5B6B8C" w:sz="8"/>
+              <w:left w:val="single" w:color="5B6B8C" w:sz="8"/>
+              <w:bottom w:val="single" w:color="5B6B8C" w:sz="8"/>
+              <w:right w:val="single" w:color="5B6B8C" w:sz="8"/>
+            </w:tcBorders>
+            <w:shd w:fill="FFFFFF" w:color="auto" w:val="clear"/>
+            <w:tcMar>
+              <w:top w:type="dxa" w:w="40"/>
+              <w:left w:type="dxa" w:w="90"/>
+              <w:bottom w:type="dxa" w:w="40"/>
+              <w:right w:type="dxa" w:w="90"/>
+            </w:tcMar>
+            <w:vAlign w:val="top"/>
+          </w:tcPr>
+          <w:p>
+            <w:pPr>
+              <w:spacing w:after="0" w:before="0"/>
+            </w:pPr>
+            <w:r>
+              <w:rPr>
+                <w:rFonts w:ascii="Calibri" w:cs="Calibri" w:eastAsia="Calibri" w:hAnsi="Calibri"/>
+                <w:b w:val="false"/>
+                <w:bCs w:val="false"/>
+                <w:color w:val="000000"/>
+                <w:sz w:val="16"/>
+                <w:szCs w:val="16"/>
+              </w:rPr>
+              <w:t xml:space="preserve">Fehlertext zu Stunde 5/Verfassung</w:t>
+            </w:r>
+          </w:p>
+        </w:tc>
+        <w:tc>
+          <w:tcPr>
+            <w:tcW w:type="dxa" w:w="3850"/>
+            <w:tcBorders>
+              <w:top w:val="single" w:color="5B6B8C" w:sz="8"/>
+              <w:left w:val="single" w:color="5B6B8C" w:sz="8"/>
+              <w:bottom w:val="single" w:color="5B6B8C" w:sz="8"/>
+              <w:right w:val="single" w:color="5B6B8C" w:sz="8"/>
+            </w:tcBorders>
+            <w:shd w:fill="FFFFFF" w:color="auto" w:val="clear"/>
+            <w:tcMar>
+              <w:top w:type="dxa" w:w="40"/>
+              <w:left w:type="dxa" w:w="90"/>
+              <w:bottom w:type="dxa" w:w="40"/>
+              <w:right w:type="dxa" w:w="90"/>
+            </w:tcMar>
+            <w:vAlign w:val="top"/>
+          </w:tcPr>
+          <w:p>
+            <w:pPr>
+              <w:spacing w:after="0" w:before="0"/>
+            </w:pPr>
+            <w:r>
+              <w:rPr>
+                <w:rFonts w:ascii="Calibri" w:cs="Calibri" w:eastAsia="Calibri" w:hAnsi="Calibri"/>
+                <w:b w:val="false"/>
+                <w:bCs w:val="false"/>
+                <w:color w:val="000000"/>
+                <w:sz w:val="16"/>
+                <w:szCs w:val="16"/>
+              </w:rPr>
+              <w:t xml:space="preserve">Mystery (erst nach der Rückmeldung zu Kleisthenes entscheiden); Ursache-Folge-Kette</w:t>
+            </w:r>
+          </w:p>
+        </w:tc>
+        <w:tc>
+          <w:tcPr>
+            <w:tcW w:type="dxa" w:w="3288"/>
+            <w:tcBorders>
+              <w:top w:val="single" w:color="5B6B8C" w:sz="8"/>
+              <w:left w:val="single" w:color="5B6B8C" w:sz="8"/>
+              <w:bottom w:val="single" w:color="5B6B8C" w:sz="8"/>
+              <w:right w:val="single" w:color="5B6B8C" w:sz="8"/>
+            </w:tcBorders>
+            <w:shd w:fill="FFFFFF" w:color="auto" w:val="clear"/>
+            <w:tcMar>
+              <w:top w:type="dxa" w:w="40"/>
+              <w:left w:type="dxa" w:w="90"/>
+              <w:bottom w:type="dxa" w:w="40"/>
+              <w:right w:type="dxa" w:w="90"/>
+            </w:tcMar>
+            <w:vAlign w:val="top"/>
+          </w:tcPr>
+          <w:p>
+            <w:pPr>
+              <w:spacing w:after="0" w:before="0"/>
+            </w:pPr>
+            <w:r>
+              <w:rPr>
+                <w:rFonts w:ascii="Calibri" w:cs="Calibri" w:eastAsia="Calibri" w:hAnsi="Calibri"/>
+                <w:b w:val="false"/>
+                <w:bCs w:val="false"/>
+                <w:color w:val="000000"/>
+                <w:sz w:val="16"/>
+                <w:szCs w:val="16"/>
+              </w:rPr>
+              <w:t xml:space="preserve">S. 114, 118/119</w:t>
+            </w:r>
+          </w:p>
+        </w:tc>
+      </w:tr>
+      <w:tr>
+        <w:trPr>
+          <w:cantSplit/>
+        </w:trPr>
+        <w:tc>
+          <w:tcPr>
+            <w:tcW w:type="dxa" w:w="650"/>
+            <w:tcBorders>
+              <w:top w:val="single" w:color="5B6B8C" w:sz="8"/>
+              <w:left w:val="single" w:color="5B6B8C" w:sz="8"/>
+              <w:bottom w:val="single" w:color="5B6B8C" w:sz="8"/>
+              <w:right w:val="single" w:color="5B6B8C" w:sz="8"/>
+            </w:tcBorders>
+            <w:shd w:fill="F4F7FD" w:color="auto" w:val="clear"/>
+            <w:tcMar>
+              <w:top w:type="dxa" w:w="40"/>
+              <w:left w:type="dxa" w:w="90"/>
+              <w:bottom w:type="dxa" w:w="40"/>
+              <w:right w:type="dxa" w:w="90"/>
+            </w:tcMar>
+            <w:vAlign w:val="top"/>
+          </w:tcPr>
+          <w:p>
+            <w:pPr>
+              <w:spacing w:after="0" w:before="0"/>
+            </w:pPr>
+            <w:r>
+              <w:rPr>
+                <w:rFonts w:ascii="Calibri" w:cs="Calibri" w:eastAsia="Calibri" w:hAnsi="Calibri"/>
+                <w:b/>
+                <w:bCs/>
+                <w:color w:val="1E2761"/>
+                <w:sz w:val="16"/>
+                <w:szCs w:val="16"/>
+              </w:rPr>
+              <w:t xml:space="preserve">7</w:t>
+            </w:r>
+          </w:p>
+        </w:tc>
+        <w:tc>
+          <w:tcPr>
+            <w:tcW w:type="dxa" w:w="4900"/>
+            <w:tcBorders>
+              <w:top w:val="single" w:color="5B6B8C" w:sz="8"/>
+              <w:left w:val="single" w:color="5B6B8C" w:sz="8"/>
+              <w:bottom w:val="single" w:color="5B6B8C" w:sz="8"/>
+              <w:right w:val="single" w:color="5B6B8C" w:sz="8"/>
+            </w:tcBorders>
+            <w:shd w:fill="F4F7FD" w:color="auto" w:val="clear"/>
+            <w:tcMar>
+              <w:top w:type="dxa" w:w="40"/>
+              <w:left w:type="dxa" w:w="90"/>
+              <w:bottom w:type="dxa" w:w="40"/>
+              <w:right w:type="dxa" w:w="90"/>
+            </w:tcMar>
+            <w:vAlign w:val="top"/>
+          </w:tcPr>
+          <w:p>
+            <w:pPr>
+              <w:spacing w:after="0" w:before="0"/>
+            </w:pPr>
+            <w:r>
+              <w:rPr>
+                <w:rFonts w:ascii="Calibri" w:cs="Calibri" w:eastAsia="Calibri" w:hAnsi="Calibri"/>
+                <w:b w:val="false"/>
+                <w:bCs w:val="false"/>
+                <w:color w:val="000000"/>
+                <w:sz w:val="16"/>
+                <w:szCs w:val="16"/>
+              </w:rPr>
+              <w:t xml:space="preserve">Robespierre oder Abgeordneter: Soll der Wohlfahrtsausschuss noch mehr Macht bekommen?</w:t>
+            </w:r>
+          </w:p>
+        </w:tc>
+        <w:tc>
+          <w:tcPr>
+            <w:tcW w:type="dxa" w:w="2750"/>
+            <w:tcBorders>
+              <w:top w:val="single" w:color="5B6B8C" w:sz="8"/>
+              <w:left w:val="single" w:color="5B6B8C" w:sz="8"/>
+              <w:bottom w:val="single" w:color="5B6B8C" w:sz="8"/>
+              <w:right w:val="single" w:color="5B6B8C" w:sz="8"/>
+            </w:tcBorders>
+            <w:shd w:fill="F4F7FD" w:color="auto" w:val="clear"/>
+            <w:tcMar>
+              <w:top w:type="dxa" w:w="40"/>
+              <w:left w:type="dxa" w:w="90"/>
+              <w:bottom w:type="dxa" w:w="40"/>
+              <w:right w:type="dxa" w:w="90"/>
+            </w:tcMar>
+            <w:vAlign w:val="top"/>
+          </w:tcPr>
+          <w:p>
+            <w:pPr>
+              <w:spacing w:after="0" w:before="0"/>
+            </w:pPr>
+            <w:r>
+              <w:rPr>
+                <w:rFonts w:ascii="Calibri" w:cs="Calibri" w:eastAsia="Calibri" w:hAnsi="Calibri"/>
+                <w:b w:val="false"/>
+                <w:bCs w:val="false"/>
+                <w:color w:val="000000"/>
+                <w:sz w:val="16"/>
+                <w:szCs w:val="16"/>
+              </w:rPr>
+              <w:t xml:space="preserve">Falschbehauptungen zum König</w:t>
+            </w:r>
+          </w:p>
+        </w:tc>
+        <w:tc>
+          <w:tcPr>
+            <w:tcW w:type="dxa" w:w="3850"/>
+            <w:tcBorders>
+              <w:top w:val="single" w:color="5B6B8C" w:sz="8"/>
+              <w:left w:val="single" w:color="5B6B8C" w:sz="8"/>
+              <w:bottom w:val="single" w:color="5B6B8C" w:sz="8"/>
+              <w:right w:val="single" w:color="5B6B8C" w:sz="8"/>
+            </w:tcBorders>
+            <w:shd w:fill="F4F7FD" w:color="auto" w:val="clear"/>
+            <w:tcMar>
+              <w:top w:type="dxa" w:w="40"/>
+              <w:left w:type="dxa" w:w="90"/>
+              <w:bottom w:type="dxa" w:w="40"/>
+              <w:right w:type="dxa" w:w="90"/>
+            </w:tcMar>
+            <w:vAlign w:val="top"/>
+          </w:tcPr>
+          <w:p>
+            <w:pPr>
+              <w:spacing w:after="0" w:before="0"/>
+            </w:pPr>
+            <w:r>
+              <w:rPr>
+                <w:rFonts w:ascii="Calibri" w:cs="Calibri" w:eastAsia="Calibri" w:hAnsi="Calibri"/>
+                <w:b w:val="false"/>
+                <w:bCs w:val="false"/>
+                <w:color w:val="000000"/>
+                <w:sz w:val="16"/>
+                <w:szCs w:val="16"/>
+              </w:rPr>
+              <w:t xml:space="preserve">Diamond Nine zum Terror; Zahlenjagd Statistik; Karikatur-Methode wiederholen</w:t>
+            </w:r>
+          </w:p>
+        </w:tc>
+        <w:tc>
+          <w:tcPr>
+            <w:tcW w:type="dxa" w:w="3288"/>
+            <w:tcBorders>
+              <w:top w:val="single" w:color="5B6B8C" w:sz="8"/>
+              <w:left w:val="single" w:color="5B6B8C" w:sz="8"/>
+              <w:bottom w:val="single" w:color="5B6B8C" w:sz="8"/>
+              <w:right w:val="single" w:color="5B6B8C" w:sz="8"/>
+            </w:tcBorders>
+            <w:shd w:fill="F4F7FD" w:color="auto" w:val="clear"/>
+            <w:tcMar>
+              <w:top w:type="dxa" w:w="40"/>
+              <w:left w:type="dxa" w:w="90"/>
+              <w:bottom w:type="dxa" w:w="40"/>
+              <w:right w:type="dxa" w:w="90"/>
+            </w:tcMar>
+            <w:vAlign w:val="top"/>
+          </w:tcPr>
+          <w:p>
+            <w:pPr>
+              <w:spacing w:after="0" w:before="0"/>
+            </w:pPr>
+            <w:r>
+              <w:rPr>
+                <w:rFonts w:ascii="Calibri" w:cs="Calibri" w:eastAsia="Calibri" w:hAnsi="Calibri"/>
+                <w:b w:val="false"/>
+                <w:bCs w:val="false"/>
+                <w:color w:val="000000"/>
+                <w:sz w:val="16"/>
+                <w:szCs w:val="16"/>
+              </w:rPr>
+              <w:t xml:space="preserve">S. 120/121 (Statistik M2, Robespierre als Henker)</w:t>
+            </w:r>
+          </w:p>
+        </w:tc>
+      </w:tr>
+      <w:tr>
+        <w:trPr>
+          <w:cantSplit/>
+        </w:trPr>
+        <w:tc>
+          <w:tcPr>
+            <w:tcW w:type="dxa" w:w="650"/>
+            <w:tcBorders>
+              <w:top w:val="single" w:color="5B6B8C" w:sz="8"/>
+              <w:left w:val="single" w:color="5B6B8C" w:sz="8"/>
+              <w:bottom w:val="single" w:color="5B6B8C" w:sz="8"/>
+              <w:right w:val="single" w:color="5B6B8C" w:sz="8"/>
+            </w:tcBorders>
+            <w:shd w:fill="FFFFFF" w:color="auto" w:val="clear"/>
+            <w:tcMar>
+              <w:top w:type="dxa" w:w="40"/>
+              <w:left w:type="dxa" w:w="90"/>
+              <w:bottom w:type="dxa" w:w="40"/>
+              <w:right w:type="dxa" w:w="90"/>
+            </w:tcMar>
+            <w:vAlign w:val="top"/>
+          </w:tcPr>
+          <w:p>
+            <w:pPr>
+              <w:spacing w:after="0" w:before="0"/>
+            </w:pPr>
+            <w:r>
+              <w:rPr>
+                <w:rFonts w:ascii="Calibri" w:cs="Calibri" w:eastAsia="Calibri" w:hAnsi="Calibri"/>
+                <w:b/>
+                <w:bCs/>
+                <w:color w:val="1E2761"/>
+                <w:sz w:val="16"/>
+                <w:szCs w:val="16"/>
+              </w:rPr>
+              <w:t xml:space="preserve">8</w:t>
+            </w:r>
+          </w:p>
+        </w:tc>
+        <w:tc>
+          <w:tcPr>
+            <w:tcW w:type="dxa" w:w="4900"/>
+            <w:tcBorders>
+              <w:top w:val="single" w:color="5B6B8C" w:sz="8"/>
+              <w:left w:val="single" w:color="5B6B8C" w:sz="8"/>
+              <w:bottom w:val="single" w:color="5B6B8C" w:sz="8"/>
+              <w:right w:val="single" w:color="5B6B8C" w:sz="8"/>
+            </w:tcBorders>
+            <w:shd w:fill="FFFFFF" w:color="auto" w:val="clear"/>
+            <w:tcMar>
+              <w:top w:type="dxa" w:w="40"/>
+              <w:left w:type="dxa" w:w="90"/>
+              <w:bottom w:type="dxa" w:w="40"/>
+              <w:right w:type="dxa" w:w="90"/>
+            </w:tcMar>
+            <w:vAlign w:val="top"/>
+          </w:tcPr>
+          <w:p>
+            <w:pPr>
+              <w:spacing w:after="0" w:before="0"/>
+            </w:pPr>
+            <w:r>
+              <w:rPr>
+                <w:rFonts w:ascii="Calibri" w:cs="Calibri" w:eastAsia="Calibri" w:hAnsi="Calibri"/>
+                <w:b w:val="false"/>
+                <w:bCs w:val="false"/>
+                <w:color w:val="000000"/>
+                <w:sz w:val="16"/>
+                <w:szCs w:val="16"/>
+              </w:rPr>
+              <w:t xml:space="preserve">Direktorium: Sollen wir General Bonaparte um Hilfe bitten?</w:t>
+            </w:r>
+          </w:p>
+        </w:tc>
+        <w:tc>
+          <w:tcPr>
+            <w:tcW w:type="dxa" w:w="2750"/>
+            <w:tcBorders>
+              <w:top w:val="single" w:color="5B6B8C" w:sz="8"/>
+              <w:left w:val="single" w:color="5B6B8C" w:sz="8"/>
+              <w:bottom w:val="single" w:color="5B6B8C" w:sz="8"/>
+              <w:right w:val="single" w:color="5B6B8C" w:sz="8"/>
+            </w:tcBorders>
+            <w:shd w:fill="FFFFFF" w:color="auto" w:val="clear"/>
+            <w:tcMar>
+              <w:top w:type="dxa" w:w="40"/>
+              <w:left w:type="dxa" w:w="90"/>
+              <w:bottom w:type="dxa" w:w="40"/>
+              <w:right w:type="dxa" w:w="90"/>
+            </w:tcMar>
+            <w:vAlign w:val="top"/>
+          </w:tcPr>
+          <w:p>
+            <w:pPr>
+              <w:spacing w:after="0" w:before="0"/>
+            </w:pPr>
+            <w:r>
+              <w:rPr>
+                <w:rFonts w:ascii="Calibri" w:cs="Calibri" w:eastAsia="Calibri" w:hAnsi="Calibri"/>
+                <w:b w:val="false"/>
+                <w:bCs w:val="false"/>
+                <w:color w:val="000000"/>
+                <w:sz w:val="16"/>
+                <w:szCs w:val="16"/>
+              </w:rPr>
+              <w:t xml:space="preserve">Fehlertext zu Terror und Ende</w:t>
+            </w:r>
+          </w:p>
+        </w:tc>
+        <w:tc>
+          <w:tcPr>
+            <w:tcW w:type="dxa" w:w="3850"/>
+            <w:tcBorders>
+              <w:top w:val="single" w:color="5B6B8C" w:sz="8"/>
+              <w:left w:val="single" w:color="5B6B8C" w:sz="8"/>
+              <w:bottom w:val="single" w:color="5B6B8C" w:sz="8"/>
+              <w:right w:val="single" w:color="5B6B8C" w:sz="8"/>
+            </w:tcBorders>
+            <w:shd w:fill="FFFFFF" w:color="auto" w:val="clear"/>
+            <w:tcMar>
+              <w:top w:type="dxa" w:w="40"/>
+              <w:left w:type="dxa" w:w="90"/>
+              <w:bottom w:type="dxa" w:w="40"/>
+              <w:right w:type="dxa" w:w="90"/>
+            </w:tcMar>
+            <w:vAlign w:val="top"/>
+          </w:tcPr>
+          <w:p>
+            <w:pPr>
+              <w:spacing w:after="0" w:before="0"/>
+            </w:pPr>
+            <w:r>
+              <w:rPr>
+                <w:rFonts w:ascii="Calibri" w:cs="Calibri" w:eastAsia="Calibri" w:hAnsi="Calibri"/>
+                <w:b w:val="false"/>
+                <w:bCs w:val="false"/>
+                <w:color w:val="000000"/>
+                <w:sz w:val="16"/>
+                <w:szCs w:val="16"/>
+              </w:rPr>
+              <w:t xml:space="preserve">Textpuzzle oder Wahr/falsch mit Beleg</w:t>
+            </w:r>
+          </w:p>
+        </w:tc>
+        <w:tc>
+          <w:tcPr>
+            <w:tcW w:type="dxa" w:w="3288"/>
+            <w:tcBorders>
+              <w:top w:val="single" w:color="5B6B8C" w:sz="8"/>
+              <w:left w:val="single" w:color="5B6B8C" w:sz="8"/>
+              <w:bottom w:val="single" w:color="5B6B8C" w:sz="8"/>
+              <w:right w:val="single" w:color="5B6B8C" w:sz="8"/>
+            </w:tcBorders>
+            <w:shd w:fill="FFFFFF" w:color="auto" w:val="clear"/>
+            <w:tcMar>
+              <w:top w:type="dxa" w:w="40"/>
+              <w:left w:type="dxa" w:w="90"/>
+              <w:bottom w:type="dxa" w:w="40"/>
+              <w:right w:type="dxa" w:w="90"/>
+            </w:tcMar>
+            <w:vAlign w:val="top"/>
+          </w:tcPr>
+          <w:p>
+            <w:pPr>
+              <w:spacing w:after="0" w:before="0"/>
+            </w:pPr>
+            <w:r>
+              <w:rPr>
+                <w:rFonts w:ascii="Calibri" w:cs="Calibri" w:eastAsia="Calibri" w:hAnsi="Calibri"/>
+                <w:b w:val="false"/>
+                <w:bCs w:val="false"/>
+                <w:color w:val="000000"/>
+                <w:sz w:val="16"/>
+                <w:szCs w:val="16"/>
+              </w:rPr>
+              <w:t xml:space="preserve">S. 124</w:t>
+            </w:r>
+          </w:p>
+        </w:tc>
+      </w:tr>
+      <w:tr>
+        <w:trPr>
+          <w:cantSplit/>
+        </w:trPr>
+        <w:tc>
+          <w:tcPr>
+            <w:tcW w:type="dxa" w:w="650"/>
+            <w:tcBorders>
+              <w:top w:val="single" w:color="5B6B8C" w:sz="8"/>
+              <w:left w:val="single" w:color="5B6B8C" w:sz="8"/>
+              <w:bottom w:val="single" w:color="5B6B8C" w:sz="8"/>
+              <w:right w:val="single" w:color="5B6B8C" w:sz="8"/>
+            </w:tcBorders>
+            <w:shd w:fill="F4F7FD" w:color="auto" w:val="clear"/>
+            <w:tcMar>
+              <w:top w:type="dxa" w:w="40"/>
+              <w:left w:type="dxa" w:w="90"/>
+              <w:bottom w:type="dxa" w:w="40"/>
+              <w:right w:type="dxa" w:w="90"/>
+            </w:tcMar>
+            <w:vAlign w:val="top"/>
+          </w:tcPr>
+          <w:p>
+            <w:pPr>
+              <w:spacing w:after="0" w:before="0"/>
+            </w:pPr>
+            <w:r>
+              <w:rPr>
+                <w:rFonts w:ascii="Calibri" w:cs="Calibri" w:eastAsia="Calibri" w:hAnsi="Calibri"/>
+                <w:b/>
+                <w:bCs/>
+                <w:color w:val="1E2761"/>
+                <w:sz w:val="16"/>
+                <w:szCs w:val="16"/>
+              </w:rPr>
+              <w:t xml:space="preserve">9</w:t>
+            </w:r>
+          </w:p>
+        </w:tc>
+        <w:tc>
+          <w:tcPr>
+            <w:tcW w:type="dxa" w:w="4900"/>
+            <w:tcBorders>
+              <w:top w:val="single" w:color="5B6B8C" w:sz="8"/>
+              <w:left w:val="single" w:color="5B6B8C" w:sz="8"/>
+              <w:bottom w:val="single" w:color="5B6B8C" w:sz="8"/>
+              <w:right w:val="single" w:color="5B6B8C" w:sz="8"/>
+            </w:tcBorders>
+            <w:shd w:fill="F4F7FD" w:color="auto" w:val="clear"/>
+            <w:tcMar>
+              <w:top w:type="dxa" w:w="40"/>
+              <w:left w:type="dxa" w:w="90"/>
+              <w:bottom w:type="dxa" w:w="40"/>
+              <w:right w:type="dxa" w:w="90"/>
+            </w:tcMar>
+            <w:vAlign w:val="top"/>
+          </w:tcPr>
+          <w:p>
+            <w:pPr>
+              <w:spacing w:after="0" w:before="0"/>
+            </w:pPr>
+            <w:r>
+              <w:rPr>
+                <w:rFonts w:ascii="Calibri" w:cs="Calibri" w:eastAsia="Calibri" w:hAnsi="Calibri"/>
+                <w:b w:val="false"/>
+                <w:bCs w:val="false"/>
+                <w:color w:val="000000"/>
+                <w:sz w:val="16"/>
+                <w:szCs w:val="16"/>
+              </w:rPr>
+              <w:t xml:space="preserve">Napoleon: Soll ich 1812 nach Russland marschieren?</w:t>
+            </w:r>
+          </w:p>
+        </w:tc>
+        <w:tc>
+          <w:tcPr>
+            <w:tcW w:type="dxa" w:w="2750"/>
+            <w:tcBorders>
+              <w:top w:val="single" w:color="5B6B8C" w:sz="8"/>
+              <w:left w:val="single" w:color="5B6B8C" w:sz="8"/>
+              <w:bottom w:val="single" w:color="5B6B8C" w:sz="8"/>
+              <w:right w:val="single" w:color="5B6B8C" w:sz="8"/>
+            </w:tcBorders>
+            <w:shd w:fill="F4F7FD" w:color="auto" w:val="clear"/>
+            <w:tcMar>
+              <w:top w:type="dxa" w:w="40"/>
+              <w:left w:type="dxa" w:w="90"/>
+              <w:bottom w:type="dxa" w:w="40"/>
+              <w:right w:type="dxa" w:w="90"/>
+            </w:tcMar>
+            <w:vAlign w:val="top"/>
+          </w:tcPr>
+          <w:p>
+            <w:pPr>
+              <w:spacing w:after="0" w:before="0"/>
+            </w:pPr>
+            <w:r>
+              <w:rPr>
+                <w:rFonts w:ascii="Calibri" w:cs="Calibri" w:eastAsia="Calibri" w:hAnsi="Calibri"/>
+                <w:b w:val="false"/>
+                <w:bCs w:val="false"/>
+                <w:color w:val="000000"/>
+                <w:sz w:val="16"/>
+                <w:szCs w:val="16"/>
+              </w:rPr>
+              <w:t xml:space="preserve">Falschbehauptungen zu Napoleons Aufstieg</w:t>
+            </w:r>
+          </w:p>
+        </w:tc>
+        <w:tc>
+          <w:tcPr>
+            <w:tcW w:type="dxa" w:w="3850"/>
+            <w:tcBorders>
+              <w:top w:val="single" w:color="5B6B8C" w:sz="8"/>
+              <w:left w:val="single" w:color="5B6B8C" w:sz="8"/>
+              <w:bottom w:val="single" w:color="5B6B8C" w:sz="8"/>
+              <w:right w:val="single" w:color="5B6B8C" w:sz="8"/>
+            </w:tcBorders>
+            <w:shd w:fill="F4F7FD" w:color="auto" w:val="clear"/>
+            <w:tcMar>
+              <w:top w:type="dxa" w:w="40"/>
+              <w:left w:type="dxa" w:w="90"/>
+              <w:bottom w:type="dxa" w:w="40"/>
+              <w:right w:type="dxa" w:w="90"/>
+            </w:tcMar>
+            <w:vAlign w:val="top"/>
+          </w:tcPr>
+          <w:p>
+            <w:pPr>
+              <w:spacing w:after="0" w:before="0"/>
+            </w:pPr>
+            <w:r>
+              <w:rPr>
+                <w:rFonts w:ascii="Calibri" w:cs="Calibri" w:eastAsia="Calibri" w:hAnsi="Calibri"/>
+                <w:b w:val="false"/>
+                <w:bCs w:val="false"/>
+                <w:color w:val="000000"/>
+                <w:sz w:val="16"/>
+                <w:szCs w:val="16"/>
+              </w:rPr>
+              <w:t xml:space="preserve">Einordnen zwischen zwei Polen („Erbe der Revolution ↔ Verrat“) als angeleitetes Urteil</w:t>
+            </w:r>
+          </w:p>
+        </w:tc>
+        <w:tc>
+          <w:tcPr>
+            <w:tcW w:type="dxa" w:w="3288"/>
+            <w:tcBorders>
+              <w:top w:val="single" w:color="5B6B8C" w:sz="8"/>
+              <w:left w:val="single" w:color="5B6B8C" w:sz="8"/>
+              <w:bottom w:val="single" w:color="5B6B8C" w:sz="8"/>
+              <w:right w:val="single" w:color="5B6B8C" w:sz="8"/>
+            </w:tcBorders>
+            <w:shd w:fill="F4F7FD" w:color="auto" w:val="clear"/>
+            <w:tcMar>
+              <w:top w:type="dxa" w:w="40"/>
+              <w:left w:type="dxa" w:w="90"/>
+              <w:bottom w:type="dxa" w:w="40"/>
+              <w:right w:type="dxa" w:w="90"/>
+            </w:tcMar>
+            <w:vAlign w:val="top"/>
+          </w:tcPr>
+          <w:p>
+            <w:pPr>
+              <w:spacing w:after="0" w:before="0"/>
+            </w:pPr>
+            <w:r>
+              <w:rPr>
+                <w:rFonts w:ascii="Calibri" w:cs="Calibri" w:eastAsia="Calibri" w:hAnsi="Calibri"/>
+                <w:b w:val="false"/>
+                <w:bCs w:val="false"/>
+                <w:color w:val="000000"/>
+                <w:sz w:val="16"/>
+                <w:szCs w:val="16"/>
+              </w:rPr>
+              <w:t xml:space="preserve">S. 124/125, 128</w:t>
+            </w:r>
+          </w:p>
+        </w:tc>
+      </w:tr>
+      <w:tr>
+        <w:trPr>
+          <w:cantSplit/>
+        </w:trPr>
+        <w:tc>
+          <w:tcPr>
+            <w:tcW w:type="dxa" w:w="650"/>
+            <w:tcBorders>
+              <w:top w:val="single" w:color="5B6B8C" w:sz="8"/>
+              <w:left w:val="single" w:color="5B6B8C" w:sz="8"/>
+              <w:bottom w:val="single" w:color="5B6B8C" w:sz="8"/>
+              <w:right w:val="single" w:color="5B6B8C" w:sz="8"/>
+            </w:tcBorders>
+            <w:shd w:fill="FCEFEE" w:color="auto" w:val="clear"/>
+            <w:tcMar>
+              <w:top w:type="dxa" w:w="40"/>
+              <w:left w:type="dxa" w:w="90"/>
+              <w:bottom w:type="dxa" w:w="40"/>
+              <w:right w:type="dxa" w:w="90"/>
+            </w:tcMar>
+            <w:vAlign w:val="top"/>
+          </w:tcPr>
+          <w:p>
+            <w:pPr>
+              <w:spacing w:after="0" w:before="0"/>
+            </w:pPr>
+            <w:r>
+              <w:rPr>
+                <w:rFonts w:ascii="Calibri" w:cs="Calibri" w:eastAsia="Calibri" w:hAnsi="Calibri"/>
+                <w:b/>
+                <w:bCs/>
+                <w:color w:val="1E2761"/>
+                <w:sz w:val="16"/>
+                <w:szCs w:val="16"/>
+              </w:rPr>
+              <w:t xml:space="preserve">10</w:t>
+            </w:r>
+          </w:p>
+        </w:tc>
+        <w:tc>
+          <w:tcPr>
+            <w:tcW w:type="dxa" w:w="4900"/>
+            <w:tcBorders>
+              <w:top w:val="single" w:color="5B6B8C" w:sz="8"/>
+              <w:left w:val="single" w:color="5B6B8C" w:sz="8"/>
+              <w:bottom w:val="single" w:color="5B6B8C" w:sz="8"/>
+              <w:right w:val="single" w:color="5B6B8C" w:sz="8"/>
+            </w:tcBorders>
+            <w:shd w:fill="FCEFEE" w:color="auto" w:val="clear"/>
+            <w:tcMar>
+              <w:top w:type="dxa" w:w="40"/>
+              <w:left w:type="dxa" w:w="90"/>
+              <w:bottom w:type="dxa" w:w="40"/>
+              <w:right w:type="dxa" w:w="90"/>
+            </w:tcMar>
+            <w:vAlign w:val="top"/>
+          </w:tcPr>
+          <w:p>
+            <w:pPr>
+              <w:spacing w:after="0" w:before="0"/>
+            </w:pPr>
+            <w:r>
+              <w:rPr>
+                <w:rFonts w:ascii="Calibri" w:cs="Calibri" w:eastAsia="Calibri" w:hAnsi="Calibri"/>
+                <w:b w:val="false"/>
+                <w:bCs w:val="false"/>
+                <w:color w:val="000000"/>
+                <w:sz w:val="16"/>
+                <w:szCs w:val="16"/>
+              </w:rPr>
+              <w:t xml:space="preserve">Test 2: Urteilsaufgabe mit bekannten Kriterien</w:t>
+            </w:r>
+          </w:p>
+        </w:tc>
+        <w:tc>
+          <w:tcPr>
+            <w:tcW w:type="dxa" w:w="2750"/>
+            <w:tcBorders>
+              <w:top w:val="single" w:color="5B6B8C" w:sz="8"/>
+              <w:left w:val="single" w:color="5B6B8C" w:sz="8"/>
+              <w:bottom w:val="single" w:color="5B6B8C" w:sz="8"/>
+              <w:right w:val="single" w:color="5B6B8C" w:sz="8"/>
+            </w:tcBorders>
+            <w:shd w:fill="FCEFEE" w:color="auto" w:val="clear"/>
+            <w:tcMar>
+              <w:top w:type="dxa" w:w="40"/>
+              <w:left w:type="dxa" w:w="90"/>
+              <w:bottom w:type="dxa" w:w="40"/>
+              <w:right w:type="dxa" w:w="90"/>
+            </w:tcMar>
+            <w:vAlign w:val="top"/>
+          </w:tcPr>
+          <w:p>
+            <w:pPr>
+              <w:spacing w:after="0" w:before="0"/>
+            </w:pPr>
+            <w:r>
+              <w:rPr>
+                <w:rFonts w:ascii="Calibri" w:cs="Calibri" w:eastAsia="Calibri" w:hAnsi="Calibri"/>
+                <w:b w:val="false"/>
+                <w:bCs w:val="false"/>
+                <w:color w:val="000000"/>
+                <w:sz w:val="16"/>
+                <w:szCs w:val="16"/>
+              </w:rPr>
+              <w:t xml:space="preserve">–</w:t>
+            </w:r>
+          </w:p>
+        </w:tc>
+        <w:tc>
+          <w:tcPr>
+            <w:tcW w:type="dxa" w:w="3850"/>
+            <w:tcBorders>
+              <w:top w:val="single" w:color="5B6B8C" w:sz="8"/>
+              <w:left w:val="single" w:color="5B6B8C" w:sz="8"/>
+              <w:bottom w:val="single" w:color="5B6B8C" w:sz="8"/>
+              <w:right w:val="single" w:color="5B6B8C" w:sz="8"/>
+            </w:tcBorders>
+            <w:shd w:fill="FCEFEE" w:color="auto" w:val="clear"/>
+            <w:tcMar>
+              <w:top w:type="dxa" w:w="40"/>
+              <w:left w:type="dxa" w:w="90"/>
+              <w:bottom w:type="dxa" w:w="40"/>
+              <w:right w:type="dxa" w:w="90"/>
+            </w:tcMar>
+            <w:vAlign w:val="top"/>
+          </w:tcPr>
+          <w:p>
+            <w:pPr>
+              <w:spacing w:after="0" w:before="0"/>
+            </w:pPr>
+            <w:r>
+              <w:rPr>
+                <w:rFonts w:ascii="Calibri" w:cs="Calibri" w:eastAsia="Calibri" w:hAnsi="Calibri"/>
+                <w:b w:val="false"/>
+                <w:bCs w:val="false"/>
+                <w:color w:val="000000"/>
+                <w:sz w:val="16"/>
+                <w:szCs w:val="16"/>
+              </w:rPr>
+              <w:t xml:space="preserve">Vorbereitung: Fehlertext, Zeitstrahl</w:t>
+            </w:r>
+          </w:p>
+        </w:tc>
+        <w:tc>
+          <w:tcPr>
+            <w:tcW w:type="dxa" w:w="3288"/>
+            <w:tcBorders>
+              <w:top w:val="single" w:color="5B6B8C" w:sz="8"/>
+              <w:left w:val="single" w:color="5B6B8C" w:sz="8"/>
+              <w:bottom w:val="single" w:color="5B6B8C" w:sz="8"/>
+              <w:right w:val="single" w:color="5B6B8C" w:sz="8"/>
+            </w:tcBorders>
+            <w:shd w:fill="FCEFEE" w:color="auto" w:val="clear"/>
+            <w:tcMar>
+              <w:top w:type="dxa" w:w="40"/>
+              <w:left w:type="dxa" w:w="90"/>
+              <w:bottom w:type="dxa" w:w="40"/>
+              <w:right w:type="dxa" w:w="90"/>
+            </w:tcMar>
+            <w:vAlign w:val="top"/>
+          </w:tcPr>
+          <w:p>
+            <w:pPr>
+              <w:spacing w:after="0" w:before="0"/>
+            </w:pPr>
+            <w:r>
+              <w:rPr>
+                <w:rFonts w:ascii="Calibri" w:cs="Calibri" w:eastAsia="Calibri" w:hAnsi="Calibri"/>
+                <w:b w:val="false"/>
+                <w:bCs w:val="false"/>
+                <w:color w:val="000000"/>
+                <w:sz w:val="16"/>
+                <w:szCs w:val="16"/>
+              </w:rPr>
+              <w:t xml:space="preserve">–</w:t>
+            </w:r>
+          </w:p>
+        </w:tc>
+      </w:tr>
+      <w:tr>
+        <w:trPr>
+          <w:cantSplit/>
+        </w:trPr>
+        <w:tc>
+          <w:tcPr>
+            <w:tcW w:type="dxa" w:w="650"/>
+            <w:tcBorders>
+              <w:top w:val="single" w:color="5B6B8C" w:sz="8"/>
+              <w:left w:val="single" w:color="5B6B8C" w:sz="8"/>
+              <w:bottom w:val="single" w:color="5B6B8C" w:sz="8"/>
+              <w:right w:val="single" w:color="5B6B8C" w:sz="8"/>
+            </w:tcBorders>
+            <w:shd w:fill="F4F7FD" w:color="auto" w:val="clear"/>
+            <w:tcMar>
+              <w:top w:type="dxa" w:w="40"/>
+              <w:left w:type="dxa" w:w="90"/>
+              <w:bottom w:type="dxa" w:w="40"/>
+              <w:right w:type="dxa" w:w="90"/>
+            </w:tcMar>
+            <w:vAlign w:val="top"/>
+          </w:tcPr>
+          <w:p>
+            <w:pPr>
+              <w:spacing w:after="0" w:before="0"/>
+            </w:pPr>
+            <w:r>
+              <w:rPr>
+                <w:rFonts w:ascii="Calibri" w:cs="Calibri" w:eastAsia="Calibri" w:hAnsi="Calibri"/>
+                <w:b/>
+                <w:bCs/>
+                <w:color w:val="1E2761"/>
+                <w:sz w:val="16"/>
+                <w:szCs w:val="16"/>
+              </w:rPr>
+              <w:t xml:space="preserve">11</w:t>
+            </w:r>
+          </w:p>
+        </w:tc>
+        <w:tc>
+          <w:tcPr>
+            <w:tcW w:type="dxa" w:w="4900"/>
+            <w:tcBorders>
+              <w:top w:val="single" w:color="5B6B8C" w:sz="8"/>
+              <w:left w:val="single" w:color="5B6B8C" w:sz="8"/>
+              <w:bottom w:val="single" w:color="5B6B8C" w:sz="8"/>
+              <w:right w:val="single" w:color="5B6B8C" w:sz="8"/>
+            </w:tcBorders>
+            <w:shd w:fill="F4F7FD" w:color="auto" w:val="clear"/>
+            <w:tcMar>
+              <w:top w:type="dxa" w:w="40"/>
+              <w:left w:type="dxa" w:w="90"/>
+              <w:bottom w:type="dxa" w:w="40"/>
+              <w:right w:type="dxa" w:w="90"/>
+            </w:tcMar>
+            <w:vAlign w:val="top"/>
+          </w:tcPr>
+          <w:p>
+            <w:pPr>
+              <w:spacing w:after="0" w:before="0"/>
+            </w:pPr>
+            <w:r>
+              <w:rPr>
+                <w:rFonts w:ascii="Calibri" w:cs="Calibri" w:eastAsia="Calibri" w:hAnsi="Calibri"/>
+                <w:b w:val="false"/>
+                <w:bCs w:val="false"/>
+                <w:color w:val="000000"/>
+                <w:sz w:val="16"/>
+                <w:szCs w:val="16"/>
+              </w:rPr>
+              <w:t xml:space="preserve">Fürsten in Wien: Soll Frankreich bestraft werden?</w:t>
+            </w:r>
+          </w:p>
+        </w:tc>
+        <w:tc>
+          <w:tcPr>
+            <w:tcW w:type="dxa" w:w="2750"/>
+            <w:tcBorders>
+              <w:top w:val="single" w:color="5B6B8C" w:sz="8"/>
+              <w:left w:val="single" w:color="5B6B8C" w:sz="8"/>
+              <w:bottom w:val="single" w:color="5B6B8C" w:sz="8"/>
+              <w:right w:val="single" w:color="5B6B8C" w:sz="8"/>
+            </w:tcBorders>
+            <w:shd w:fill="F4F7FD" w:color="auto" w:val="clear"/>
+            <w:tcMar>
+              <w:top w:type="dxa" w:w="40"/>
+              <w:left w:type="dxa" w:w="90"/>
+              <w:bottom w:type="dxa" w:w="40"/>
+              <w:right w:type="dxa" w:w="90"/>
+            </w:tcMar>
+            <w:vAlign w:val="top"/>
+          </w:tcPr>
+          <w:p>
+            <w:pPr>
+              <w:spacing w:after="0" w:before="0"/>
+            </w:pPr>
+            <w:r>
+              <w:rPr>
+                <w:rFonts w:ascii="Calibri" w:cs="Calibri" w:eastAsia="Calibri" w:hAnsi="Calibri"/>
+                <w:b w:val="false"/>
+                <w:bCs w:val="false"/>
+                <w:color w:val="000000"/>
+                <w:sz w:val="16"/>
+                <w:szCs w:val="16"/>
+              </w:rPr>
+              <w:t xml:space="preserve">Test-Berichtigung</w:t>
+            </w:r>
+          </w:p>
+        </w:tc>
+        <w:tc>
+          <w:tcPr>
+            <w:tcW w:type="dxa" w:w="3850"/>
+            <w:tcBorders>
+              <w:top w:val="single" w:color="5B6B8C" w:sz="8"/>
+              <w:left w:val="single" w:color="5B6B8C" w:sz="8"/>
+              <w:bottom w:val="single" w:color="5B6B8C" w:sz="8"/>
+              <w:right w:val="single" w:color="5B6B8C" w:sz="8"/>
+            </w:tcBorders>
+            <w:shd w:fill="F4F7FD" w:color="auto" w:val="clear"/>
+            <w:tcMar>
+              <w:top w:type="dxa" w:w="40"/>
+              <w:left w:type="dxa" w:w="90"/>
+              <w:bottom w:type="dxa" w:w="40"/>
+              <w:right w:type="dxa" w:w="90"/>
+            </w:tcMar>
+            <w:vAlign w:val="top"/>
+          </w:tcPr>
+          <w:p>
+            <w:pPr>
+              <w:spacing w:after="0" w:before="0"/>
+            </w:pPr>
+            <w:r>
+              <w:rPr>
+                <w:rFonts w:ascii="Calibri" w:cs="Calibri" w:eastAsia="Calibri" w:hAnsi="Calibri"/>
+                <w:b w:val="false"/>
+                <w:bCs w:val="false"/>
+                <w:color w:val="000000"/>
+                <w:sz w:val="16"/>
+                <w:szCs w:val="16"/>
+              </w:rPr>
+              <w:t xml:space="preserve">Diamond Nine zum Gesamturteil „War die Revolution ein Erfolg?“</w:t>
+            </w:r>
+          </w:p>
+        </w:tc>
+        <w:tc>
+          <w:tcPr>
+            <w:tcW w:type="dxa" w:w="3288"/>
+            <w:tcBorders>
+              <w:top w:val="single" w:color="5B6B8C" w:sz="8"/>
+              <w:left w:val="single" w:color="5B6B8C" w:sz="8"/>
+              <w:bottom w:val="single" w:color="5B6B8C" w:sz="8"/>
+              <w:right w:val="single" w:color="5B6B8C" w:sz="8"/>
+            </w:tcBorders>
+            <w:shd w:fill="F4F7FD" w:color="auto" w:val="clear"/>
+            <w:tcMar>
+              <w:top w:type="dxa" w:w="40"/>
+              <w:left w:type="dxa" w:w="90"/>
+              <w:bottom w:type="dxa" w:w="40"/>
+              <w:right w:type="dxa" w:w="90"/>
+            </w:tcMar>
+            <w:vAlign w:val="top"/>
+          </w:tcPr>
+          <w:p>
+            <w:pPr>
+              <w:spacing w:after="0" w:before="0"/>
+            </w:pPr>
+            <w:r>
+              <w:rPr>
+                <w:rFonts w:ascii="Calibri" w:cs="Calibri" w:eastAsia="Calibri" w:hAnsi="Calibri"/>
+                <w:b w:val="false"/>
+                <w:bCs w:val="false"/>
+                <w:color w:val="000000"/>
+                <w:sz w:val="16"/>
+                <w:szCs w:val="16"/>
+              </w:rPr>
+              <w:t xml:space="preserve">S. 128/129</w:t>
             </w:r>
           </w:p>
         </w:tc>

</xml_diff>